<commit_message>
Convert to Harvard referencing and adopt the applicant's rewritten Section 9
Section 9 replaced with the applicant's own text for the problem statement,
hypotheses, research questions, literature review and policy relevance, with
the references he had gathered but not yet cited woven back into the relevant
paragraphs so that the list contains no uncited work.

All remaining numeric citations across Sections 7, 11 and 12 converted to
Harvard author-date. Reference list rebuilt alphabetically in Harvard style
with the DOIs supplied, and the two Salonen 2015 papers disambiguated as
2015a and 2015b.

Verified: 43 listed references, all cited; no numeric citations remain; no em
or en dashes; executive summary 292 words.

Co-Authored-By: Claude Opus 5 <noreply@anthropic.com>
Claude-Session: https://claude.ai/code/session_01KBqJ3GE1Jd6oZGRqBX87od
</commit_message>
<xml_diff>
--- a/docs/UTS-Matching-Grant-Proposal-Cycle1-2027.docx
+++ b/docs/UTS-Matching-Grant-Proposal-Cycle1-2027.docx
@@ -356,19 +356,7 @@
         <w:t xml:space="preserve"> </w:t>
       </w:r>
       <w:r>
-        <w:t xml:space="preserve">submission. Second, references are numbered sequentially in order of first appearance in this</w:t>
-      </w:r>
-      <w:r>
-        <w:t xml:space="preserve"> </w:t>
-      </w:r>
-      <w:r>
-        <w:t xml:space="preserve">document, so the numbering does not correspond to the numbering of the original Scopus export.</w:t>
-      </w:r>
-      <w:r>
-        <w:t xml:space="preserve"> </w:t>
-      </w:r>
-      <w:r>
-        <w:t xml:space="preserve">Third, all supplier unit costs in Appendix A are planning figures and require current</w:t>
+        <w:t xml:space="preserve">submission. Second, all supplier unit costs in Appendix A are planning figures and require current</w:t>
       </w:r>
       <w:r>
         <w:t xml:space="preserve"> </w:t>
@@ -664,7 +652,7 @@
         <w:t xml:space="preserve"> </w:t>
       </w:r>
       <w:r>
-        <w:t xml:space="preserve">oxalate formation degrade cementitious materials [25, 26, 27].</w:t>
+        <w:t xml:space="preserve">oxalate formation degrade cementitious materials (Jiang et al., 2022; Chaudhuri et al., 2020; Fomina et al., 2007).</w:t>
       </w:r>
     </w:p>
     <w:p>
@@ -968,7 +956,7 @@
         <w:t xml:space="preserve"> </w:t>
       </w:r>
       <w:r>
-        <w:t xml:space="preserve">measured evidence on the biodeterioration of tropical public buildings [44].</w:t>
+        <w:t xml:space="preserve">measured evidence on the biodeterioration of tropical public buildings (Economic Planning Unit Sarawak, 2021).</w:t>
       </w:r>
     </w:p>
     <w:bookmarkEnd w:id="29"/>
@@ -995,143 +983,243 @@
         <w:pStyle w:val="FirstParagraph"/>
       </w:pPr>
       <w:r>
-        <w:t xml:space="preserve">Educational buildings in the humid tropics acquire visible biological colonisation on their</w:t>
-      </w:r>
-      <w:r>
-        <w:t xml:space="preserve"> </w:t>
-      </w:r>
-      <w:r>
-        <w:t xml:space="preserve">exteriors within a few years of completion. At the UTS Sibu campus, which is of modern green</w:t>
-      </w:r>
-      <w:r>
-        <w:t xml:space="preserve"> </w:t>
-      </w:r>
-      <w:r>
-        <w:t xml:space="preserve">design, mould, algal films and fungal staining are present across multiple building facades. The</w:t>
-      </w:r>
-      <w:r>
-        <w:t xml:space="preserve"> </w:t>
-      </w:r>
-      <w:r>
-        <w:t xml:space="preserve">institutional response is reactive chemical washing, which recurs, consumes maintenance budget</w:t>
-      </w:r>
-      <w:r>
-        <w:t xml:space="preserve"> </w:t>
-      </w:r>
-      <w:r>
-        <w:t xml:space="preserve">and addresses appearance rather than cause.</w:t>
-      </w:r>
-    </w:p>
-    <w:p>
-      <w:pPr>
-        <w:pStyle w:val="BodyText"/>
-      </w:pPr>
-      <w:r>
-        <w:t xml:space="preserve">Three gaps follow from this. The first is that the organisms responsible have not been</w:t>
-      </w:r>
-      <w:r>
-        <w:t xml:space="preserve"> </w:t>
-      </w:r>
-      <w:r>
-        <w:t xml:space="preserve">identified. No inventory of facade-colonising fungi exists for a Malaysian campus of this type,</w:t>
-      </w:r>
-      <w:r>
-        <w:t xml:space="preserve"> </w:t>
-      </w:r>
-      <w:r>
-        <w:t xml:space="preserve">and the available Malaysian and tropical literature concerns indoor environments [1, 2, 3],</w:t>
-      </w:r>
-      <w:r>
-        <w:t xml:space="preserve"> </w:t>
-      </w:r>
-      <w:r>
-        <w:t xml:space="preserve">while exterior studies are drawn largely from temperate and subtropical settings [4, 5, 6, 7].</w:t>
-      </w:r>
-      <w:r>
-        <w:t xml:space="preserve"> </w:t>
-      </w:r>
-      <w:r>
-        <w:t xml:space="preserve">The second is that the local drivers are unmeasured. Moisture availability is well established</w:t>
-      </w:r>
-      <w:r>
-        <w:t xml:space="preserve"> </w:t>
-      </w:r>
-      <w:r>
-        <w:t xml:space="preserve">as the primary control on fungal colonisation of building materials [8, 9, 10, 11], and facade</w:t>
-      </w:r>
-      <w:r>
-        <w:t xml:space="preserve"> </w:t>
-      </w:r>
-      <w:r>
-        <w:t xml:space="preserve">orientation, shading and ventilation are known to modulate how long exterior surfaces remain</w:t>
-      </w:r>
-      <w:r>
-        <w:t xml:space="preserve"> </w:t>
-      </w:r>
-      <w:r>
-        <w:t xml:space="preserve">wet [12, 13, 14, 15], but these relationships have not been characterised for equatorial,</w:t>
-      </w:r>
-      <w:r>
-        <w:t xml:space="preserve"> </w:t>
-      </w:r>
-      <w:r>
-        <w:t xml:space="preserve">green-designed educational buildings. The third is that maintenance decisions therefore have no</w:t>
-      </w:r>
-      <w:r>
-        <w:t xml:space="preserve"> </w:t>
-      </w:r>
-      <w:r>
-        <w:t xml:space="preserve">local evidence base. Without knowing which taxa are present, and where on a building they</w:t>
-      </w:r>
-      <w:r>
-        <w:t xml:space="preserve"> </w:t>
-      </w:r>
-      <w:r>
-        <w:t xml:space="preserve">concentrate, facility managers cannot select resistant finishes or schedule intervention by risk</w:t>
-      </w:r>
-      <w:r>
-        <w:t xml:space="preserve"> </w:t>
-      </w:r>
-      <w:r>
-        <w:t xml:space="preserve">rather than by appearance.</w:t>
-      </w:r>
-    </w:p>
-    <w:p>
-      <w:pPr>
-        <w:pStyle w:val="BodyText"/>
-      </w:pPr>
-      <w:r>
-        <w:t xml:space="preserve">A specific tension motivates the work. Green building design in the humid tropics favours deep</w:t>
-      </w:r>
-      <w:r>
-        <w:t xml:space="preserve"> </w:t>
-      </w:r>
-      <w:r>
-        <w:t xml:space="preserve">shading, reduced facade insolation, natural ventilation, planting close to the envelope and</w:t>
-      </w:r>
-      <w:r>
-        <w:t xml:space="preserve"> </w:t>
-      </w:r>
-      <w:r>
-        <w:t xml:space="preserve">porous or textured finishes. Each of these plausibly extends the duration of surface wetness,</w:t>
-      </w:r>
-      <w:r>
-        <w:t xml:space="preserve"> </w:t>
-      </w:r>
-      <w:r>
-        <w:t xml:space="preserve">which is the condition that fungal colonisation requires [8, 9, 11]. Whether green design</w:t>
-      </w:r>
-      <w:r>
-        <w:t xml:space="preserve"> </w:t>
-      </w:r>
-      <w:r>
-        <w:t xml:space="preserve">inadvertently raises biodeterioration risk in equatorial climates appears to be untested, and it</w:t>
-      </w:r>
-      <w:r>
-        <w:t xml:space="preserve"> </w:t>
-      </w:r>
-      <w:r>
-        <w:t xml:space="preserve">bears directly on how public buildings in Sarawak are specified.</w:t>
+        <w:t xml:space="preserve">Educational buildings in the humid tropics frequently develop visible biological colonisation on</w:t>
+      </w:r>
+      <w:r>
+        <w:t xml:space="preserve"> </w:t>
+      </w:r>
+      <w:r>
+        <w:t xml:space="preserve">exterior surfaces within a relatively short period after construction. At the University of</w:t>
+      </w:r>
+      <w:r>
+        <w:t xml:space="preserve"> </w:t>
+      </w:r>
+      <w:r>
+        <w:t xml:space="preserve">Technology Sarawak (UTS) campus in Sibu, which is a platinum-rated green building, mould growth,</w:t>
+      </w:r>
+      <w:r>
+        <w:t xml:space="preserve"> </w:t>
+      </w:r>
+      <w:r>
+        <w:t xml:space="preserve">algal films, and fungal staining are evident on multiple building facades despite modern design</w:t>
+      </w:r>
+      <w:r>
+        <w:t xml:space="preserve"> </w:t>
+      </w:r>
+      <w:r>
+        <w:t xml:space="preserve">approaches and routine maintenance. The prevailing management response is periodic cleaning and</w:t>
+      </w:r>
+      <w:r>
+        <w:t xml:space="preserve"> </w:t>
+      </w:r>
+      <w:r>
+        <w:t xml:space="preserve">chemical washing, which addresses aesthetic deterioration but does not identify the organisms</w:t>
+      </w:r>
+      <w:r>
+        <w:t xml:space="preserve"> </w:t>
+      </w:r>
+      <w:r>
+        <w:t xml:space="preserve">responsible, the environmental drivers of colonisation, or the underlying factors influencing</w:t>
+      </w:r>
+      <w:r>
+        <w:t xml:space="preserve"> </w:t>
+      </w:r>
+      <w:r>
+        <w:t xml:space="preserve">recurrence.</w:t>
+      </w:r>
+    </w:p>
+    <w:p>
+      <w:pPr>
+        <w:pStyle w:val="BodyText"/>
+      </w:pPr>
+      <w:r>
+        <w:t xml:space="preserve">Three key knowledge gaps remain. First, the fungal communities colonising educational building</w:t>
+      </w:r>
+      <w:r>
+        <w:t xml:space="preserve"> </w:t>
+      </w:r>
+      <w:r>
+        <w:t xml:space="preserve">exteriors in tropical environments are poorly characterised. Although studies have documented</w:t>
+      </w:r>
+      <w:r>
+        <w:t xml:space="preserve"> </w:t>
+      </w:r>
+      <w:r>
+        <w:t xml:space="preserve">fungi in indoor educational environments and older buildings in Malaysia (Omar Hamdan et al.,</w:t>
+      </w:r>
+      <w:r>
+        <w:t xml:space="preserve"> </w:t>
+      </w:r>
+      <w:r>
+        <w:t xml:space="preserve">2026; Norback et al., 2016), comparable studies of exterior building surfaces are limited and are</w:t>
+      </w:r>
+      <w:r>
+        <w:t xml:space="preserve"> </w:t>
+      </w:r>
+      <w:r>
+        <w:t xml:space="preserve">largely derived from temperate or subtropical climates (Jain et al., 2009; Singh, 2000; Kosel et</w:t>
+      </w:r>
+      <w:r>
+        <w:t xml:space="preserve"> </w:t>
+      </w:r>
+      <w:r>
+        <w:t xml:space="preserve">al., 2024). Consequently, there is currently no published inventory of facade-associated fungi for</w:t>
+      </w:r>
+      <w:r>
+        <w:t xml:space="preserve"> </w:t>
+      </w:r>
+      <w:r>
+        <w:t xml:space="preserve">a tropical educational campus in Borneo.</w:t>
+      </w:r>
+    </w:p>
+    <w:p>
+      <w:pPr>
+        <w:pStyle w:val="BodyText"/>
+      </w:pPr>
+      <w:r>
+        <w:t xml:space="preserve">Second, the environmental and architectural drivers of exterior fungal colonisation remain largely</w:t>
+      </w:r>
+      <w:r>
+        <w:t xml:space="preserve"> </w:t>
+      </w:r>
+      <w:r>
+        <w:t xml:space="preserve">unquantified. Moisture availability is consistently recognised as the principal determinant of</w:t>
+      </w:r>
+      <w:r>
+        <w:t xml:space="preserve"> </w:t>
+      </w:r>
+      <w:r>
+        <w:t xml:space="preserve">fungal growth on building materials (Dedesko and Siegel, 2015; Ito and Mizuno, 2009; Scott, 1994;</w:t>
+      </w:r>
+      <w:r>
+        <w:t xml:space="preserve"> </w:t>
+      </w:r>
+      <w:r>
+        <w:t xml:space="preserve">Shibuta and Teramoto, 2026). Factors such as facade orientation, shading, ventilation, material</w:t>
+      </w:r>
+      <w:r>
+        <w:t xml:space="preserve"> </w:t>
+      </w:r>
+      <w:r>
+        <w:t xml:space="preserve">composition, and rainfall exposure influence surface wetness and therefore microbial</w:t>
+      </w:r>
+      <w:r>
+        <w:t xml:space="preserve"> </w:t>
+      </w:r>
+      <w:r>
+        <w:t xml:space="preserve">establishment. However, these relationships have not been systematically investigated in tropical</w:t>
+      </w:r>
+      <w:r>
+        <w:t xml:space="preserve"> </w:t>
+      </w:r>
+      <w:r>
+        <w:t xml:space="preserve">educational buildings designed according to contemporary sustainability and green-building</w:t>
+      </w:r>
+      <w:r>
+        <w:t xml:space="preserve"> </w:t>
+      </w:r>
+      <w:r>
+        <w:t xml:space="preserve">principles. Third, maintenance and material-selection decisions are currently made without locally</w:t>
+      </w:r>
+      <w:r>
+        <w:t xml:space="preserve"> </w:t>
+      </w:r>
+      <w:r>
+        <w:t xml:space="preserve">derived evidence. Without understanding which fungal taxa are present, where they preferentially</w:t>
+      </w:r>
+      <w:r>
+        <w:t xml:space="preserve"> </w:t>
+      </w:r>
+      <w:r>
+        <w:t xml:space="preserve">colonise, and how environmental conditions influence their growth, facility managers are unable to</w:t>
+      </w:r>
+      <w:r>
+        <w:t xml:space="preserve"> </w:t>
+      </w:r>
+      <w:r>
+        <w:t xml:space="preserve">implement targeted prevention strategies or optimise maintenance schedules.</w:t>
+      </w:r>
+    </w:p>
+    <w:p>
+      <w:pPr>
+        <w:pStyle w:val="BodyText"/>
+      </w:pPr>
+      <w:r>
+        <w:t xml:space="preserve">An important and unexplored question concerns the interaction between green building design and</w:t>
+      </w:r>
+      <w:r>
+        <w:t xml:space="preserve"> </w:t>
+      </w:r>
+      <w:r>
+        <w:t xml:space="preserve">fungal colonisation. Sustainable design strategies commonly employed in tropical environments,</w:t>
+      </w:r>
+      <w:r>
+        <w:t xml:space="preserve"> </w:t>
+      </w:r>
+      <w:r>
+        <w:t xml:space="preserve">including deep overhangs, extensive shading, natural ventilation, facade vegetation, and textured</w:t>
+      </w:r>
+      <w:r>
+        <w:t xml:space="preserve"> </w:t>
+      </w:r>
+      <w:r>
+        <w:t xml:space="preserve">exterior finishes, may unintentionally promote prolonged surface moisture retention. Because</w:t>
+      </w:r>
+      <w:r>
+        <w:t xml:space="preserve"> </w:t>
+      </w:r>
+      <w:r>
+        <w:t xml:space="preserve">persistent surface wetness is a key requirement for fungal establishment and growth (Ito and</w:t>
+      </w:r>
+      <w:r>
+        <w:t xml:space="preserve"> </w:t>
+      </w:r>
+      <w:r>
+        <w:t xml:space="preserve">Mizuno, 2009; Scott, 1994; Shibuta and Teramoto, 2026), it is possible that some green-building</w:t>
+      </w:r>
+      <w:r>
+        <w:t xml:space="preserve"> </w:t>
+      </w:r>
+      <w:r>
+        <w:t xml:space="preserve">features may increase susceptibility to biodeterioration under equatorial climatic conditions. To</w:t>
+      </w:r>
+      <w:r>
+        <w:t xml:space="preserve"> </w:t>
+      </w:r>
+      <w:r>
+        <w:t xml:space="preserve">the best of current knowledge, this relationship has not been examined in educational buildings in</w:t>
+      </w:r>
+      <w:r>
+        <w:t xml:space="preserve"> </w:t>
+      </w:r>
+      <w:r>
+        <w:t xml:space="preserve">Sarawak.</w:t>
+      </w:r>
+    </w:p>
+    <w:p>
+      <w:pPr>
+        <w:pStyle w:val="BodyText"/>
+      </w:pPr>
+      <w:r>
+        <w:t xml:space="preserve">This project addresses these gaps through the molecular characterisation of fungal communities</w:t>
+      </w:r>
+      <w:r>
+        <w:t xml:space="preserve"> </w:t>
+      </w:r>
+      <w:r>
+        <w:t xml:space="preserve">colonising educational building exteriors and by evaluating the influence of facade</w:t>
+      </w:r>
+      <w:r>
+        <w:t xml:space="preserve"> </w:t>
+      </w:r>
+      <w:r>
+        <w:t xml:space="preserve">characteristics, microclimatic conditions, and campus air quality on fungal establishment and</w:t>
+      </w:r>
+      <w:r>
+        <w:t xml:space="preserve"> </w:t>
+      </w:r>
+      <w:r>
+        <w:t xml:space="preserve">persistence.</w:t>
       </w:r>
     </w:p>
     <w:bookmarkEnd w:id="30"/>
@@ -1149,87 +1237,93 @@
         <w:pStyle w:val="FirstParagraph"/>
       </w:pPr>
       <w:r>
-        <w:t xml:space="preserve">H1. Fungal abundance and diversity differ significantly between facade orientations, with</w:t>
-      </w:r>
-      <w:r>
-        <w:t xml:space="preserve"> </w:t>
-      </w:r>
-      <w:r>
-        <w:t xml:space="preserve">shaded, low-insolation facades supporting higher values, consistent with longer surface wetness</w:t>
-      </w:r>
-      <w:r>
-        <w:t xml:space="preserve"> </w:t>
-      </w:r>
-      <w:r>
-        <w:t xml:space="preserve">duration [8, 9, 11].</w:t>
-      </w:r>
-    </w:p>
-    <w:p>
-      <w:pPr>
-        <w:pStyle w:val="BodyText"/>
-      </w:pPr>
-      <w:r>
-        <w:t xml:space="preserve">H2. Community composition differs between facade materials, namely exposed concrete, painted</w:t>
-      </w:r>
-      <w:r>
-        <w:t xml:space="preserve"> </w:t>
-      </w:r>
-      <w:r>
-        <w:t xml:space="preserve">render and tile, reflecting differences in substrate moisture adsorption and nutrient</w:t>
-      </w:r>
-      <w:r>
-        <w:t xml:space="preserve"> </w:t>
-      </w:r>
-      <w:r>
-        <w:t xml:space="preserve">availability [8, 3].</w:t>
-      </w:r>
-    </w:p>
-    <w:p>
-      <w:pPr>
-        <w:pStyle w:val="BodyText"/>
-      </w:pPr>
-      <w:r>
-        <w:t xml:space="preserve">H3. Abundance and composition differ between the Northeast and Southwest monsoon phases, and the</w:t>
-      </w:r>
-      <w:r>
-        <w:t xml:space="preserve"> </w:t>
-      </w:r>
-      <w:r>
-        <w:t xml:space="preserve">direction of that difference is consistent when two seasonal phases are resampled twelve months</w:t>
-      </w:r>
-      <w:r>
-        <w:t xml:space="preserve"> </w:t>
-      </w:r>
-      <w:r>
-        <w:t xml:space="preserve">apart [16, 17].</w:t>
-      </w:r>
-    </w:p>
-    <w:p>
-      <w:pPr>
-        <w:pStyle w:val="BodyText"/>
-      </w:pPr>
-      <w:r>
-        <w:t xml:space="preserve">H4. Surfaces carrying higher algal and cyanobacterial cover support higher fungal abundance,</w:t>
-      </w:r>
-      <w:r>
-        <w:t xml:space="preserve"> </w:t>
-      </w:r>
-      <w:r>
-        <w:t xml:space="preserve">consistent with biofilm pioneers conditioning the substrate [18].</w:t>
-      </w:r>
-    </w:p>
-    <w:p>
-      <w:pPr>
-        <w:pStyle w:val="BodyText"/>
-      </w:pPr>
-      <w:r>
-        <w:t xml:space="preserve">H5, exploratory. Fungal abundance is positively associated with antecedent particulate matter</w:t>
-      </w:r>
-      <w:r>
-        <w:t xml:space="preserve"> </w:t>
-      </w:r>
-      <w:r>
-        <w:t xml:space="preserve">concentration after adjustment for relative humidity and rainfall [19].</w:t>
+        <w:t xml:space="preserve">H1. Fungal abundance and diversity differ significantly among facade orientations, with shaded and</w:t>
+      </w:r>
+      <w:r>
+        <w:t xml:space="preserve"> </w:t>
+      </w:r>
+      <w:r>
+        <w:t xml:space="preserve">low-insolation facades supporting greater fungal colonisation due to prolonged surface wetness (Ito</w:t>
+      </w:r>
+      <w:r>
+        <w:t xml:space="preserve"> </w:t>
+      </w:r>
+      <w:r>
+        <w:t xml:space="preserve">and Mizuno, 2009; Scott, 1994; Shibuta and Teramoto, 2026).</w:t>
+      </w:r>
+    </w:p>
+    <w:p>
+      <w:pPr>
+        <w:pStyle w:val="BodyText"/>
+      </w:pPr>
+      <w:r>
+        <w:t xml:space="preserve">H2. Fungal community composition differs among facade materials, including exposed concrete,</w:t>
+      </w:r>
+      <w:r>
+        <w:t xml:space="preserve"> </w:t>
+      </w:r>
+      <w:r>
+        <w:t xml:space="preserve">painted render, and ceramic tile, reflecting differences in moisture retention and substrate</w:t>
+      </w:r>
+      <w:r>
+        <w:t xml:space="preserve"> </w:t>
+      </w:r>
+      <w:r>
+        <w:t xml:space="preserve">properties (Ara et al., 2025; Shibuta and Teramoto, 2026).</w:t>
+      </w:r>
+    </w:p>
+    <w:p>
+      <w:pPr>
+        <w:pStyle w:val="BodyText"/>
+      </w:pPr>
+      <w:r>
+        <w:t xml:space="preserve">H3. Fungal abundance and community composition differ between Northeast and Southwest monsoon</w:t>
+      </w:r>
+      <w:r>
+        <w:t xml:space="preserve"> </w:t>
+      </w:r>
+      <w:r>
+        <w:t xml:space="preserve">periods, and these seasonal patterns remain consistent when corresponding periods are resampled</w:t>
+      </w:r>
+      <w:r>
+        <w:t xml:space="preserve"> </w:t>
+      </w:r>
+      <w:r>
+        <w:t xml:space="preserve">twelve months later (Liao et al., 2004; Medrela-Kuder, 2003).</w:t>
+      </w:r>
+    </w:p>
+    <w:p>
+      <w:pPr>
+        <w:pStyle w:val="BodyText"/>
+      </w:pPr>
+      <w:r>
+        <w:t xml:space="preserve">H4. Surfaces exhibiting higher algal and cyanobacterial cover also exhibit greater fungal</w:t>
+      </w:r>
+      <w:r>
+        <w:t xml:space="preserve"> </w:t>
+      </w:r>
+      <w:r>
+        <w:t xml:space="preserve">abundance, reflecting facilitative interactions during biofilm establishment and surface</w:t>
+      </w:r>
+      <w:r>
+        <w:t xml:space="preserve"> </w:t>
+      </w:r>
+      <w:r>
+        <w:t xml:space="preserve">conditioning (Gaylarde and Morton, 1997).</w:t>
+      </w:r>
+    </w:p>
+    <w:p>
+      <w:pPr>
+        <w:pStyle w:val="BodyText"/>
+      </w:pPr>
+      <w:r>
+        <w:t xml:space="preserve">H5. Fungal abundance is positively associated with antecedent particulate matter concentration</w:t>
+      </w:r>
+      <w:r>
+        <w:t xml:space="preserve"> </w:t>
+      </w:r>
+      <w:r>
+        <w:t xml:space="preserve">after accounting for relative humidity, rainfall, and temperature (Ramos, 2023).</w:t>
       </w:r>
     </w:p>
     <w:bookmarkEnd w:id="31"/>
@@ -1240,6 +1334,541 @@
       </w:pPr>
       <w:r>
         <w:t xml:space="preserve">9.3 Research questions</w:t>
+      </w:r>
+    </w:p>
+    <w:p>
+      <w:pPr>
+        <w:pStyle w:val="FirstParagraph"/>
+      </w:pPr>
+      <w:r>
+        <w:t xml:space="preserve">RQ1. Which fungal taxa colonise the exteriors of tropical educational buildings in Sibu, Sarawak,</w:t>
+      </w:r>
+      <w:r>
+        <w:t xml:space="preserve"> </w:t>
+      </w:r>
+      <w:r>
+        <w:t xml:space="preserve">and what are their relative abundances?</w:t>
+      </w:r>
+    </w:p>
+    <w:p>
+      <w:pPr>
+        <w:pStyle w:val="BodyText"/>
+      </w:pPr>
+      <w:r>
+        <w:t xml:space="preserve">RQ2. How do fungal abundance, diversity, and community composition vary according to facade</w:t>
+      </w:r>
+      <w:r>
+        <w:t xml:space="preserve"> </w:t>
+      </w:r>
+      <w:r>
+        <w:t xml:space="preserve">material, building age, architectural design, and orientation?</w:t>
+      </w:r>
+    </w:p>
+    <w:p>
+      <w:pPr>
+        <w:pStyle w:val="BodyText"/>
+      </w:pPr>
+      <w:r>
+        <w:t xml:space="preserve">RQ3. How does fungal community composition vary between seasonal monsoon phases, and are these</w:t>
+      </w:r>
+      <w:r>
+        <w:t xml:space="preserve"> </w:t>
+      </w:r>
+      <w:r>
+        <w:t xml:space="preserve">seasonal patterns consistent over time?</w:t>
+      </w:r>
+    </w:p>
+    <w:p>
+      <w:pPr>
+        <w:pStyle w:val="BodyText"/>
+      </w:pPr>
+      <w:r>
+        <w:t xml:space="preserve">RQ4. Is algal and cyanobacterial cover associated with fungal abundance and community composition?</w:t>
+      </w:r>
+    </w:p>
+    <w:p>
+      <w:pPr>
+        <w:pStyle w:val="BodyText"/>
+      </w:pPr>
+      <w:r>
+        <w:t xml:space="preserve">RQ5. Are fungal abundance and diversity associated with campus air-quality parameters and</w:t>
+      </w:r>
+      <w:r>
+        <w:t xml:space="preserve"> </w:t>
+      </w:r>
+      <w:r>
+        <w:t xml:space="preserve">microclimatic conditions after controlling for humidity and rainfall?</w:t>
+      </w:r>
+    </w:p>
+    <w:bookmarkEnd w:id="32"/>
+    <w:bookmarkStart w:id="33" w:name="literature-review"/>
+    <w:p>
+      <w:pPr>
+        <w:pStyle w:val="Heading3"/>
+      </w:pPr>
+      <w:r>
+        <w:t xml:space="preserve">9.4 Literature review</w:t>
+      </w:r>
+    </w:p>
+    <w:p>
+      <w:pPr>
+        <w:pStyle w:val="FirstParagraph"/>
+      </w:pPr>
+      <w:r>
+        <w:t xml:space="preserve">Moisture availability is widely recognised as the primary determinant of fungal colonisation on</w:t>
+      </w:r>
+      <w:r>
+        <w:t xml:space="preserve"> </w:t>
+      </w:r>
+      <w:r>
+        <w:t xml:space="preserve">building materials. Relative humidity influences biodeterioration rates on mineral substrates (Jain</w:t>
+      </w:r>
+      <w:r>
+        <w:t xml:space="preserve"> </w:t>
+      </w:r>
+      <w:r>
+        <w:t xml:space="preserve">et al., 2009), material moisture adsorption characteristics affect fungal growth potential (Shibuta</w:t>
+      </w:r>
+      <w:r>
+        <w:t xml:space="preserve"> </w:t>
+      </w:r>
+      <w:r>
+        <w:t xml:space="preserve">and Teramoto, 2026), and hyphal extension rates increase under favourable humidity conditions (Ito</w:t>
+      </w:r>
+      <w:r>
+        <w:t xml:space="preserve"> </w:t>
+      </w:r>
+      <w:r>
+        <w:t xml:space="preserve">and Mizuno, 2009). Moisture-related variables have also been shown to structure fungal communities</w:t>
+      </w:r>
+      <w:r>
+        <w:t xml:space="preserve"> </w:t>
+      </w:r>
+      <w:r>
+        <w:t xml:space="preserve">on building surfaces (Dedesko and Siegel, 2015). Consequently, moisture persistence remains central</w:t>
+      </w:r>
+      <w:r>
+        <w:t xml:space="preserve"> </w:t>
+      </w:r>
+      <w:r>
+        <w:t xml:space="preserve">to understanding fungal establishment and biodeterioration processes (Scott, 1994).</w:t>
+      </w:r>
+    </w:p>
+    <w:p>
+      <w:pPr>
+        <w:pStyle w:val="BodyText"/>
+      </w:pPr>
+      <w:r>
+        <w:t xml:space="preserve">Building design directly influences moisture persistence through its effects on ventilation,</w:t>
+      </w:r>
+      <w:r>
+        <w:t xml:space="preserve"> </w:t>
+      </w:r>
+      <w:r>
+        <w:t xml:space="preserve">shading, insolation, and rainfall exposure. Previous studies have focused on daylight optimisation,</w:t>
+      </w:r>
+      <w:r>
+        <w:t xml:space="preserve"> </w:t>
+      </w:r>
+      <w:r>
+        <w:t xml:space="preserve">energy efficiency, passive design strategies, and indoor environmental quality in educational</w:t>
+      </w:r>
+      <w:r>
+        <w:t xml:space="preserve"> </w:t>
+      </w:r>
+      <w:r>
+        <w:t xml:space="preserve">buildings (Alaidroos and Mosly, 2023; Idowu et al., 2026; Lim et al., 2026; Purnama et al., 2025),</w:t>
+      </w:r>
+      <w:r>
+        <w:t xml:space="preserve"> </w:t>
+      </w:r>
+      <w:r>
+        <w:t xml:space="preserve">and on the influence of occupant control of windows, doors and fans in naturally ventilated</w:t>
+      </w:r>
+      <w:r>
+        <w:t xml:space="preserve"> </w:t>
+      </w:r>
+      <w:r>
+        <w:t xml:space="preserve">classrooms (Franceschini et al., 2024; Lotun et al., 2026). However, biodeterioration risk is</w:t>
+      </w:r>
+      <w:r>
+        <w:t xml:space="preserve"> </w:t>
+      </w:r>
+      <w:r>
+        <w:t xml:space="preserve">rarely considered within these design frameworks despite its relevance to long-term building</w:t>
+      </w:r>
+      <w:r>
+        <w:t xml:space="preserve"> </w:t>
+      </w:r>
+      <w:r>
+        <w:t xml:space="preserve">performance and maintenance.</w:t>
+      </w:r>
+    </w:p>
+    <w:p>
+      <w:pPr>
+        <w:pStyle w:val="BodyText"/>
+      </w:pPr>
+      <w:r>
+        <w:t xml:space="preserve">Studies of the built environment consistently report fungal genera such as Penicillium,</w:t>
+      </w:r>
+      <w:r>
+        <w:t xml:space="preserve"> </w:t>
+      </w:r>
+      <w:r>
+        <w:t xml:space="preserve">Cladosporium, and Aspergillus as dominant colonisers of indoor and outdoor surfaces (Ejdys and</w:t>
+      </w:r>
+      <w:r>
+        <w:t xml:space="preserve"> </w:t>
+      </w:r>
+      <w:r>
+        <w:t xml:space="preserve">Biedunkiewicz, 2011; Segers et al., 2015; Tanney et al., 2017), while emerging tropical and</w:t>
+      </w:r>
+      <w:r>
+        <w:t xml:space="preserve"> </w:t>
+      </w:r>
+      <w:r>
+        <w:t xml:space="preserve">subtropical taxa continue to be described (Wang et al., 2026). Malaysian studies have linked fungal</w:t>
+      </w:r>
+      <w:r>
+        <w:t xml:space="preserve"> </w:t>
+      </w:r>
+      <w:r>
+        <w:t xml:space="preserve">contamination in educational buildings with occupant health concerns and indoor environmental</w:t>
+      </w:r>
+      <w:r>
+        <w:t xml:space="preserve"> </w:t>
+      </w:r>
+      <w:r>
+        <w:t xml:space="preserve">quality (Omar Hamdan et al., 2026; Norback et al., 2016). Nevertheless, exterior fungal communities</w:t>
+      </w:r>
+      <w:r>
+        <w:t xml:space="preserve"> </w:t>
+      </w:r>
+      <w:r>
+        <w:t xml:space="preserve">of educational buildings in tropical Borneo remain undocumented.</w:t>
+      </w:r>
+    </w:p>
+    <w:p>
+      <w:pPr>
+        <w:pStyle w:val="BodyText"/>
+      </w:pPr>
+      <w:r>
+        <w:t xml:space="preserve">The detrimental effects of fungal colonisation on construction materials are well established.</w:t>
+      </w:r>
+      <w:r>
+        <w:t xml:space="preserve"> </w:t>
+      </w:r>
+      <w:r>
+        <w:t xml:space="preserve">Fungi contribute to aesthetic deterioration, biofilm formation, mineral dissolution, physical</w:t>
+      </w:r>
+      <w:r>
+        <w:t xml:space="preserve"> </w:t>
+      </w:r>
+      <w:r>
+        <w:t xml:space="preserve">degradation, and material weakening through complex physiological and biochemical mechanisms (Jiang</w:t>
+      </w:r>
+      <w:r>
+        <w:t xml:space="preserve"> </w:t>
+      </w:r>
+      <w:r>
+        <w:t xml:space="preserve">et al., 2022). Deterioration has been demonstrated in concrete, marble, and other construction</w:t>
+      </w:r>
+      <w:r>
+        <w:t xml:space="preserve"> </w:t>
+      </w:r>
+      <w:r>
+        <w:t xml:space="preserve">materials under both laboratory and field conditions (Chaudhuri et al., 2020; Fomina et al., 2007;</w:t>
+      </w:r>
+      <w:r>
+        <w:t xml:space="preserve"> </w:t>
+      </w:r>
+      <w:r>
+        <w:t xml:space="preserve">Fu et al., 2025; Kosel et al., 2024). These processes are often enhanced by biofilm development and</w:t>
+      </w:r>
+      <w:r>
+        <w:t xml:space="preserve"> </w:t>
+      </w:r>
+      <w:r>
+        <w:t xml:space="preserve">extracellular polymeric substances that facilitate microbial persistence and substrate alteration</w:t>
+      </w:r>
+      <w:r>
+        <w:t xml:space="preserve"> </w:t>
+      </w:r>
+      <w:r>
+        <w:t xml:space="preserve">(Gaylarde and Morton, 1997).</w:t>
+      </w:r>
+    </w:p>
+    <w:p>
+      <w:pPr>
+        <w:pStyle w:val="BodyText"/>
+      </w:pPr>
+      <w:r>
+        <w:t xml:space="preserve">Air quality may also influence fungal colonisation dynamics. Atmospheric particulate matter has</w:t>
+      </w:r>
+      <w:r>
+        <w:t xml:space="preserve"> </w:t>
+      </w:r>
+      <w:r>
+        <w:t xml:space="preserve">been associated with fungal spore concentrations in urban environments (Ramos, 2023), regional</w:t>
+      </w:r>
+      <w:r>
+        <w:t xml:space="preserve"> </w:t>
+      </w:r>
+      <w:r>
+        <w:t xml:space="preserve">spore concentrations can be modelled from atmospheric data (Vida et al., 2024), and integrated</w:t>
+      </w:r>
+      <w:r>
+        <w:t xml:space="preserve"> </w:t>
+      </w:r>
+      <w:r>
+        <w:t xml:space="preserve">particulate sensing is increasingly applied to bioaerosol dynamics (Barbosa et al., 2026).</w:t>
+      </w:r>
+      <w:r>
+        <w:t xml:space="preserve"> </w:t>
+      </w:r>
+      <w:r>
+        <w:t xml:space="preserve">Occupancy elevates measured fungal and bacterial loads in classrooms (Hospodsky et al., 2015),</w:t>
+      </w:r>
+      <w:r>
+        <w:t xml:space="preserve"> </w:t>
+      </w:r>
+      <w:r>
+        <w:t xml:space="preserve">while seasonal fluctuations strongly influence airborne fungal communities (Ebner et al., 1992;</w:t>
+      </w:r>
+      <w:r>
+        <w:t xml:space="preserve"> </w:t>
+      </w:r>
+      <w:r>
+        <w:t xml:space="preserve">Liao et al., 2004; Medrela-Kuder, 2003; Salonen et al., 2015a, 2015b). Monitoring microclimatic and</w:t>
+      </w:r>
+      <w:r>
+        <w:t xml:space="preserve"> </w:t>
+      </w:r>
+      <w:r>
+        <w:t xml:space="preserve">air-quality variables therefore provides important environmental context for interpreting patterns</w:t>
+      </w:r>
+      <w:r>
+        <w:t xml:space="preserve"> </w:t>
+      </w:r>
+      <w:r>
+        <w:t xml:space="preserve">of facade colonisation.</w:t>
+      </w:r>
+    </w:p>
+    <w:p>
+      <w:pPr>
+        <w:pStyle w:val="BodyText"/>
+      </w:pPr>
+      <w:r>
+        <w:t xml:space="preserve">Molecular approaches have significantly improved the accuracy of fungal identification.</w:t>
+      </w:r>
+      <w:r>
+        <w:t xml:space="preserve"> </w:t>
+      </w:r>
+      <w:r>
+        <w:t xml:space="preserve">Culture-based methods recover viable fungi but may underestimate stressed or unculturable taxa,</w:t>
+      </w:r>
+      <w:r>
+        <w:t xml:space="preserve"> </w:t>
+      </w:r>
+      <w:r>
+        <w:t xml:space="preserve">whereas molecular techniques provide greater sensitivity and taxonomic resolution (Warren et al.,</w:t>
+      </w:r>
+      <w:r>
+        <w:t xml:space="preserve"> </w:t>
+      </w:r>
+      <w:r>
+        <w:t xml:space="preserve">2026), including multiplex real-time assays for filamentous fungi (Wei et al., 2024) and orthogonal</w:t>
+      </w:r>
+      <w:r>
+        <w:t xml:space="preserve"> </w:t>
+      </w:r>
+      <w:r>
+        <w:t xml:space="preserve">signals from fungal volatile organic compounds (Pantoja et al., 2016). The Internal Transcribed</w:t>
+      </w:r>
+      <w:r>
+        <w:t xml:space="preserve"> </w:t>
+      </w:r>
+      <w:r>
+        <w:t xml:space="preserve">Spacer (ITS) region remains the accepted primary fungal DNA barcode (Xu, 2016), making it</w:t>
+      </w:r>
+      <w:r>
+        <w:t xml:space="preserve"> </w:t>
+      </w:r>
+      <w:r>
+        <w:t xml:space="preserve">particularly suitable for characterising fungal communities associated with tropical building</w:t>
+      </w:r>
+      <w:r>
+        <w:t xml:space="preserve"> </w:t>
+      </w:r>
+      <w:r>
+        <w:t xml:space="preserve">exteriors, although taxonomic assignment of ITS amplicons depends on the classification method</w:t>
+      </w:r>
+      <w:r>
+        <w:t xml:space="preserve"> </w:t>
+      </w:r>
+      <w:r>
+        <w:t xml:space="preserve">adopted (Porter and Golding, 2011). Recovery efficiency is also influenced by the sampling device</w:t>
+      </w:r>
+      <w:r>
+        <w:t xml:space="preserve"> </w:t>
+      </w:r>
+      <w:r>
+        <w:t xml:space="preserve">used (Goverde et al., 2017).</w:t>
+      </w:r>
+    </w:p>
+    <w:p>
+      <w:pPr>
+        <w:pStyle w:val="BodyText"/>
+      </w:pPr>
+      <w:r>
+        <w:t xml:space="preserve">Where intervention is required, the available options include antifungal nanocoatings based on</w:t>
+      </w:r>
+      <w:r>
+        <w:t xml:space="preserve"> </w:t>
+      </w:r>
+      <w:r>
+        <w:t xml:space="preserve">silver and zinc oxide (Abdel-Rahim et al., 2026; Chen et al., 2018) and non-thermal plasma</w:t>
+      </w:r>
+      <w:r>
+        <w:t xml:space="preserve"> </w:t>
+      </w:r>
+      <w:r>
+        <w:t xml:space="preserve">treatment (Roberts et al., 2025). An inventory of the taxa actually present on local facades is</w:t>
+      </w:r>
+      <w:r>
+        <w:t xml:space="preserve"> </w:t>
+      </w:r>
+      <w:r>
+        <w:t xml:space="preserve">what would allow such options to be evaluated for this building stock.</w:t>
+      </w:r>
+    </w:p>
+    <w:p>
+      <w:pPr>
+        <w:pStyle w:val="BodyText"/>
+      </w:pPr>
+      <w:r>
+        <w:t xml:space="preserve">Despite advances in fungal ecology, biodeterioration science, and molecular detection, there</w:t>
+      </w:r>
+      <w:r>
+        <w:t xml:space="preserve"> </w:t>
+      </w:r>
+      <w:r>
+        <w:t xml:space="preserve">remains no integrated study examining fungal community composition, facade characteristics, air</w:t>
+      </w:r>
+      <w:r>
+        <w:t xml:space="preserve"> </w:t>
+      </w:r>
+      <w:r>
+        <w:t xml:space="preserve">quality, and microclimatic conditions on educational building exteriors in tropical Borneo. This</w:t>
+      </w:r>
+      <w:r>
+        <w:t xml:space="preserve"> </w:t>
+      </w:r>
+      <w:r>
+        <w:t xml:space="preserve">project addresses that gap and provides evidence to support building maintenance, material</w:t>
+      </w:r>
+      <w:r>
+        <w:t xml:space="preserve"> </w:t>
+      </w:r>
+      <w:r>
+        <w:t xml:space="preserve">selection, and sustainable design practices for public infrastructure in Sarawak.</w:t>
+      </w:r>
+    </w:p>
+    <w:bookmarkEnd w:id="33"/>
+    <w:bookmarkStart w:id="34" w:name="X0e11ace66e2248e439dd5ca1e80f67a02a165ec"/>
+    <w:p>
+      <w:pPr>
+        <w:pStyle w:val="Heading3"/>
+      </w:pPr>
+      <w:r>
+        <w:t xml:space="preserve">9.5 Relevance to government policy, community and industry</w:t>
+      </w:r>
+    </w:p>
+    <w:p>
+      <w:pPr>
+        <w:pStyle w:val="FirstParagraph"/>
+      </w:pPr>
+      <w:r>
+        <w:t xml:space="preserve">This project aligns with the Sarawak Post COVID-19 Development Strategy 2030 (PCDS 2030) under the</w:t>
+      </w:r>
+      <w:r>
+        <w:t xml:space="preserve"> </w:t>
+      </w:r>
+      <w:r>
+        <w:t xml:space="preserve">Environmental Sustainability and Social Well-being pillars (Economic Planning Unit Sarawak, 2021).</w:t>
+      </w:r>
+      <w:r>
+        <w:t xml:space="preserve"> </w:t>
+      </w:r>
+      <w:r>
+        <w:t xml:space="preserve">The findings will provide the Ministry of Education, Innovation and Talent Development (MEITD), the</w:t>
+      </w:r>
+      <w:r>
+        <w:t xml:space="preserve"> </w:t>
+      </w:r>
+      <w:r>
+        <w:t xml:space="preserve">Public Works Department (JKR), higher education institutions, and facility managers with locally</w:t>
+      </w:r>
+      <w:r>
+        <w:t xml:space="preserve"> </w:t>
+      </w:r>
+      <w:r>
+        <w:t xml:space="preserve">derived evidence on fungal biodeterioration of tropical building exteriors.</w:t>
+      </w:r>
+    </w:p>
+    <w:p>
+      <w:pPr>
+        <w:pStyle w:val="BodyText"/>
+      </w:pPr>
+      <w:r>
+        <w:t xml:space="preserve">The outcomes will support evidence-based decisions on building material selection, facade design,</w:t>
+      </w:r>
+      <w:r>
+        <w:t xml:space="preserve"> </w:t>
+      </w:r>
+      <w:r>
+        <w:t xml:space="preserve">preventive maintenance planning, and environmental monitoring. Because schools, universities,</w:t>
+      </w:r>
+      <w:r>
+        <w:t xml:space="preserve"> </w:t>
+      </w:r>
+      <w:r>
+        <w:t xml:space="preserve">healthcare facilities, and government buildings throughout Sarawak operate under similar climatic</w:t>
+      </w:r>
+      <w:r>
+        <w:t xml:space="preserve"> </w:t>
+      </w:r>
+      <w:r>
+        <w:t xml:space="preserve">conditions and construction practices, the findings will have broad applicability across the state.</w:t>
+      </w:r>
+      <w:r>
+        <w:t xml:space="preserve"> </w:t>
+      </w:r>
+      <w:r>
+        <w:t xml:space="preserve">In addition, the establishment of a curated fungal isolate collection and a campus environmental</w:t>
+      </w:r>
+      <w:r>
+        <w:t xml:space="preserve"> </w:t>
+      </w:r>
+      <w:r>
+        <w:t xml:space="preserve">monitoring framework will provide long-term research assets and strengthen local capacity in</w:t>
+      </w:r>
+      <w:r>
+        <w:t xml:space="preserve"> </w:t>
+      </w:r>
+      <w:r>
+        <w:t xml:space="preserve">environmental microbiology, building science, and sustainable infrastructure management.</w:t>
+      </w:r>
+    </w:p>
+    <w:bookmarkEnd w:id="34"/>
+    <w:bookmarkEnd w:id="35"/>
+    <w:bookmarkStart w:id="36" w:name="objectives"/>
+    <w:p>
+      <w:pPr>
+        <w:pStyle w:val="Heading2"/>
+      </w:pPr>
+      <w:r>
+        <w:t xml:space="preserve">10. Objectives</w:t>
       </w:r>
     </w:p>
     <w:p>
@@ -1248,16 +1877,21 @@
           <w:ilvl w:val="0"/>
           <w:numId w:val="1001"/>
         </w:numPr>
-        <w:pStyle w:val="Compact"/>
-      </w:pPr>
-      <w:r>
-        <w:t xml:space="preserve">Which fungal taxa colonise the exteriors of tropical educational buildings at UTS Sibu, and</w:t>
-      </w:r>
-      <w:r>
-        <w:t xml:space="preserve"> </w:t>
-      </w:r>
-      <w:r>
-        <w:t xml:space="preserve">what is their relative abundance?</w:t>
+      </w:pPr>
+      <w:r>
+        <w:t xml:space="preserve">To characterise the fungal communities colonising building exteriors at the UTS Sibu campus,</w:t>
+      </w:r>
+      <w:r>
+        <w:t xml:space="preserve"> </w:t>
+      </w:r>
+      <w:r>
+        <w:t xml:space="preserve">through culture-based isolation, enumeration and PCR-based molecular identification targeting</w:t>
+      </w:r>
+      <w:r>
+        <w:t xml:space="preserve"> </w:t>
+      </w:r>
+      <w:r>
+        <w:t xml:space="preserve">the internal transcribed spacer region.</w:t>
       </w:r>
     </w:p>
     <w:p>
@@ -1266,16 +1900,21 @@
           <w:ilvl w:val="0"/>
           <w:numId w:val="1001"/>
         </w:numPr>
-        <w:pStyle w:val="Compact"/>
-      </w:pPr>
-      <w:r>
-        <w:t xml:space="preserve">Does community composition and abundance differ by facade material, building age, design</w:t>
-      </w:r>
-      <w:r>
-        <w:t xml:space="preserve"> </w:t>
-      </w:r>
-      <w:r>
-        <w:t xml:space="preserve">approach and orientation?</w:t>
+      </w:pPr>
+      <w:r>
+        <w:t xml:space="preserve">To determine how community composition and abundance vary with facade material, building age,</w:t>
+      </w:r>
+      <w:r>
+        <w:t xml:space="preserve"> </w:t>
+      </w:r>
+      <w:r>
+        <w:t xml:space="preserve">design approach, orientation and exposure, across paired visibly colonised and visually clean</w:t>
+      </w:r>
+      <w:r>
+        <w:t xml:space="preserve"> </w:t>
+      </w:r>
+      <w:r>
+        <w:t xml:space="preserve">surfaces, with algal and cyanobacterial cover recorded as a covariate.</w:t>
       </w:r>
     </w:p>
     <w:p>
@@ -1284,16 +1923,21 @@
           <w:ilvl w:val="0"/>
           <w:numId w:val="1001"/>
         </w:numPr>
-        <w:pStyle w:val="Compact"/>
-      </w:pPr>
-      <w:r>
-        <w:t xml:space="preserve">Does composition vary between monsoon phases, and is that seasonal signal consistent when a</w:t>
-      </w:r>
-      <w:r>
-        <w:t xml:space="preserve"> </w:t>
-      </w:r>
-      <w:r>
-        <w:t xml:space="preserve">phase is resampled a year later?</w:t>
+      </w:pPr>
+      <w:r>
+        <w:t xml:space="preserve">To establish seasonal variation in community composition across a complete annual cycle</w:t>
+      </w:r>
+      <w:r>
+        <w:t xml:space="preserve"> </w:t>
+      </w:r>
+      <w:r>
+        <w:t xml:space="preserve">spanning both monsoon phases, with two phases resampled twelve months apart to test</w:t>
+      </w:r>
+      <w:r>
+        <w:t xml:space="preserve"> </w:t>
+      </w:r>
+      <w:r>
+        <w:t xml:space="preserve">consistency.</w:t>
       </w:r>
     </w:p>
     <w:p>
@@ -1302,542 +1946,6 @@
           <w:ilvl w:val="0"/>
           <w:numId w:val="1001"/>
         </w:numPr>
-        <w:pStyle w:val="Compact"/>
-      </w:pPr>
-      <w:r>
-        <w:t xml:space="preserve">Is algal and cyanobacterial cover associated with fungal abundance, as pioneer facilitation</w:t>
-      </w:r>
-      <w:r>
-        <w:t xml:space="preserve"> </w:t>
-      </w:r>
-      <w:r>
-        <w:t xml:space="preserve">would predict?</w:t>
-      </w:r>
-    </w:p>
-    <w:p>
-      <w:pPr>
-        <w:numPr>
-          <w:ilvl w:val="0"/>
-          <w:numId w:val="1001"/>
-        </w:numPr>
-        <w:pStyle w:val="Compact"/>
-      </w:pPr>
-      <w:r>
-        <w:t xml:space="preserve">Is fungal abundance associated with antecedent particulate matter and microclimate once</w:t>
-      </w:r>
-      <w:r>
-        <w:t xml:space="preserve"> </w:t>
-      </w:r>
-      <w:r>
-        <w:t xml:space="preserve">humidity and rainfall are accounted for?</w:t>
-      </w:r>
-    </w:p>
-    <w:bookmarkEnd w:id="32"/>
-    <w:bookmarkStart w:id="33" w:name="literature-review"/>
-    <w:p>
-      <w:pPr>
-        <w:pStyle w:val="Heading3"/>
-      </w:pPr>
-      <w:r>
-        <w:t xml:space="preserve">9.4 Literature review</w:t>
-      </w:r>
-    </w:p>
-    <w:p>
-      <w:pPr>
-        <w:pStyle w:val="FirstParagraph"/>
-      </w:pPr>
-      <w:r>
-        <w:t xml:space="preserve">Relative humidity and surface moisture are consistently identified as the dominant determinants</w:t>
-      </w:r>
-      <w:r>
-        <w:t xml:space="preserve"> </w:t>
-      </w:r>
-      <w:r>
-        <w:t xml:space="preserve">of fungal colonisation on building materials. Humidity level governs the rate of biodeterioration</w:t>
-      </w:r>
-      <w:r>
-        <w:t xml:space="preserve"> </w:t>
-      </w:r>
-      <w:r>
-        <w:t xml:space="preserve">on mineral substrates [4], the moisture adsorption properties of the material itself condition</w:t>
-      </w:r>
-      <w:r>
-        <w:t xml:space="preserve"> </w:t>
-      </w:r>
-      <w:r>
-        <w:t xml:space="preserve">growth [8], hyphal extension rate varies directly with humidity [9], and moisture parameters</w:t>
-      </w:r>
-      <w:r>
-        <w:t xml:space="preserve"> </w:t>
-      </w:r>
-      <w:r>
-        <w:t xml:space="preserve">structure the fungal communities that establish on building surfaces [10]. The relationship</w:t>
-      </w:r>
-      <w:r>
-        <w:t xml:space="preserve"> </w:t>
-      </w:r>
-      <w:r>
-        <w:t xml:space="preserve">between moisture, ventilation and mould growth has been recognised in the conservation</w:t>
-      </w:r>
-      <w:r>
-        <w:t xml:space="preserve"> </w:t>
-      </w:r>
-      <w:r>
-        <w:t xml:space="preserve">literature for several decades [11].</w:t>
-      </w:r>
-    </w:p>
-    <w:p>
-      <w:pPr>
-        <w:pStyle w:val="BodyText"/>
-      </w:pPr>
-      <w:r>
-        <w:t xml:space="preserve">Building design governs how long that moisture persists. Facade geometry, glazing ratio, shading</w:t>
-      </w:r>
-      <w:r>
-        <w:t xml:space="preserve"> </w:t>
-      </w:r>
-      <w:r>
-        <w:t xml:space="preserve">and ventilation strategy together determine the duration of surface wetness. Studies of tropical</w:t>
-      </w:r>
-      <w:r>
-        <w:t xml:space="preserve"> </w:t>
-      </w:r>
-      <w:r>
-        <w:t xml:space="preserve">educational buildings have addressed the daylight and energy optimisation of facades [12, 15],</w:t>
-      </w:r>
-      <w:r>
-        <w:t xml:space="preserve"> </w:t>
-      </w:r>
-      <w:r>
-        <w:t xml:space="preserve">the retrofitting of passive design measures [13, 20] and the prevention of mould growth under</w:t>
-      </w:r>
-      <w:r>
-        <w:t xml:space="preserve"> </w:t>
-      </w:r>
-      <w:r>
-        <w:t xml:space="preserve">high mechanical ventilation rates in hot and humid climates [14]. Occupant-driven variation in</w:t>
-      </w:r>
-      <w:r>
-        <w:t xml:space="preserve"> </w:t>
-      </w:r>
-      <w:r>
-        <w:t xml:space="preserve">the operation of windows, doors and fans introduces further variability in naturally ventilated</w:t>
-      </w:r>
-      <w:r>
-        <w:t xml:space="preserve"> </w:t>
-      </w:r>
-      <w:r>
-        <w:t xml:space="preserve">school buildings [21]. These literatures optimise for energy performance and thermal comfort;</w:t>
-      </w:r>
-      <w:r>
-        <w:t xml:space="preserve"> </w:t>
-      </w:r>
-      <w:r>
-        <w:t xml:space="preserve">biodeterioration risk does not generally appear among their objectives, which is the gap this</w:t>
-      </w:r>
-      <w:r>
-        <w:t xml:space="preserve"> </w:t>
-      </w:r>
-      <w:r>
-        <w:t xml:space="preserve">project addresses.</w:t>
-      </w:r>
-    </w:p>
-    <w:p>
-      <w:pPr>
-        <w:pStyle w:val="BodyText"/>
-      </w:pPr>
-      <w:r>
-        <w:t xml:space="preserve">The taxa recovered from built surfaces are reasonably consistent across studies. Penicillium is</w:t>
-      </w:r>
-      <w:r>
-        <w:t xml:space="preserve"> </w:t>
-      </w:r>
-      <w:r>
-        <w:t xml:space="preserve">routinely isolated from school buildings [6]. Cladosporium sphaerospermum predominates on indoor</w:t>
-      </w:r>
-      <w:r>
-        <w:t xml:space="preserve"> </w:t>
-      </w:r>
-      <w:r>
-        <w:t xml:space="preserve">surfaces, its xerotolerance supported by osmoregulation and melanisation that permit persistence</w:t>
-      </w:r>
-      <w:r>
-        <w:t xml:space="preserve"> </w:t>
-      </w:r>
-      <w:r>
-        <w:t xml:space="preserve">under fluctuating water activity [22]. Aspergillus lineages specifically associated with the</w:t>
-      </w:r>
-      <w:r>
-        <w:t xml:space="preserve"> </w:t>
-      </w:r>
-      <w:r>
-        <w:t xml:space="preserve">built environment continue to be described [23], as do emerging tropical and subtropical taxa</w:t>
-      </w:r>
-      <w:r>
-        <w:t xml:space="preserve"> </w:t>
-      </w:r>
-      <w:r>
-        <w:t xml:space="preserve">[24]. Within Malaysia, fungal assessment of older buildings in the Peninsula [1] and the</w:t>
-      </w:r>
-      <w:r>
-        <w:t xml:space="preserve"> </w:t>
-      </w:r>
-      <w:r>
-        <w:t xml:space="preserve">detection of fungal DNA and mycotoxins in classroom dust in Johor Bahru, with associated</w:t>
-      </w:r>
-      <w:r>
-        <w:t xml:space="preserve"> </w:t>
-      </w:r>
-      <w:r>
-        <w:t xml:space="preserve">occupant symptoms [2], establish both local relevance and a health dimension. Comparable</w:t>
-      </w:r>
-      <w:r>
-        <w:t xml:space="preserve"> </w:t>
-      </w:r>
-      <w:r>
-        <w:t xml:space="preserve">exterior inventories for Borneo are absent from the indexed literature.</w:t>
-      </w:r>
-    </w:p>
-    <w:p>
-      <w:pPr>
-        <w:pStyle w:val="BodyText"/>
-      </w:pPr>
-      <w:r>
-        <w:t xml:space="preserve">The mechanisms by which colonisation damages mineral substrates are well characterised. A</w:t>
-      </w:r>
-      <w:r>
-        <w:t xml:space="preserve"> </w:t>
-      </w:r>
-      <w:r>
-        <w:t xml:space="preserve">critical review of the microbial degradation of concrete by fungi synthesises the physiological,</w:t>
-      </w:r>
-      <w:r>
-        <w:t xml:space="preserve"> </w:t>
-      </w:r>
-      <w:r>
-        <w:t xml:space="preserve">ecological, physical and chemical pathways involved [25]. Aspergillus tamarii has been shown in</w:t>
-      </w:r>
-      <w:r>
-        <w:t xml:space="preserve"> </w:t>
-      </w:r>
-      <w:r>
-        <w:t xml:space="preserve">vitro to deteriorate both concrete and marble [26], fungal deterioration of barrier concrete is</w:t>
-      </w:r>
-      <w:r>
-        <w:t xml:space="preserve"> </w:t>
-      </w:r>
-      <w:r>
-        <w:t xml:space="preserve">documented in waste containment contexts [27], and marble substrates show mycologically mediated</w:t>
-      </w:r>
-      <w:r>
-        <w:t xml:space="preserve"> </w:t>
-      </w:r>
-      <w:r>
-        <w:t xml:space="preserve">decay in heritage settings [7]. Biofilm formation and the production of extracellular polymeric</w:t>
-      </w:r>
-      <w:r>
-        <w:t xml:space="preserve"> </w:t>
-      </w:r>
-      <w:r>
-        <w:t xml:space="preserve">substances accelerate deterioration and surface soiling [18], colonisation responds to</w:t>
-      </w:r>
-      <w:r>
-        <w:t xml:space="preserve"> </w:t>
-      </w:r>
-      <w:r>
-        <w:t xml:space="preserve">environmental stressors in ways still being characterised [28], and comparative work on</w:t>
-      </w:r>
-      <w:r>
-        <w:t xml:space="preserve"> </w:t>
-      </w:r>
-      <w:r>
-        <w:t xml:space="preserve">traditional and modern construction in coastal tropical India demonstrates material-specific</w:t>
-      </w:r>
-      <w:r>
-        <w:t xml:space="preserve"> </w:t>
-      </w:r>
-      <w:r>
-        <w:t xml:space="preserve">susceptibility [3].</w:t>
-      </w:r>
-    </w:p>
-    <w:p>
-      <w:pPr>
-        <w:pStyle w:val="BodyText"/>
-      </w:pPr>
-      <w:r>
-        <w:t xml:space="preserve">Air quality forms part of the environmental context in which these communities develop.</w:t>
-      </w:r>
-      <w:r>
-        <w:t xml:space="preserve"> </w:t>
-      </w:r>
-      <w:r>
-        <w:t xml:space="preserve">Particulate matter concentration co-varies with atmospheric fungal spore counts under tropical</w:t>
-      </w:r>
-      <w:r>
-        <w:t xml:space="preserve"> </w:t>
-      </w:r>
-      <w:r>
-        <w:t xml:space="preserve">urban conditions [19], regional spore concentrations can be modelled from atmospheric data [29],</w:t>
-      </w:r>
-      <w:r>
-        <w:t xml:space="preserve"> </w:t>
-      </w:r>
-      <w:r>
-        <w:t xml:space="preserve">and integrated particulate sensing is being applied to bioaerosol dynamics [30]. Occupancy</w:t>
-      </w:r>
-      <w:r>
-        <w:t xml:space="preserve"> </w:t>
-      </w:r>
-      <w:r>
-        <w:t xml:space="preserve">itself elevates measured fungal and bacterial loads in classrooms [31], and school environments</w:t>
-      </w:r>
-      <w:r>
-        <w:t xml:space="preserve"> </w:t>
-      </w:r>
-      <w:r>
-        <w:t xml:space="preserve">show systematic indoor to outdoor and seasonal structure in airborne fungi [32, 33, 16, 17, 34].</w:t>
-      </w:r>
-      <w:r>
-        <w:t xml:space="preserve"> </w:t>
-      </w:r>
-      <w:r>
-        <w:t xml:space="preserve">This project accordingly records air quality and microclimate as environmental context for the</w:t>
-      </w:r>
-      <w:r>
-        <w:t xml:space="preserve"> </w:t>
-      </w:r>
-      <w:r>
-        <w:t xml:space="preserve">surface communities rather than as an experimentally manipulated exposure.</w:t>
-      </w:r>
-    </w:p>
-    <w:p>
-      <w:pPr>
-        <w:pStyle w:val="BodyText"/>
-      </w:pPr>
-      <w:r>
-        <w:t xml:space="preserve">Culture-based and molecular detection methods are complementary rather than interchangeable.</w:t>
-      </w:r>
-      <w:r>
-        <w:t xml:space="preserve"> </w:t>
-      </w:r>
-      <w:r>
-        <w:t xml:space="preserve">Culture recovers viable organisms but underestimates non-culturable and stressed taxa, whereas</w:t>
-      </w:r>
-      <w:r>
-        <w:t xml:space="preserve"> </w:t>
-      </w:r>
-      <w:r>
-        <w:t xml:space="preserve">molecular detection is faster and more sensitive [35]. Swab type materially affects recovery</w:t>
-      </w:r>
-      <w:r>
-        <w:t xml:space="preserve"> </w:t>
-      </w:r>
-      <w:r>
-        <w:t xml:space="preserve">efficiency [36], multiplex real-time PCR assays are available for filamentous fungi [37], and</w:t>
-      </w:r>
-      <w:r>
-        <w:t xml:space="preserve"> </w:t>
-      </w:r>
-      <w:r>
-        <w:t xml:space="preserve">fungal volatile organic compounds offer an orthogonal signal [38]. The internal transcribed</w:t>
-      </w:r>
-      <w:r>
-        <w:t xml:space="preserve"> </w:t>
-      </w:r>
-      <w:r>
-        <w:t xml:space="preserve">spacer region is the accepted primary fungal barcode [39], although the classification of ITS</w:t>
-      </w:r>
-      <w:r>
-        <w:t xml:space="preserve"> </w:t>
-      </w:r>
-      <w:r>
-        <w:t xml:space="preserve">amplicons depends on the assignment method adopted [40] and resolution is limited within certain</w:t>
-      </w:r>
-      <w:r>
-        <w:t xml:space="preserve"> </w:t>
-      </w:r>
-      <w:r>
-        <w:t xml:space="preserve">genera.</w:t>
-      </w:r>
-    </w:p>
-    <w:p>
-      <w:pPr>
-        <w:pStyle w:val="BodyText"/>
-      </w:pPr>
-      <w:r>
-        <w:t xml:space="preserve">Finally, the intervention space is reasonably well defined. Antifungal nanocoatings based on</w:t>
-      </w:r>
-      <w:r>
-        <w:t xml:space="preserve"> </w:t>
-      </w:r>
-      <w:r>
-        <w:t xml:space="preserve">silver and zinc oxide [41, 42] and non-thermal plasma treatment [43] have both been evaluated.</w:t>
-      </w:r>
-      <w:r>
-        <w:t xml:space="preserve"> </w:t>
-      </w:r>
-      <w:r>
-        <w:t xml:space="preserve">An inventory of the taxa actually present on local facades is what would allow such options to</w:t>
-      </w:r>
-      <w:r>
-        <w:t xml:space="preserve"> </w:t>
-      </w:r>
-      <w:r>
-        <w:t xml:space="preserve">be assessed for this building stock, which is the practical contribution this project seeks to</w:t>
-      </w:r>
-      <w:r>
-        <w:t xml:space="preserve"> </w:t>
-      </w:r>
-      <w:r>
-        <w:t xml:space="preserve">make.</w:t>
-      </w:r>
-    </w:p>
-    <w:bookmarkEnd w:id="33"/>
-    <w:bookmarkStart w:id="34" w:name="X0e11ace66e2248e439dd5ca1e80f67a02a165ec"/>
-    <w:p>
-      <w:pPr>
-        <w:pStyle w:val="Heading3"/>
-      </w:pPr>
-      <w:r>
-        <w:t xml:space="preserve">9.5 Relevance to government policy, community and industry</w:t>
-      </w:r>
-    </w:p>
-    <w:p>
-      <w:pPr>
-        <w:pStyle w:val="FirstParagraph"/>
-      </w:pPr>
-      <w:r>
-        <w:t xml:space="preserve">The project aligns with the Sarawak Post COVID-19 Development Strategy 2030 under the</w:t>
-      </w:r>
-      <w:r>
-        <w:t xml:space="preserve"> </w:t>
-      </w:r>
-      <w:r>
-        <w:t xml:space="preserve">Environmental Sustainability and Social Well-being pillars [44]. It provides MEITD, JKR and</w:t>
-      </w:r>
-      <w:r>
-        <w:t xml:space="preserve"> </w:t>
-      </w:r>
-      <w:r>
-        <w:t xml:space="preserve">public campus operators with measured evidence on the biological deterioration of tropical</w:t>
-      </w:r>
-      <w:r>
-        <w:t xml:space="preserve"> </w:t>
-      </w:r>
-      <w:r>
-        <w:t xml:space="preserve">public building exteriors, supporting specification and maintenance decisions that are at</w:t>
-      </w:r>
-      <w:r>
-        <w:t xml:space="preserve"> </w:t>
-      </w:r>
-      <w:r>
-        <w:t xml:space="preserve">present made without local data. The outputs transfer directly to schools, clinics and offices</w:t>
-      </w:r>
-      <w:r>
-        <w:t xml:space="preserve"> </w:t>
-      </w:r>
-      <w:r>
-        <w:t xml:space="preserve">across Sarawak, which share the climate, the construction types and the reactive washing</w:t>
-      </w:r>
-      <w:r>
-        <w:t xml:space="preserve"> </w:t>
-      </w:r>
-      <w:r>
-        <w:t xml:space="preserve">maintenance pattern. The isolate collection and the air-quality baseline remain as institutional</w:t>
-      </w:r>
-      <w:r>
-        <w:t xml:space="preserve"> </w:t>
-      </w:r>
-      <w:r>
-        <w:t xml:space="preserve">assets, and the campus monitoring capability supports institutional environmental reporting.</w:t>
-      </w:r>
-    </w:p>
-    <w:bookmarkEnd w:id="34"/>
-    <w:bookmarkEnd w:id="35"/>
-    <w:bookmarkStart w:id="36" w:name="objectives"/>
-    <w:p>
-      <w:pPr>
-        <w:pStyle w:val="Heading2"/>
-      </w:pPr>
-      <w:r>
-        <w:t xml:space="preserve">10. Objectives</w:t>
-      </w:r>
-    </w:p>
-    <w:p>
-      <w:pPr>
-        <w:numPr>
-          <w:ilvl w:val="0"/>
-          <w:numId w:val="1002"/>
-        </w:numPr>
-      </w:pPr>
-      <w:r>
-        <w:t xml:space="preserve">To characterise the fungal communities colonising building exteriors at the UTS Sibu campus,</w:t>
-      </w:r>
-      <w:r>
-        <w:t xml:space="preserve"> </w:t>
-      </w:r>
-      <w:r>
-        <w:t xml:space="preserve">through culture-based isolation, enumeration and PCR-based molecular identification targeting</w:t>
-      </w:r>
-      <w:r>
-        <w:t xml:space="preserve"> </w:t>
-      </w:r>
-      <w:r>
-        <w:t xml:space="preserve">the internal transcribed spacer region.</w:t>
-      </w:r>
-    </w:p>
-    <w:p>
-      <w:pPr>
-        <w:numPr>
-          <w:ilvl w:val="0"/>
-          <w:numId w:val="1002"/>
-        </w:numPr>
-      </w:pPr>
-      <w:r>
-        <w:t xml:space="preserve">To determine how community composition and abundance vary with facade material, building age,</w:t>
-      </w:r>
-      <w:r>
-        <w:t xml:space="preserve"> </w:t>
-      </w:r>
-      <w:r>
-        <w:t xml:space="preserve">design approach, orientation and exposure, across paired visibly colonised and visually clean</w:t>
-      </w:r>
-      <w:r>
-        <w:t xml:space="preserve"> </w:t>
-      </w:r>
-      <w:r>
-        <w:t xml:space="preserve">surfaces, with algal and cyanobacterial cover recorded as a covariate.</w:t>
-      </w:r>
-    </w:p>
-    <w:p>
-      <w:pPr>
-        <w:numPr>
-          <w:ilvl w:val="0"/>
-          <w:numId w:val="1002"/>
-        </w:numPr>
-      </w:pPr>
-      <w:r>
-        <w:t xml:space="preserve">To establish seasonal variation in community composition across a complete annual cycle</w:t>
-      </w:r>
-      <w:r>
-        <w:t xml:space="preserve"> </w:t>
-      </w:r>
-      <w:r>
-        <w:t xml:space="preserve">spanning both monsoon phases, with two phases resampled twelve months apart to test</w:t>
-      </w:r>
-      <w:r>
-        <w:t xml:space="preserve"> </w:t>
-      </w:r>
-      <w:r>
-        <w:t xml:space="preserve">consistency.</w:t>
-      </w:r>
-    </w:p>
-    <w:p>
-      <w:pPr>
-        <w:numPr>
-          <w:ilvl w:val="0"/>
-          <w:numId w:val="1002"/>
-        </w:numPr>
       </w:pPr>
       <w:r>
         <w:t xml:space="preserve">To monitor campus air quality and microclimate continuously as environmental context, and to</w:t>
@@ -2145,7 +2253,7 @@
         <w:t xml:space="preserve"> </w:t>
       </w:r>
       <w:r>
-        <w:t xml:space="preserve">swab-dependent [36]. Passive settle plates are deployed adjacent to a defined subset of points</w:t>
+        <w:t xml:space="preserve">swab-dependent (Goverde et al., 2017). Passive settle plates are deployed adjacent to a defined subset of points</w:t>
       </w:r>
       <w:r>
         <w:t xml:space="preserve"> </w:t>
@@ -2545,7 +2653,7 @@
         <w:t xml:space="preserve"> </w:t>
       </w:r>
       <w:r>
-        <w:t xml:space="preserve">amplicon classification is method-dependent [40]. Isolates are maintained by SRDC-TROPI as a</w:t>
+        <w:t xml:space="preserve">amplicon classification is method-dependent (Porter and Golding, 2011). Isolates are maintained by SRDC-TROPI as a</w:t>
       </w:r>
       <w:r>
         <w:t xml:space="preserve"> </w:t>
@@ -2597,7 +2705,7 @@
         <w:t xml:space="preserve"> </w:t>
       </w:r>
       <w:r>
-        <w:t xml:space="preserve">organisms but systematically underestimates non-culturable and stressed environmental taxa [35],</w:t>
+        <w:t xml:space="preserve">organisms but systematically underestimates non-culturable and stressed environmental taxa (Warren et al., 2026),</w:t>
       </w:r>
       <w:r>
         <w:t xml:space="preserve"> </w:t>
@@ -2615,7 +2723,7 @@
         <w:t xml:space="preserve"> </w:t>
       </w:r>
       <w:r>
-        <w:t xml:space="preserve">spacer region is the accepted primary fungal barcode [39] but does not reliably resolve all</w:t>
+        <w:t xml:space="preserve">spacer region is the accepted primary fungal barcode (Xu, 2016) but does not reliably resolve all</w:t>
       </w:r>
       <w:r>
         <w:t xml:space="preserve"> </w:t>
@@ -2633,7 +2741,7 @@
         <w:t xml:space="preserve"> </w:t>
       </w:r>
       <w:r>
-        <w:t xml:space="preserve">toxigenic or biodeteriogenic on the basis of published activity for the genus [25, 26, 27, 18],</w:t>
+        <w:t xml:space="preserve">toxigenic or biodeteriogenic on the basis of published activity for the genus (Jiang et al., 2022; Chaudhuri et al., 2020; Fomina et al., 2007; Gaylarde and Morton, 1997),</w:t>
       </w:r>
       <w:r>
         <w:t xml:space="preserve"> </w:t>
@@ -3032,7 +3140,7 @@
         <w:t xml:space="preserve"> </w:t>
       </w:r>
       <w:r>
-        <w:t xml:space="preserve">[8, 9, 10] from material and indoor scales to the designed tropical exterior.</w:t>
+        <w:t xml:space="preserve">(Shibuta and Teramoto, 2026; Ito and Mizuno, 2009; Dedesko and Siegel, 2015) from material and indoor scales to the designed tropical exterior.</w:t>
       </w:r>
     </w:p>
     <w:p>
@@ -3348,1113 +3456,351 @@
         <w:pStyle w:val="FirstParagraph"/>
       </w:pPr>
       <w:r>
-        <w:t xml:space="preserve">References are numbered in order of first appearance in this document. Each was identified</w:t>
-      </w:r>
-      <w:r>
-        <w:t xml:space="preserve"> </w:t>
-      </w:r>
-      <w:r>
-        <w:t xml:space="preserve">through a Scopus search and must be verified against the claim it supports before submission.</w:t>
-      </w:r>
-    </w:p>
-    <w:p>
-      <w:pPr>
-        <w:numPr>
-          <w:ilvl w:val="0"/>
-          <w:numId w:val="1003"/>
-        </w:numPr>
-        <w:pStyle w:val="Compact"/>
-      </w:pPr>
-      <w:r>
-        <w:t xml:space="preserve">Omar Hamdan, A.S., Ahmad, N.I., Mohd Tap, R. et al. Fungus assessment in indoor environment of old buildings in Peninsular Malaysia.</w:t>
-      </w:r>
-      <w:r>
-        <w:t xml:space="preserve"> </w:t>
-      </w:r>
-      <w:r>
-        <w:rPr>
-          <w:iCs/>
-          <w:i/>
-        </w:rPr>
-        <w:t xml:space="preserve">Aerobiologia</w:t>
-      </w:r>
-      <w:r>
-        <w:t xml:space="preserve">, 42, 14 (2026). https://doi.org/10.1007/s10453-026-09903-2</w:t>
-      </w:r>
-    </w:p>
-    <w:p>
-      <w:pPr>
-        <w:numPr>
-          <w:ilvl w:val="0"/>
-          <w:numId w:val="1003"/>
-        </w:numPr>
-        <w:pStyle w:val="Compact"/>
-      </w:pPr>
-      <w:r>
-        <w:t xml:space="preserve">Norback, D., Hashim, J.H., Cai, G.-H., et al. Rhinitis, ocular, throat and dermal symptoms, headache and tiredness among students in schools from Johor Bahru, Malaysia: associations with fungal DNA and mycotoxins in classroom dust.</w:t>
-      </w:r>
-      <w:r>
-        <w:t xml:space="preserve"> </w:t>
-      </w:r>
-      <w:r>
-        <w:rPr>
-          <w:iCs/>
-          <w:i/>
-        </w:rPr>
-        <w:t xml:space="preserve">PLoS ONE</w:t>
-      </w:r>
-      <w:r>
-        <w:t xml:space="preserve">, 2016.</w:t>
-      </w:r>
-    </w:p>
-    <w:p>
-      <w:pPr>
-        <w:numPr>
-          <w:ilvl w:val="0"/>
-          <w:numId w:val="1003"/>
-        </w:numPr>
-        <w:pStyle w:val="Compact"/>
-      </w:pPr>
-      <w:r>
-        <w:t xml:space="preserve">Ara, M., Das, I.P., Nayak, R. Impact of indoor fungal growth on building materials in coastal Karnataka: a comparative study of traditional and modern construction.</w:t>
-      </w:r>
-      <w:r>
-        <w:t xml:space="preserve"> </w:t>
-      </w:r>
-      <w:r>
-        <w:rPr>
-          <w:iCs/>
-          <w:i/>
-        </w:rPr>
-        <w:t xml:space="preserve">Journal of The Institution of Engineers (India): Series A</w:t>
-      </w:r>
-      <w:r>
-        <w:t xml:space="preserve">, 2025.</w:t>
-      </w:r>
-    </w:p>
-    <w:p>
-      <w:pPr>
-        <w:numPr>
-          <w:ilvl w:val="0"/>
-          <w:numId w:val="1003"/>
-        </w:numPr>
-        <w:pStyle w:val="Compact"/>
-      </w:pPr>
-      <w:r>
-        <w:t xml:space="preserve">Jain, A., Bhadauria, S., Kumar, V., Chauhan, R.S. Biodeterioration of sandstone under the influence of different humidity levels in laboratory conditions.</w:t>
-      </w:r>
-      <w:r>
-        <w:t xml:space="preserve"> </w:t>
-      </w:r>
-      <w:r>
-        <w:rPr>
-          <w:iCs/>
-          <w:i/>
-        </w:rPr>
-        <w:t xml:space="preserve">Building and Environment</w:t>
-      </w:r>
-      <w:r>
-        <w:t xml:space="preserve">, 2009.</w:t>
-      </w:r>
-    </w:p>
-    <w:p>
-      <w:pPr>
-        <w:numPr>
-          <w:ilvl w:val="0"/>
-          <w:numId w:val="1003"/>
-        </w:numPr>
-        <w:pStyle w:val="Compact"/>
-      </w:pPr>
-      <w:r>
-        <w:t xml:space="preserve">Singh, J. Fungal problems in historic buildings.</w:t>
-      </w:r>
-      <w:r>
-        <w:t xml:space="preserve"> </w:t>
-      </w:r>
-      <w:r>
-        <w:rPr>
-          <w:iCs/>
-          <w:i/>
-        </w:rPr>
-        <w:t xml:space="preserve">Journal of Architectural Conservation</w:t>
-      </w:r>
-      <w:r>
-        <w:t xml:space="preserve">, 2000.</w:t>
-      </w:r>
-    </w:p>
-    <w:p>
-      <w:pPr>
-        <w:numPr>
-          <w:ilvl w:val="0"/>
-          <w:numId w:val="1003"/>
-        </w:numPr>
-        <w:pStyle w:val="Compact"/>
-      </w:pPr>
-      <w:r>
-        <w:t xml:space="preserve">Ejdys, E., Biedunkiewicz, A. Fungi of the genus Penicillium in school buildings.</w:t>
-      </w:r>
-      <w:r>
-        <w:t xml:space="preserve"> </w:t>
-      </w:r>
-      <w:r>
-        <w:rPr>
-          <w:iCs/>
-          <w:i/>
-        </w:rPr>
-        <w:t xml:space="preserve">Polish Journal of Environmental Studies</w:t>
-      </w:r>
-      <w:r>
-        <w:t xml:space="preserve">, 2011.</w:t>
-      </w:r>
-    </w:p>
-    <w:p>
-      <w:pPr>
-        <w:numPr>
-          <w:ilvl w:val="0"/>
-          <w:numId w:val="1003"/>
-        </w:numPr>
-        <w:pStyle w:val="Compact"/>
-      </w:pPr>
-      <w:r>
-        <w:t xml:space="preserve">Kosel, J., Tomsic, N., Mlakar, M., et al. Mycological evaluation of the visible deterioration symptoms on the Spectatius family marble tomb, Slovenia.</w:t>
-      </w:r>
-      <w:r>
-        <w:t xml:space="preserve"> </w:t>
-      </w:r>
-      <w:r>
-        <w:rPr>
-          <w:iCs/>
-          <w:i/>
-        </w:rPr>
-        <w:t xml:space="preserve">Heritage Science</w:t>
-      </w:r>
-      <w:r>
-        <w:t xml:space="preserve">, 2024.</w:t>
-      </w:r>
-    </w:p>
-    <w:p>
-      <w:pPr>
-        <w:numPr>
-          <w:ilvl w:val="0"/>
-          <w:numId w:val="1003"/>
-        </w:numPr>
-        <w:pStyle w:val="Compact"/>
-      </w:pPr>
-      <w:r>
-        <w:t xml:space="preserve">Shibuta, T., Teramoto, A. Fundamental study on the effect of moisture adsorption properties of building materials on fungal growth.</w:t>
-      </w:r>
-      <w:r>
-        <w:t xml:space="preserve"> </w:t>
-      </w:r>
-      <w:r>
-        <w:rPr>
-          <w:iCs/>
-          <w:i/>
-        </w:rPr>
-        <w:t xml:space="preserve">Journal of Structural and Construction Engineering</w:t>
-      </w:r>
-      <w:r>
-        <w:t xml:space="preserve">, 2026.</w:t>
-      </w:r>
-    </w:p>
-    <w:p>
-      <w:pPr>
-        <w:numPr>
-          <w:ilvl w:val="0"/>
-          <w:numId w:val="1003"/>
-        </w:numPr>
-        <w:pStyle w:val="Compact"/>
-      </w:pPr>
-      <w:r>
-        <w:t xml:space="preserve">Ito, K., Mizuno, Y. Measurement of hyphal growth rate under various humidity conditions and development of fungal growth model.</w:t>
-      </w:r>
-      <w:r>
-        <w:t xml:space="preserve"> </w:t>
-      </w:r>
-      <w:r>
-        <w:rPr>
-          <w:iCs/>
-          <w:i/>
-        </w:rPr>
-        <w:t xml:space="preserve">Journal of Environmental Engineering</w:t>
-      </w:r>
-      <w:r>
-        <w:t xml:space="preserve">, 2009.</w:t>
-      </w:r>
-    </w:p>
-    <w:p>
-      <w:pPr>
-        <w:numPr>
-          <w:ilvl w:val="0"/>
-          <w:numId w:val="1003"/>
-        </w:numPr>
-        <w:pStyle w:val="Compact"/>
-      </w:pPr>
-      <w:r>
-        <w:t xml:space="preserve">Dedesko, S., Siegel, J.A. Moisture parameters and fungal communities associated with gypsum drywall in buildings.</w:t>
-      </w:r>
-      <w:r>
-        <w:t xml:space="preserve"> </w:t>
-      </w:r>
-      <w:r>
-        <w:rPr>
-          <w:iCs/>
-          <w:i/>
-        </w:rPr>
-        <w:t xml:space="preserve">Microbiome</w:t>
-      </w:r>
-      <w:r>
-        <w:t xml:space="preserve">, 2015.</w:t>
-      </w:r>
-    </w:p>
-    <w:p>
-      <w:pPr>
-        <w:numPr>
-          <w:ilvl w:val="0"/>
-          <w:numId w:val="1003"/>
-        </w:numPr>
-        <w:pStyle w:val="Compact"/>
-      </w:pPr>
-      <w:r>
-        <w:t xml:space="preserve">Scott, G. Moisture, ventilation and mould growth.</w:t>
-      </w:r>
-      <w:r>
-        <w:t xml:space="preserve"> </w:t>
-      </w:r>
-      <w:r>
-        <w:rPr>
-          <w:iCs/>
-          <w:i/>
-        </w:rPr>
-        <w:t xml:space="preserve">Studies in Conservation</w:t>
-      </w:r>
-      <w:r>
-        <w:t xml:space="preserve">, 1994.</w:t>
-      </w:r>
-    </w:p>
-    <w:p>
-      <w:pPr>
-        <w:numPr>
-          <w:ilvl w:val="0"/>
-          <w:numId w:val="1003"/>
-        </w:numPr>
-        <w:pStyle w:val="Compact"/>
-      </w:pPr>
-      <w:r>
-        <w:t xml:space="preserve">Lim, T.W., Tongtuam, Y., Ongsavangchai, N. Optimizing window-to-floor ratio and glazing for daylight and cooling in tropical educational buildings: a case study in Chiang Mai, Thailand.</w:t>
-      </w:r>
-      <w:r>
-        <w:t xml:space="preserve"> </w:t>
-      </w:r>
-      <w:r>
-        <w:rPr>
-          <w:iCs/>
-          <w:i/>
-        </w:rPr>
-        <w:t xml:space="preserve">Journal of Daylighting</w:t>
-      </w:r>
-      <w:r>
-        <w:t xml:space="preserve">, 2026.</w:t>
-      </w:r>
-    </w:p>
-    <w:p>
-      <w:pPr>
-        <w:numPr>
-          <w:ilvl w:val="0"/>
-          <w:numId w:val="1003"/>
-        </w:numPr>
-        <w:pStyle w:val="Compact"/>
-      </w:pPr>
-      <w:r>
-        <w:t xml:space="preserve">Idowu, A., Aigbavboa, C., Oke, A., et al. Integrating passive design principles in the retrofitting of educational buildings.</w:t>
-      </w:r>
-      <w:r>
-        <w:t xml:space="preserve"> </w:t>
-      </w:r>
-      <w:r>
-        <w:rPr>
-          <w:iCs/>
-          <w:i/>
-        </w:rPr>
-        <w:t xml:space="preserve">Architectural Engineering and Design Management</w:t>
-      </w:r>
-      <w:r>
-        <w:t xml:space="preserve">, 2026.</w:t>
-      </w:r>
-    </w:p>
-    <w:p>
-      <w:pPr>
-        <w:numPr>
-          <w:ilvl w:val="0"/>
-          <w:numId w:val="1003"/>
-        </w:numPr>
-        <w:pStyle w:val="Compact"/>
-      </w:pPr>
-      <w:r>
-        <w:t xml:space="preserve">Alaidroos, A., Mosly, I. Preventing mold growth and maintaining acceptable indoor air quality for educational buildings operating with high mechanical ventilation rates in hot and humid climates.</w:t>
-      </w:r>
-      <w:r>
-        <w:t xml:space="preserve"> </w:t>
-      </w:r>
-      <w:r>
-        <w:rPr>
-          <w:iCs/>
-          <w:i/>
-        </w:rPr>
-        <w:t xml:space="preserve">Air Quality, Atmosphere and Health</w:t>
-      </w:r>
-      <w:r>
-        <w:t xml:space="preserve">, 2023.</w:t>
-      </w:r>
-    </w:p>
-    <w:p>
-      <w:pPr>
-        <w:numPr>
-          <w:ilvl w:val="0"/>
-          <w:numId w:val="1003"/>
-        </w:numPr>
-        <w:pStyle w:val="Compact"/>
-      </w:pPr>
-      <w:r>
-        <w:t xml:space="preserve">Purnama, M.S.S., Sangadji, F.A., Nugraha, D. Optimizing facade design for energy and daylight performance in tropical educational buildings.</w:t>
-      </w:r>
-      <w:r>
-        <w:t xml:space="preserve"> </w:t>
-      </w:r>
-      <w:r>
-        <w:rPr>
-          <w:iCs/>
-          <w:i/>
-        </w:rPr>
-        <w:t xml:space="preserve">IOP Conference Series: Earth and Environmental Science</w:t>
-      </w:r>
-      <w:r>
-        <w:t xml:space="preserve">, 2025.</w:t>
-      </w:r>
-    </w:p>
-    <w:p>
-      <w:pPr>
-        <w:numPr>
-          <w:ilvl w:val="0"/>
-          <w:numId w:val="1003"/>
-        </w:numPr>
-        <w:pStyle w:val="Compact"/>
-      </w:pPr>
-      <w:r>
-        <w:t xml:space="preserve">Liao, C.-M., Luo, W.-C., Chen, S.-C., et al. Temporal and seasonal variations of size-dependent airborne fungi indoor and outdoor relationships for a wind-induced naturally ventilated airspace.</w:t>
-      </w:r>
-      <w:r>
-        <w:t xml:space="preserve"> </w:t>
-      </w:r>
-      <w:r>
-        <w:rPr>
-          <w:iCs/>
-          <w:i/>
-        </w:rPr>
-        <w:t xml:space="preserve">Atmospheric Environment</w:t>
-      </w:r>
-      <w:r>
-        <w:t xml:space="preserve">, 2004.</w:t>
-      </w:r>
-    </w:p>
-    <w:p>
-      <w:pPr>
-        <w:numPr>
-          <w:ilvl w:val="0"/>
-          <w:numId w:val="1003"/>
-        </w:numPr>
-        <w:pStyle w:val="Compact"/>
-      </w:pPr>
-      <w:r>
-        <w:t xml:space="preserve">Medrela-Kuder, E. Seasonal variations in the occurrence of culturable airborne fungi in outdoor and indoor air in Cracow.</w:t>
-      </w:r>
-      <w:r>
-        <w:t xml:space="preserve"> </w:t>
-      </w:r>
-      <w:r>
-        <w:rPr>
-          <w:iCs/>
-          <w:i/>
-        </w:rPr>
-        <w:t xml:space="preserve">International Biodeterioration and Biodegradation</w:t>
-      </w:r>
-      <w:r>
-        <w:t xml:space="preserve">, 2003.</w:t>
-      </w:r>
-    </w:p>
-    <w:p>
-      <w:pPr>
-        <w:numPr>
-          <w:ilvl w:val="0"/>
-          <w:numId w:val="1003"/>
-        </w:numPr>
-        <w:pStyle w:val="Compact"/>
-      </w:pPr>
-      <w:r>
-        <w:t xml:space="preserve">Gaylarde, C.C., Morton, L.H.G. The importance of biofilms in microbial deterioration of constructional materials.</w:t>
-      </w:r>
-      <w:r>
-        <w:t xml:space="preserve"> </w:t>
-      </w:r>
-      <w:r>
-        <w:rPr>
-          <w:iCs/>
-          <w:i/>
-        </w:rPr>
-        <w:t xml:space="preserve">Revista de Microbiologia</w:t>
-      </w:r>
-      <w:r>
-        <w:t xml:space="preserve">, 1997.</w:t>
-      </w:r>
-    </w:p>
-    <w:p>
-      <w:pPr>
-        <w:numPr>
-          <w:ilvl w:val="0"/>
-          <w:numId w:val="1003"/>
-        </w:numPr>
-        <w:pStyle w:val="Compact"/>
-      </w:pPr>
-      <w:r>
-        <w:t xml:space="preserve">Ramos, R. Relationship between particulate matter (PM10), meteorological parameters, and the concentration of fungal spores in the atmosphere of San Martin Square in Lima.</w:t>
-      </w:r>
-      <w:r>
-        <w:t xml:space="preserve"> </w:t>
-      </w:r>
-      <w:r>
-        <w:rPr>
-          <w:iCs/>
-          <w:i/>
-        </w:rPr>
-        <w:t xml:space="preserve">Ecologia Aplicada</w:t>
-      </w:r>
-      <w:r>
-        <w:t xml:space="preserve">, 2023.</w:t>
-      </w:r>
-    </w:p>
-    <w:p>
-      <w:pPr>
-        <w:numPr>
-          <w:ilvl w:val="0"/>
-          <w:numId w:val="1003"/>
-        </w:numPr>
-        <w:pStyle w:val="Compact"/>
-      </w:pPr>
-      <w:r>
-        <w:t xml:space="preserve">Lotun, S.S., Gooroochurn, M., Lollchund, R.M. Assessment of combinations of passive measures for buildings using artificial intelligence and machine learning.</w:t>
-      </w:r>
-      <w:r>
-        <w:t xml:space="preserve"> </w:t>
-      </w:r>
-      <w:r>
-        <w:rPr>
-          <w:iCs/>
-          <w:i/>
-        </w:rPr>
-        <w:t xml:space="preserve">Journal of Building Engineering</w:t>
-      </w:r>
-      <w:r>
-        <w:t xml:space="preserve">, 2026.</w:t>
-      </w:r>
-    </w:p>
-    <w:p>
-      <w:pPr>
-        <w:numPr>
-          <w:ilvl w:val="0"/>
-          <w:numId w:val="1003"/>
-        </w:numPr>
-        <w:pStyle w:val="Compact"/>
-      </w:pPr>
-      <w:r>
-        <w:t xml:space="preserve">Franceschini, P.B., Schweiker, M., Neves, L.O. Predictive modelling of multi-domain factors on window, door, and fan status in naturally ventilated school classrooms.</w:t>
-      </w:r>
-      <w:r>
-        <w:t xml:space="preserve"> </w:t>
-      </w:r>
-      <w:r>
-        <w:rPr>
-          <w:iCs/>
-          <w:i/>
-        </w:rPr>
-        <w:t xml:space="preserve">Building and Environment</w:t>
-      </w:r>
-      <w:r>
-        <w:t xml:space="preserve">, 2024.</w:t>
-      </w:r>
-    </w:p>
-    <w:p>
-      <w:pPr>
-        <w:numPr>
-          <w:ilvl w:val="0"/>
-          <w:numId w:val="1003"/>
-        </w:numPr>
-        <w:pStyle w:val="Compact"/>
-      </w:pPr>
-      <w:r>
-        <w:t xml:space="preserve">Segers, F.J.J., Meijer, M., Houbraken, J., et al. Xerotolerant Cladosporium sphaerospermum are predominant on indoor surfaces compared to other Cladosporium species.</w:t>
-      </w:r>
-      <w:r>
-        <w:t xml:space="preserve"> </w:t>
-      </w:r>
-      <w:r>
-        <w:rPr>
-          <w:iCs/>
-          <w:i/>
-        </w:rPr>
-        <w:t xml:space="preserve">PLoS ONE</w:t>
-      </w:r>
-      <w:r>
-        <w:t xml:space="preserve">, 2015.</w:t>
-      </w:r>
-    </w:p>
-    <w:p>
-      <w:pPr>
-        <w:numPr>
-          <w:ilvl w:val="0"/>
-          <w:numId w:val="1003"/>
-        </w:numPr>
-        <w:pStyle w:val="Compact"/>
-      </w:pPr>
-      <w:r>
-        <w:t xml:space="preserve">Tanney, J.B., Visagie, C.M., Yilmaz, N., Seifert, K.A. Aspergillus subgenus Polypaecilum from the built environment.</w:t>
-      </w:r>
-      <w:r>
-        <w:t xml:space="preserve"> </w:t>
-      </w:r>
-      <w:r>
-        <w:rPr>
-          <w:iCs/>
-          <w:i/>
-        </w:rPr>
-        <w:t xml:space="preserve">Studies in Mycology</w:t>
-      </w:r>
-      <w:r>
-        <w:t xml:space="preserve">, 2017.</w:t>
-      </w:r>
-    </w:p>
-    <w:p>
-      <w:pPr>
-        <w:numPr>
-          <w:ilvl w:val="0"/>
-          <w:numId w:val="1003"/>
-        </w:numPr>
-        <w:pStyle w:val="Compact"/>
-      </w:pPr>
-      <w:r>
-        <w:t xml:space="preserve">Wang, S.-Y., Chen, L., Cao, J.-J., et al. Colletotrichum magnum species complex: emerging pathogens in tropical and subtropical regions.</w:t>
-      </w:r>
-      <w:r>
-        <w:t xml:space="preserve"> </w:t>
-      </w:r>
-      <w:r>
-        <w:rPr>
-          <w:iCs/>
-          <w:i/>
-        </w:rPr>
-        <w:t xml:space="preserve">Phytopathology</w:t>
-      </w:r>
-      <w:r>
-        <w:t xml:space="preserve">, 2026.</w:t>
-      </w:r>
-    </w:p>
-    <w:p>
-      <w:pPr>
-        <w:numPr>
-          <w:ilvl w:val="0"/>
-          <w:numId w:val="1003"/>
-        </w:numPr>
-        <w:pStyle w:val="Compact"/>
-      </w:pPr>
-      <w:r>
-        <w:t xml:space="preserve">Jiang, L., Pettitt, T.R., Buenfeld, N., Smith, S.R. A critical review of the physiological, ecological, physical and chemical factors influencing the microbial degradation of concrete by fungi.</w:t>
-      </w:r>
-      <w:r>
-        <w:t xml:space="preserve"> </w:t>
-      </w:r>
-      <w:r>
-        <w:rPr>
-          <w:iCs/>
-          <w:i/>
-        </w:rPr>
-        <w:t xml:space="preserve">Building and Environment</w:t>
-      </w:r>
-      <w:r>
-        <w:t xml:space="preserve">, 2022.</w:t>
-      </w:r>
-    </w:p>
-    <w:p>
-      <w:pPr>
-        <w:numPr>
-          <w:ilvl w:val="0"/>
-          <w:numId w:val="1003"/>
-        </w:numPr>
-        <w:pStyle w:val="Compact"/>
-      </w:pPr>
-      <w:r>
-        <w:t xml:space="preserve">Chaudhuri, A., Bhattacharyya, S., Chaudhuri, P., et al. In vitro deterioration study of concrete and marble by Aspergillus tamarii.</w:t>
-      </w:r>
-      <w:r>
-        <w:t xml:space="preserve"> </w:t>
-      </w:r>
-      <w:r>
-        <w:rPr>
-          <w:iCs/>
-          <w:i/>
-        </w:rPr>
-        <w:t xml:space="preserve">Journal of Building Engineering</w:t>
-      </w:r>
-      <w:r>
-        <w:t xml:space="preserve">, 2020.</w:t>
-      </w:r>
-    </w:p>
-    <w:p>
-      <w:pPr>
-        <w:numPr>
-          <w:ilvl w:val="0"/>
-          <w:numId w:val="1003"/>
-        </w:numPr>
-        <w:pStyle w:val="Compact"/>
-      </w:pPr>
-      <w:r>
-        <w:t xml:space="preserve">Fomina, M., Podgorsky, V.S., Olishevska, S.V., et al. Fungal deterioration of barrier concrete used in nuclear waste disposal.</w:t>
-      </w:r>
-      <w:r>
-        <w:t xml:space="preserve"> </w:t>
-      </w:r>
-      <w:r>
-        <w:rPr>
-          <w:iCs/>
-          <w:i/>
-        </w:rPr>
-        <w:t xml:space="preserve">Geomicrobiology Journal</w:t>
-      </w:r>
-      <w:r>
-        <w:t xml:space="preserve">, 2007.</w:t>
-      </w:r>
-    </w:p>
-    <w:p>
-      <w:pPr>
-        <w:numPr>
-          <w:ilvl w:val="0"/>
-          <w:numId w:val="1003"/>
-        </w:numPr>
-        <w:pStyle w:val="Compact"/>
-      </w:pPr>
-      <w:r>
-        <w:t xml:space="preserve">Fu, T., Lai, Q., Chen, X., et al. Fungal colonization on building materials under reduced barometric pressure: a laboratory study.</w:t>
-      </w:r>
-      <w:r>
-        <w:t xml:space="preserve"> </w:t>
-      </w:r>
-      <w:r>
-        <w:rPr>
-          <w:iCs/>
-          <w:i/>
-        </w:rPr>
-        <w:t xml:space="preserve">Case Studies in Construction Materials</w:t>
-      </w:r>
-      <w:r>
-        <w:t xml:space="preserve">, 2025.</w:t>
-      </w:r>
-    </w:p>
-    <w:p>
-      <w:pPr>
-        <w:numPr>
-          <w:ilvl w:val="0"/>
-          <w:numId w:val="1003"/>
-        </w:numPr>
-        <w:pStyle w:val="Compact"/>
-      </w:pPr>
-      <w:r>
-        <w:t xml:space="preserve">Vida, M., Foret, G., Siour, G., et al. Modelling of atmospheric concentrations of fungal spores: a 2-year simulation over France using CHIMERE.</w:t>
-      </w:r>
-      <w:r>
-        <w:t xml:space="preserve"> </w:t>
-      </w:r>
-      <w:r>
-        <w:rPr>
-          <w:iCs/>
-          <w:i/>
-        </w:rPr>
-        <w:t xml:space="preserve">Atmospheric Chemistry and Physics</w:t>
-      </w:r>
-      <w:r>
-        <w:t xml:space="preserve">, 2024.</w:t>
-      </w:r>
-    </w:p>
-    <w:p>
-      <w:pPr>
-        <w:numPr>
-          <w:ilvl w:val="0"/>
-          <w:numId w:val="1003"/>
-        </w:numPr>
-        <w:pStyle w:val="Compact"/>
-      </w:pPr>
-      <w:r>
-        <w:t xml:space="preserve">Barbosa, M.I., Roxo, H., Ribeiro, P., et al. Integrated PM, MOX and thermal sensing for monitoring bioaerosol dynamics in controlled indoor environments.</w:t>
-      </w:r>
-      <w:r>
-        <w:t xml:space="preserve"> </w:t>
-      </w:r>
-      <w:r>
-        <w:rPr>
-          <w:iCs/>
-          <w:i/>
-        </w:rPr>
-        <w:t xml:space="preserve">Sensors</w:t>
-      </w:r>
-      <w:r>
-        <w:t xml:space="preserve">, 2026.</w:t>
-      </w:r>
-    </w:p>
-    <w:p>
-      <w:pPr>
-        <w:numPr>
-          <w:ilvl w:val="0"/>
-          <w:numId w:val="1003"/>
-        </w:numPr>
-        <w:pStyle w:val="Compact"/>
-      </w:pPr>
-      <w:r>
-        <w:t xml:space="preserve">Hospodsky, D., Yamamoto, N., Nazaroff, W.W., et al. Characterizing airborne fungal and bacterial concentrations and emission rates in six occupied children's classrooms.</w:t>
-      </w:r>
-      <w:r>
-        <w:t xml:space="preserve"> </w:t>
-      </w:r>
-      <w:r>
-        <w:rPr>
-          <w:iCs/>
-          <w:i/>
-        </w:rPr>
-        <w:t xml:space="preserve">Indoor Air</w:t>
-      </w:r>
-      <w:r>
-        <w:t xml:space="preserve">, 2015.</w:t>
-      </w:r>
-    </w:p>
-    <w:p>
-      <w:pPr>
-        <w:numPr>
-          <w:ilvl w:val="0"/>
-          <w:numId w:val="1003"/>
-        </w:numPr>
-        <w:pStyle w:val="Compact"/>
-      </w:pPr>
-      <w:r>
-        <w:t xml:space="preserve">Salonen, H., Duchaine, C., Mazaheri, M., et al. Airborne culturable fungi in naturally ventilated primary school environments in a subtropical climate.</w:t>
-      </w:r>
-      <w:r>
-        <w:t xml:space="preserve"> </w:t>
-      </w:r>
-      <w:r>
-        <w:rPr>
-          <w:iCs/>
-          <w:i/>
-        </w:rPr>
-        <w:t xml:space="preserve">Atmospheric Environment</w:t>
-      </w:r>
-      <w:r>
-        <w:t xml:space="preserve">, 2015.</w:t>
-      </w:r>
-    </w:p>
-    <w:p>
-      <w:pPr>
-        <w:numPr>
-          <w:ilvl w:val="0"/>
-          <w:numId w:val="1003"/>
-        </w:numPr>
-        <w:pStyle w:val="Compact"/>
-      </w:pPr>
-      <w:r>
-        <w:t xml:space="preserve">Salonen, H., Duchaine, C., Mazaheri, M., et al. Airborne viable fungi in school environments in different climatic regions: a review.</w:t>
-      </w:r>
-      <w:r>
-        <w:t xml:space="preserve"> </w:t>
-      </w:r>
-      <w:r>
-        <w:rPr>
-          <w:iCs/>
-          <w:i/>
-        </w:rPr>
-        <w:t xml:space="preserve">Atmospheric Environment</w:t>
-      </w:r>
-      <w:r>
-        <w:t xml:space="preserve">, 2015.</w:t>
-      </w:r>
-    </w:p>
-    <w:p>
-      <w:pPr>
-        <w:numPr>
-          <w:ilvl w:val="0"/>
-          <w:numId w:val="1003"/>
-        </w:numPr>
-        <w:pStyle w:val="Compact"/>
-      </w:pPr>
-      <w:r>
-        <w:t xml:space="preserve">Ebner, M.R., Haselwandter, K., Frank, A. Indoor and outdoor incidence of airborne fungal allergens at low and high altitude alpine environments.</w:t>
-      </w:r>
-      <w:r>
-        <w:t xml:space="preserve"> </w:t>
-      </w:r>
-      <w:r>
-        <w:rPr>
-          <w:iCs/>
-          <w:i/>
-        </w:rPr>
-        <w:t xml:space="preserve">Mycological Research</w:t>
-      </w:r>
-      <w:r>
-        <w:t xml:space="preserve">, 1992.</w:t>
-      </w:r>
-    </w:p>
-    <w:p>
-      <w:pPr>
-        <w:numPr>
-          <w:ilvl w:val="0"/>
-          <w:numId w:val="1003"/>
-        </w:numPr>
-        <w:pStyle w:val="Compact"/>
-      </w:pPr>
-      <w:r>
-        <w:t xml:space="preserve">Warren, B.G., Graves, A., Barrett, A., et al. Comparing rapid molecular and culture methods for detecting fungal contamination in healthcare environments.</w:t>
-      </w:r>
-      <w:r>
-        <w:t xml:space="preserve"> </w:t>
-      </w:r>
-      <w:r>
-        <w:rPr>
-          <w:iCs/>
-          <w:i/>
-        </w:rPr>
-        <w:t xml:space="preserve">Infection Control and Hospital Epidemiology</w:t>
-      </w:r>
-      <w:r>
-        <w:t xml:space="preserve">, 2026.</w:t>
-      </w:r>
-    </w:p>
-    <w:p>
-      <w:pPr>
-        <w:numPr>
-          <w:ilvl w:val="0"/>
-          <w:numId w:val="1003"/>
-        </w:numPr>
-        <w:pStyle w:val="Compact"/>
-      </w:pPr>
-      <w:r>
-        <w:t xml:space="preserve">Goverde, M., Willrodt, J., Staerk, A. Evaluation of the recovery rate of different swabs for microbial environmental monitoring.</w:t>
-      </w:r>
-      <w:r>
-        <w:t xml:space="preserve"> </w:t>
-      </w:r>
-      <w:r>
-        <w:rPr>
-          <w:iCs/>
-          <w:i/>
-        </w:rPr>
-        <w:t xml:space="preserve">PDA Journal of Pharmaceutical Science and Technology</w:t>
-      </w:r>
-      <w:r>
-        <w:t xml:space="preserve">, 2017.</w:t>
-      </w:r>
-    </w:p>
-    <w:p>
-      <w:pPr>
-        <w:numPr>
-          <w:ilvl w:val="0"/>
-          <w:numId w:val="1003"/>
-        </w:numPr>
-        <w:pStyle w:val="Compact"/>
-      </w:pPr>
-      <w:r>
-        <w:t xml:space="preserve">Wei, Y., Lin, Y., Zhao, J., et al. Development of a TaqMan probe-based multiplex real-time PCR for the simultaneous detection of four clinically important filamentous fungi.</w:t>
-      </w:r>
-      <w:r>
-        <w:t xml:space="preserve"> </w:t>
-      </w:r>
-      <w:r>
-        <w:rPr>
-          <w:iCs/>
-          <w:i/>
-        </w:rPr>
-        <w:t xml:space="preserve">Microbiology Spectrum</w:t>
-      </w:r>
-      <w:r>
-        <w:t xml:space="preserve">, 2024.</w:t>
-      </w:r>
-    </w:p>
-    <w:p>
-      <w:pPr>
-        <w:numPr>
-          <w:ilvl w:val="0"/>
-          <w:numId w:val="1003"/>
-        </w:numPr>
-        <w:pStyle w:val="Compact"/>
-      </w:pPr>
-      <w:r>
-        <w:t xml:space="preserve">Pantoja, L.D.M., do Nascimento, R.F., de Araujo Nunes, A.B. Investigation of fungal volatile organic compounds in hospital air.</w:t>
-      </w:r>
-      <w:r>
-        <w:t xml:space="preserve"> </w:t>
-      </w:r>
-      <w:r>
-        <w:rPr>
-          <w:iCs/>
-          <w:i/>
-        </w:rPr>
-        <w:t xml:space="preserve">Atmospheric Pollution Research</w:t>
-      </w:r>
-      <w:r>
-        <w:t xml:space="preserve">, 2016.</w:t>
-      </w:r>
-    </w:p>
-    <w:p>
-      <w:pPr>
-        <w:numPr>
-          <w:ilvl w:val="0"/>
-          <w:numId w:val="1003"/>
-        </w:numPr>
-        <w:pStyle w:val="Compact"/>
-      </w:pPr>
-      <w:r>
-        <w:t xml:space="preserve">Xu, J. Fungal DNA barcoding.</w:t>
-      </w:r>
-      <w:r>
-        <w:t xml:space="preserve"> </w:t>
-      </w:r>
-      <w:r>
-        <w:rPr>
-          <w:iCs/>
-          <w:i/>
-        </w:rPr>
-        <w:t xml:space="preserve">Genome</w:t>
-      </w:r>
-      <w:r>
-        <w:t xml:space="preserve">, 2016.</w:t>
-      </w:r>
-    </w:p>
-    <w:p>
-      <w:pPr>
-        <w:numPr>
-          <w:ilvl w:val="0"/>
-          <w:numId w:val="1003"/>
-        </w:numPr>
-        <w:pStyle w:val="Compact"/>
-      </w:pPr>
-      <w:r>
-        <w:t xml:space="preserve">Porter, T.M., Golding, G.B. Are similarity-based or phylogeny-based methods more appropriate for classifying internal transcribed spacer (ITS) metagenomic amplicons?</w:t>
-      </w:r>
-      <w:r>
-        <w:t xml:space="preserve"> </w:t>
-      </w:r>
-      <w:r>
-        <w:rPr>
-          <w:iCs/>
-          <w:i/>
-        </w:rPr>
-        <w:t xml:space="preserve">New Phytologist</w:t>
-      </w:r>
-      <w:r>
-        <w:t xml:space="preserve">, 2011.</w:t>
-      </w:r>
-    </w:p>
-    <w:p>
-      <w:pPr>
-        <w:numPr>
-          <w:ilvl w:val="0"/>
-          <w:numId w:val="1003"/>
-        </w:numPr>
-        <w:pStyle w:val="Compact"/>
-      </w:pPr>
-      <w:r>
-        <w:t xml:space="preserve">Chen, Y.-C., Yu, K.-P., Shao, W.-C., et al. Novel mold-resistant building materials impregnated with thermally reduced nano-silver.</w:t>
-      </w:r>
-      <w:r>
-        <w:t xml:space="preserve"> </w:t>
-      </w:r>
-      <w:r>
-        <w:rPr>
-          <w:iCs/>
-          <w:i/>
-        </w:rPr>
-        <w:t xml:space="preserve">Indoor Air</w:t>
-      </w:r>
-      <w:r>
-        <w:t xml:space="preserve">, 2018.</w:t>
-      </w:r>
-    </w:p>
-    <w:p>
-      <w:pPr>
-        <w:numPr>
-          <w:ilvl w:val="0"/>
-          <w:numId w:val="1003"/>
-        </w:numPr>
-        <w:pStyle w:val="Compact"/>
-      </w:pPr>
-      <w:r>
-        <w:t xml:space="preserve">Abdel-Rahim, I.R., Nafady, N.A., Bagy, M.M.K., et al. Mitigating indoor air quality risks from Cladosporium sphaerospermum-induced biodeterioration of oil-based paints using silver and zinc oxide nanoparticles.</w:t>
-      </w:r>
-      <w:r>
-        <w:t xml:space="preserve"> </w:t>
-      </w:r>
-      <w:r>
-        <w:rPr>
-          <w:iCs/>
-          <w:i/>
-        </w:rPr>
-        <w:t xml:space="preserve">Aerobiologia</w:t>
-      </w:r>
-      <w:r>
-        <w:t xml:space="preserve">, 2026.</w:t>
-      </w:r>
-    </w:p>
-    <w:p>
-      <w:pPr>
-        <w:numPr>
-          <w:ilvl w:val="0"/>
-          <w:numId w:val="1003"/>
-        </w:numPr>
-        <w:pStyle w:val="Compact"/>
-      </w:pPr>
-      <w:r>
-        <w:t xml:space="preserve">Roberts, D.M., Thomas, J.E., Salmon, J.H., et al. Cold atmospheric plasma improves antifungal responsiveness of Aspergillus flavus and Fusarium keratoplasticum conidia and mycelia.</w:t>
-      </w:r>
-      <w:r>
-        <w:t xml:space="preserve"> </w:t>
-      </w:r>
-      <w:r>
-        <w:rPr>
-          <w:iCs/>
-          <w:i/>
-        </w:rPr>
-        <w:t xml:space="preserve">PLOS ONE</w:t>
-      </w:r>
-      <w:r>
-        <w:t xml:space="preserve">, 2025.</w:t>
-      </w:r>
-    </w:p>
-    <w:p>
-      <w:pPr>
-        <w:numPr>
-          <w:ilvl w:val="0"/>
-          <w:numId w:val="1003"/>
-        </w:numPr>
-        <w:pStyle w:val="Compact"/>
-      </w:pPr>
-      <w:r>
-        <w:t xml:space="preserve">Economic Planning Unit Sarawak. (2021).</w:t>
-      </w:r>
-      <w:r>
-        <w:t xml:space="preserve"> </w:t>
-      </w:r>
-      <w:r>
-        <w:rPr>
-          <w:iCs/>
-          <w:i/>
-        </w:rPr>
-        <w:t xml:space="preserve">Post COVID-19 Development Strategy 2030 (PCDS 2030)</w:t>
-      </w:r>
-      <w:r>
-        <w:t xml:space="preserve">. Sarawak Government. https://www.sarawak.gov.my/media/attachments/PCDS_Compressed_22_July_2021.pdf</w:t>
+        <w:t xml:space="preserve">Abdel-Rahim, I.R., Nafady, N.A., Bagy, M.M.K., et al. (2026) 'Mitigating indoor air quality risks from Cladosporium sphaerospermum-induced biodeterioration of oil-based paints using silver and zinc oxide nanoparticles', Aerobiologia. https://doi.org/10.1007/s10453-025-09895-5</w:t>
+      </w:r>
+    </w:p>
+    <w:p>
+      <w:pPr>
+        <w:pStyle w:val="BodyText"/>
+      </w:pPr>
+      <w:r>
+        <w:t xml:space="preserve">Alaidroos, A. and Mosly, I. (2023) 'Preventing mold growth and maintaining acceptable indoor air quality for educational buildings operating with high mechanical ventilation rates in hot and humid climates', Air Quality, Atmosphere and Health. https://doi.org/10.1007/s11869-022-01277-x</w:t>
+      </w:r>
+    </w:p>
+    <w:p>
+      <w:pPr>
+        <w:pStyle w:val="BodyText"/>
+      </w:pPr>
+      <w:r>
+        <w:t xml:space="preserve">Ara, M., Das, I.P. and Nayak, R. (2025) 'Impact of indoor fungal growth on building materials in coastal Karnataka: a comparative study of traditional and modern construction', Journal of the Institution of Engineers (India): Series A, 106, pp. 1255-1267. https://doi.org/10.1007/s40030-025-00931-8</w:t>
+      </w:r>
+    </w:p>
+    <w:p>
+      <w:pPr>
+        <w:pStyle w:val="BodyText"/>
+      </w:pPr>
+      <w:r>
+        <w:t xml:space="preserve">Barbosa, M.I., Roxo, H., Ribeiro, P., et al. (2026) 'Integrated PM, MOX and thermal sensing for monitoring bioaerosol dynamics in controlled indoor environments', Sensors. https://doi.org/10.3390/s26113521</w:t>
+      </w:r>
+    </w:p>
+    <w:p>
+      <w:pPr>
+        <w:pStyle w:val="BodyText"/>
+      </w:pPr>
+      <w:r>
+        <w:t xml:space="preserve">Chaudhuri, A., Bhattacharyya, S., Chaudhuri, P., et al. (2020) 'In vitro deterioration study of concrete and marble by Aspergillus tamarii', Journal of Building Engineering. https://doi.org/10.1016/j.jobe.2020.101774</w:t>
+      </w:r>
+    </w:p>
+    <w:p>
+      <w:pPr>
+        <w:pStyle w:val="BodyText"/>
+      </w:pPr>
+      <w:r>
+        <w:t xml:space="preserve">Chen, Y.-C., Yu, K.-P., Shao, W.-C., et al. (2018) 'Novel mold-resistant building materials impregnated with thermally reduced nano-silver', Indoor Air. https://doi.org/10.1111/ina.12443</w:t>
+      </w:r>
+    </w:p>
+    <w:p>
+      <w:pPr>
+        <w:pStyle w:val="BodyText"/>
+      </w:pPr>
+      <w:r>
+        <w:t xml:space="preserve">Dedesko, S. and Siegel, J.A. (2015) 'Moisture parameters and fungal communities associated with gypsum drywall in buildings', Microbiome, 3, 71. https://doi.org/10.1186/s40168-015-0137-y</w:t>
+      </w:r>
+    </w:p>
+    <w:p>
+      <w:pPr>
+        <w:pStyle w:val="BodyText"/>
+      </w:pPr>
+      <w:r>
+        <w:t xml:space="preserve">Ebner, M.R., Haselwandter, K. and Frank, A. (1992) 'Indoor and outdoor incidence of airborne fungal allergens at low and high altitude alpine environments', Mycological Research. https://doi.org/10.1016/S0953-7562(09)80924-6</w:t>
+      </w:r>
+    </w:p>
+    <w:p>
+      <w:pPr>
+        <w:pStyle w:val="BodyText"/>
+      </w:pPr>
+      <w:r>
+        <w:t xml:space="preserve">Economic Planning Unit Sarawak (2021) Post COVID-19 Development Strategy 2030 (PCDS 2030). Kuching: Sarawak Government. Available at: https://www.sarawak.gov.my/media/attachments/PCDS_Compressed_22_July_2021.pdf</w:t>
+      </w:r>
+    </w:p>
+    <w:p>
+      <w:pPr>
+        <w:pStyle w:val="BodyText"/>
+      </w:pPr>
+      <w:r>
+        <w:t xml:space="preserve">Ejdys, E. and Biedunkiewicz, A. (2011) 'Fungi of the genus Penicillium in school buildings', Polish Journal of Environmental Studies, 20(2), pp. 333-338.</w:t>
+      </w:r>
+    </w:p>
+    <w:p>
+      <w:pPr>
+        <w:pStyle w:val="BodyText"/>
+      </w:pPr>
+      <w:r>
+        <w:t xml:space="preserve">Fomina, M., Podgorsky, V.S., Olishevska, S.V., et al. (2007) 'Fungal deterioration of barrier concrete used in nuclear waste disposal', Geomicrobiology Journal. https://doi.org/10.1080/01490450701672240</w:t>
+      </w:r>
+    </w:p>
+    <w:p>
+      <w:pPr>
+        <w:pStyle w:val="BodyText"/>
+      </w:pPr>
+      <w:r>
+        <w:t xml:space="preserve">Franceschini, P.B., Schweiker, M. and Neves, L.O. (2024) 'Predictive modelling of multi-domain factors on window, door, and fan status in naturally ventilated school classrooms', Building and Environment. https://doi.org/10.2139/ssrn.4765516</w:t>
+      </w:r>
+    </w:p>
+    <w:p>
+      <w:pPr>
+        <w:pStyle w:val="BodyText"/>
+      </w:pPr>
+      <w:r>
+        <w:t xml:space="preserve">Fu, T., Lai, Q., Chen, X., et al. (2025) 'Fungal colonization on building materials under reduced barometric pressure: a laboratory study', Case Studies in Construction Materials. https://doi.org/10.1016/j.cscm.2025.e05367</w:t>
+      </w:r>
+    </w:p>
+    <w:p>
+      <w:pPr>
+        <w:pStyle w:val="BodyText"/>
+      </w:pPr>
+      <w:r>
+        <w:t xml:space="preserve">Gaylarde, C.C. and Morton, L.H.G. (1997) 'The importance of biofilms in microbial deterioration of constructional materials', Revista de Microbiologia.</w:t>
+      </w:r>
+    </w:p>
+    <w:p>
+      <w:pPr>
+        <w:pStyle w:val="BodyText"/>
+      </w:pPr>
+      <w:r>
+        <w:t xml:space="preserve">Goverde, M., Willrodt, J. and Staerk, A. (2017) 'Evaluation of the recovery rate of different swabs for microbial environmental monitoring', PDA Journal of Pharmaceutical Science and Technology. https://doi.org/10.5731/pdajpst.2016.006783</w:t>
+      </w:r>
+    </w:p>
+    <w:p>
+      <w:pPr>
+        <w:pStyle w:val="BodyText"/>
+      </w:pPr>
+      <w:r>
+        <w:t xml:space="preserve">Hospodsky, D., Yamamoto, N., Nazaroff, W.W., et al. (2015) 'Characterizing airborne fungal and bacterial concentrations and emission rates in six occupied children's classrooms', Indoor Air. https://doi.org/10.1111/ina.12172</w:t>
+      </w:r>
+    </w:p>
+    <w:p>
+      <w:pPr>
+        <w:pStyle w:val="BodyText"/>
+      </w:pPr>
+      <w:r>
+        <w:t xml:space="preserve">Idowu, A., Aigbavboa, C., Oke, A., Ogundipe, K. and Stephen, S. (2026) 'Integrating passive design principles in the retrofitting of educational buildings', Architectural Engineering and Design Management, pp. 1-14. https://doi.org/10.1080/17452007.2026.2694389</w:t>
+      </w:r>
+    </w:p>
+    <w:p>
+      <w:pPr>
+        <w:pStyle w:val="BodyText"/>
+      </w:pPr>
+      <w:r>
+        <w:t xml:space="preserve">Ito, K. and Mizuno, Y. (2009) 'Measurement of hyphal growth rate under various humidity conditions and development of fungal growth model', Journal of Environmental Engineering (Transactions of AIJ), 74(636), pp. 193-199. https://doi.org/10.3130/aije.74.193</w:t>
+      </w:r>
+    </w:p>
+    <w:p>
+      <w:pPr>
+        <w:pStyle w:val="BodyText"/>
+      </w:pPr>
+      <w:r>
+        <w:t xml:space="preserve">Jain, A., Bhadauria, S., Kumar, V. and Chauhan, R.S. (2009) 'Biodeterioration of sandstone under the influence of different humidity levels in laboratory conditions', Building and Environment, 44(6), pp. 1276-1284. https://doi.org/10.1016/j.buildenv.2008.09.019</w:t>
+      </w:r>
+    </w:p>
+    <w:p>
+      <w:pPr>
+        <w:pStyle w:val="BodyText"/>
+      </w:pPr>
+      <w:r>
+        <w:t xml:space="preserve">Jiang, L., Pettitt, T.R., Buenfeld, N. and Smith, S.R. (2022) 'A critical review of the physiological, ecological, physical and chemical factors influencing the microbial degradation of concrete by fungi', Building and Environment. https://doi.org/10.1016/j.buildenv.2022.108925</w:t>
+      </w:r>
+    </w:p>
+    <w:p>
+      <w:pPr>
+        <w:pStyle w:val="BodyText"/>
+      </w:pPr>
+      <w:r>
+        <w:t xml:space="preserve">Kosel, J., Tomsic, N., Mlakar, M., et al. (2024) 'Mycological evaluation of the visible deterioration symptoms on the Spectatius family marble tomb (Slovenia)', Heritage Science, 12, 405. https://doi.org/10.1186/s40494-024-01527-4</w:t>
+      </w:r>
+    </w:p>
+    <w:p>
+      <w:pPr>
+        <w:pStyle w:val="BodyText"/>
+      </w:pPr>
+      <w:r>
+        <w:t xml:space="preserve">Liao, C.-M., Luo, W.-C., Chen, S.-C., et al. (2004) 'Temporal and seasonal variations of size-dependent airborne fungi indoor and outdoor relationships for a wind-induced naturally ventilated airspace', Atmospheric Environment. https://doi.org/10.1016/j.atmosenv.2004.04.029</w:t>
+      </w:r>
+    </w:p>
+    <w:p>
+      <w:pPr>
+        <w:pStyle w:val="BodyText"/>
+      </w:pPr>
+      <w:r>
+        <w:t xml:space="preserve">Lim, T.W., Tongtuam, Y. and Ongsavangchai, N. (2026) 'Optimizing window-to-floor ratio and glazing for daylight and cooling in tropical educational buildings: a case study in Chiang Mai, Thailand', Journal of Daylighting, 13(1), pp. 44-56. https://doi.org/10.15627/jd.2026.3</w:t>
+      </w:r>
+    </w:p>
+    <w:p>
+      <w:pPr>
+        <w:pStyle w:val="BodyText"/>
+      </w:pPr>
+      <w:r>
+        <w:t xml:space="preserve">Lotun, S.S., Gooroochurn, M. and Lollchund, R.M. (2026) 'Assessment of combinations of passive measures for buildings using artificial intelligence and machine learning', Journal of Building Engineering. https://doi.org/10.1016/j.jobe.2026.115776</w:t>
+      </w:r>
+    </w:p>
+    <w:p>
+      <w:pPr>
+        <w:pStyle w:val="BodyText"/>
+      </w:pPr>
+      <w:r>
+        <w:t xml:space="preserve">Medrela-Kuder, E. (2003) 'Seasonal variations in the occurrence of culturable airborne fungi in outdoor and indoor air in Cracow', International Biodeterioration and Biodegradation. https://doi.org/10.1016/S0964-8305(02)00167-1</w:t>
+      </w:r>
+    </w:p>
+    <w:p>
+      <w:pPr>
+        <w:pStyle w:val="BodyText"/>
+      </w:pPr>
+      <w:r>
+        <w:t xml:space="preserve">Norback, D., Hashim, J.H., Cai, G.H., Hashim, Z., Ali, F., et al. (2016) 'Rhinitis, ocular, throat and dermal symptoms, headache and tiredness among students in schools from Johor Bahru, Malaysia: associations with fungal DNA and mycotoxins in classroom dust', PLOS ONE, 11(2), e0147996. https://doi.org/10.1371/journal.pone.0147996</w:t>
+      </w:r>
+    </w:p>
+    <w:p>
+      <w:pPr>
+        <w:pStyle w:val="BodyText"/>
+      </w:pPr>
+      <w:r>
+        <w:t xml:space="preserve">Omar Hamdan, A.S., Ahmad, N.I., Mohd Tap, R., et al. (2026) 'Fungus assessment in indoor environment of old buildings in Peninsular Malaysia', Aerobiologia, 42, 14. https://doi.org/10.1007/s10453-026-09903-2</w:t>
+      </w:r>
+    </w:p>
+    <w:p>
+      <w:pPr>
+        <w:pStyle w:val="BodyText"/>
+      </w:pPr>
+      <w:r>
+        <w:t xml:space="preserve">Pantoja, L.D.M., do Nascimento, R.F. and de Araujo Nunes, A.B. (2016) 'Investigation of fungal volatile organic compounds in hospital air', Atmospheric Pollution Research. https://doi.org/10.1016/j.apr.2016.02.011</w:t>
+      </w:r>
+    </w:p>
+    <w:p>
+      <w:pPr>
+        <w:pStyle w:val="BodyText"/>
+      </w:pPr>
+      <w:r>
+        <w:t xml:space="preserve">Porter, T.M. and Golding, G.B. (2011) 'Are similarity-based or phylogeny-based methods more appropriate for classifying internal transcribed spacer (ITS) metagenomic amplicons?', New Phytologist. https://doi.org/10.1111/j.1469-8137.2011.03838.x</w:t>
+      </w:r>
+    </w:p>
+    <w:p>
+      <w:pPr>
+        <w:pStyle w:val="BodyText"/>
+      </w:pPr>
+      <w:r>
+        <w:t xml:space="preserve">Purnama, M.S.S., Sangadji, F.A. and Nugraha, D. (2025) 'Optimizing facade design for energy and daylight performance in tropical educational buildings', IOP Conference Series: Earth and Environmental Science. https://doi.org/10.1088/1755-1315/1564/1/012059</w:t>
+      </w:r>
+    </w:p>
+    <w:p>
+      <w:pPr>
+        <w:pStyle w:val="BodyText"/>
+      </w:pPr>
+      <w:r>
+        <w:t xml:space="preserve">Ramos, R. (2023) 'Relationship between particulate matter (PM10), meteorological parameters, and the concentration of fungal spores in the atmosphere of San Martin Square in Lima', Ecologia Aplicada.</w:t>
+      </w:r>
+    </w:p>
+    <w:p>
+      <w:pPr>
+        <w:pStyle w:val="BodyText"/>
+      </w:pPr>
+      <w:r>
+        <w:t xml:space="preserve">Roberts, D.M., Thomas, J.E., Salmon, J.H., et al. (2025) 'Cold atmospheric plasma improves antifungal responsiveness of Aspergillus flavus and Fusarium keratoplasticum conidia and mycelia', PLOS ONE. https://doi.org/10.1371/journal.pone.0326940</w:t>
+      </w:r>
+    </w:p>
+    <w:p>
+      <w:pPr>
+        <w:pStyle w:val="BodyText"/>
+      </w:pPr>
+      <w:r>
+        <w:t xml:space="preserve">Salonen, H., Duchaine, C., Mazaheri, M., et al. (2015a) 'Airborne culturable fungi in naturally ventilated primary school environments in a subtropical climate', Atmospheric Environment. https://doi.org/10.1016/j.atmosenv.2014.07.052</w:t>
+      </w:r>
+    </w:p>
+    <w:p>
+      <w:pPr>
+        <w:pStyle w:val="BodyText"/>
+      </w:pPr>
+      <w:r>
+        <w:t xml:space="preserve">Salonen, H., Duchaine, C., Mazaheri, M., et al. (2015b) 'Airborne viable fungi in school environments in different climatic regions: a review', Atmospheric Environment. https://doi.org/10.1016/j.atmosenv.2015.01.012</w:t>
+      </w:r>
+    </w:p>
+    <w:p>
+      <w:pPr>
+        <w:pStyle w:val="BodyText"/>
+      </w:pPr>
+      <w:r>
+        <w:t xml:space="preserve">Scott, G. (1994) 'Moisture, ventilation and mould growth', Studies in Conservation, 39(Suppl. 2), pp. 149-153.</w:t>
+      </w:r>
+    </w:p>
+    <w:p>
+      <w:pPr>
+        <w:pStyle w:val="BodyText"/>
+      </w:pPr>
+      <w:r>
+        <w:t xml:space="preserve">Segers, F.J.J., Meijer, M., Houbraken, J., et al. (2015) 'Xerotolerant Cladosporium sphaerospermum are predominant on indoor surfaces compared to other Cladosporium species', PLoS ONE. https://doi.org/10.1371/journal.pone.0145415</w:t>
+      </w:r>
+    </w:p>
+    <w:p>
+      <w:pPr>
+        <w:pStyle w:val="BodyText"/>
+      </w:pPr>
+      <w:r>
+        <w:t xml:space="preserve">Shibuta, T. and Teramoto, A. (2026) 'Fundamental study on the effect of moisture adsorption properties of building materials on fungal growth', Journal of Structural and Construction Engineering (Transactions of AIJ), 91(839), pp. 75-81. https://doi.org/10.3130/aijs.91.75</w:t>
+      </w:r>
+    </w:p>
+    <w:p>
+      <w:pPr>
+        <w:pStyle w:val="BodyText"/>
+      </w:pPr>
+      <w:r>
+        <w:t xml:space="preserve">Singh, J. (2000) 'Fungal problems in historic buildings', Journal of Architectural Conservation, 6(1), pp. 17-37. https://doi.org/10.1080/13556207.2000.10785259</w:t>
+      </w:r>
+    </w:p>
+    <w:p>
+      <w:pPr>
+        <w:pStyle w:val="BodyText"/>
+      </w:pPr>
+      <w:r>
+        <w:t xml:space="preserve">Tanney, J.B., Visagie, C.M., Yilmaz, N. and Seifert, K.A. (2017) 'Aspergillus subgenus Polypaecilum from the built environment', Studies in Mycology. https://doi.org/10.1016/j.simyco.2017.11.001</w:t>
+      </w:r>
+    </w:p>
+    <w:p>
+      <w:pPr>
+        <w:pStyle w:val="BodyText"/>
+      </w:pPr>
+      <w:r>
+        <w:t xml:space="preserve">Vida, M., Foret, G., Siour, G., et al. (2024) 'Modelling of atmospheric concentrations of fungal spores: a 2-year simulation over France using CHIMERE', Atmospheric Chemistry and Physics. https://doi.org/10.5194/egusphere-2024-698</w:t>
+      </w:r>
+    </w:p>
+    <w:p>
+      <w:pPr>
+        <w:pStyle w:val="BodyText"/>
+      </w:pPr>
+      <w:r>
+        <w:t xml:space="preserve">Wang, S.-Y., Chen, L., Cao, J.-J., et al. (2026) 'Colletotrichum magnum species complex: emerging pathogens in tropical and subtropical regions', Phytopathology. https://doi.org/10.1094/PHYTO-08-25-0278-RVW</w:t>
+      </w:r>
+    </w:p>
+    <w:p>
+      <w:pPr>
+        <w:pStyle w:val="BodyText"/>
+      </w:pPr>
+      <w:r>
+        <w:t xml:space="preserve">Warren, B.G., Graves, A., Barrett, A., et al. (2026) 'Comparing rapid molecular and culture methods for detecting fungal contamination in healthcare environments', Infection Control and Hospital Epidemiology. https://doi.org/10.1017/ice.2026.10491</w:t>
+      </w:r>
+    </w:p>
+    <w:p>
+      <w:pPr>
+        <w:pStyle w:val="BodyText"/>
+      </w:pPr>
+      <w:r>
+        <w:t xml:space="preserve">Wei, Y., Lin, Y., Zhao, J., et al. (2024) 'Development of a TaqMan probe-based multiplex real-time PCR for the simultaneous detection of four clinically important filamentous fungi', Microbiology Spectrum. https://doi.org/10.1128/spectrum.00634-24</w:t>
+      </w:r>
+    </w:p>
+    <w:p>
+      <w:pPr>
+        <w:pStyle w:val="BodyText"/>
+      </w:pPr>
+      <w:r>
+        <w:t xml:space="preserve">Xu, J. (2016) 'Fungal DNA barcoding', Genome. https://doi.org/10.1139/gen-2016-0046</w:t>
       </w:r>
     </w:p>
     <w:bookmarkEnd w:id="46"/>
@@ -5365,7 +4711,7 @@
       <w:pPr>
         <w:numPr>
           <w:ilvl w:val="0"/>
-          <w:numId w:val="1004"/>
+          <w:numId w:val="1002"/>
         </w:numPr>
         <w:pStyle w:val="Compact"/>
       </w:pPr>
@@ -5377,7 +4723,7 @@
       <w:pPr>
         <w:numPr>
           <w:ilvl w:val="0"/>
-          <w:numId w:val="1004"/>
+          <w:numId w:val="1002"/>
         </w:numPr>
         <w:pStyle w:val="Compact"/>
       </w:pPr>
@@ -5389,7 +4735,7 @@
       <w:pPr>
         <w:numPr>
           <w:ilvl w:val="0"/>
-          <w:numId w:val="1004"/>
+          <w:numId w:val="1002"/>
         </w:numPr>
         <w:pStyle w:val="Compact"/>
       </w:pPr>
@@ -5407,7 +4753,7 @@
       <w:pPr>
         <w:numPr>
           <w:ilvl w:val="0"/>
-          <w:numId w:val="1004"/>
+          <w:numId w:val="1002"/>
         </w:numPr>
         <w:pStyle w:val="Compact"/>
       </w:pPr>
@@ -5419,7 +4765,7 @@
       <w:pPr>
         <w:numPr>
           <w:ilvl w:val="0"/>
-          <w:numId w:val="1004"/>
+          <w:numId w:val="1002"/>
         </w:numPr>
         <w:pStyle w:val="Compact"/>
       </w:pPr>
@@ -5659,66 +5005,6 @@
     </w:lvlOverride>
   </w:num>
   <w:num w:numId="1002">
-    <w:abstractNumId w:val="99411"/>
-    <w:lvlOverride w:ilvl="0">
-      <w:startOverride w:val="1"/>
-    </w:lvlOverride>
-    <w:lvlOverride w:ilvl="1">
-      <w:startOverride w:val="1"/>
-    </w:lvlOverride>
-    <w:lvlOverride w:ilvl="2">
-      <w:startOverride w:val="1"/>
-    </w:lvlOverride>
-    <w:lvlOverride w:ilvl="3">
-      <w:startOverride w:val="1"/>
-    </w:lvlOverride>
-    <w:lvlOverride w:ilvl="4">
-      <w:startOverride w:val="1"/>
-    </w:lvlOverride>
-    <w:lvlOverride w:ilvl="5">
-      <w:startOverride w:val="1"/>
-    </w:lvlOverride>
-    <w:lvlOverride w:ilvl="6">
-      <w:startOverride w:val="1"/>
-    </w:lvlOverride>
-    <w:lvlOverride w:ilvl="7">
-      <w:startOverride w:val="1"/>
-    </w:lvlOverride>
-    <w:lvlOverride w:ilvl="8">
-      <w:startOverride w:val="1"/>
-    </w:lvlOverride>
-  </w:num>
-  <w:num w:numId="1003">
-    <w:abstractNumId w:val="99411"/>
-    <w:lvlOverride w:ilvl="0">
-      <w:startOverride w:val="1"/>
-    </w:lvlOverride>
-    <w:lvlOverride w:ilvl="1">
-      <w:startOverride w:val="1"/>
-    </w:lvlOverride>
-    <w:lvlOverride w:ilvl="2">
-      <w:startOverride w:val="1"/>
-    </w:lvlOverride>
-    <w:lvlOverride w:ilvl="3">
-      <w:startOverride w:val="1"/>
-    </w:lvlOverride>
-    <w:lvlOverride w:ilvl="4">
-      <w:startOverride w:val="1"/>
-    </w:lvlOverride>
-    <w:lvlOverride w:ilvl="5">
-      <w:startOverride w:val="1"/>
-    </w:lvlOverride>
-    <w:lvlOverride w:ilvl="6">
-      <w:startOverride w:val="1"/>
-    </w:lvlOverride>
-    <w:lvlOverride w:ilvl="7">
-      <w:startOverride w:val="1"/>
-    </w:lvlOverride>
-    <w:lvlOverride w:ilvl="8">
-      <w:startOverride w:val="1"/>
-    </w:lvlOverride>
-  </w:num>
-  <w:num w:numId="1004">
     <w:abstractNumId w:val="99411"/>
     <w:lvlOverride w:ilvl="0">
       <w:startOverride w:val="1"/>

</xml_diff>

<commit_message>
Present the budget as a justified vot table
Reformats the budget in the vot / category / justification / Y1 / Y2 / total
layout, with each cell giving the Y1 and Y2 breakdown, the arithmetic behind
every figure, and the guideline section the ceiling comes from. Adds a
landscape PDF of the table as a fifth attachment, since the portal does not
accept tables; the per-vot prose is retained for the URCMS text fields.

Year splits within VOT 26000 and VOT 29000 are now itemised to the round they
serve (R1-R3 in Year 1, R4-R6 in Year 2), so sequencing reads 32 reactions in
Year 1 and 48 in Year 2 against the 80 budgeted.

Co-Authored-By: Claude Opus 5 <noreply@anthropic.com>
Claude-Session: https://claude.ai/code/session_01KBqJ3GE1Jd6oZGRqBX87od
</commit_message>
<xml_diff>
--- a/docs/UTS-Matching-Grant-Proposal-Cycle1-2027.docx
+++ b/docs/UTS-Matching-Grant-Proposal-Cycle1-2027.docx
@@ -3804,13 +3804,13 @@
       </w:r>
     </w:p>
     <w:bookmarkEnd w:id="46"/>
-    <w:bookmarkStart w:id="54" w:name="appendix-a.-budget-by-vot"/>
+    <w:bookmarkStart w:id="55" w:name="appendix-a.-proposed-budget"/>
     <w:p>
       <w:pPr>
         <w:pStyle w:val="Heading2"/>
       </w:pPr>
       <w:r>
-        <w:t xml:space="preserve">Appendix A. Budget by vot</w:t>
+        <w:t xml:space="preserve">Appendix A. Proposed budget</w:t>
       </w:r>
     </w:p>
     <w:p>
@@ -3818,6 +3818,842 @@
         <w:pStyle w:val="FirstParagraph"/>
       </w:pPr>
       <w:r>
+        <w:t xml:space="preserve">Total requested RM25,000.00 over twenty-four months. Year 1 runs from March 2027 to February 2028</w:t>
+      </w:r>
+      <w:r>
+        <w:t xml:space="preserve"> </w:t>
+      </w:r>
+      <w:r>
+        <w:t xml:space="preserve">and Year 2 from March 2028 to February 2029. Guideline section references are to Section 7 of the</w:t>
+      </w:r>
+      <w:r>
+        <w:t xml:space="preserve"> </w:t>
+      </w:r>
+      <w:r>
+        <w:t xml:space="preserve">internal research grant guidelines. This table is supplied as a PDF attachment, since the portal</w:t>
+      </w:r>
+      <w:r>
+        <w:t xml:space="preserve"> </w:t>
+      </w:r>
+      <w:r>
+        <w:t xml:space="preserve">does not accept tables; the per-vot prose that follows is written for direct entry into the</w:t>
+      </w:r>
+      <w:r>
+        <w:t xml:space="preserve"> </w:t>
+      </w:r>
+      <w:r>
+        <w:t xml:space="preserve">corresponding URCMS fields. All supplier unit costs are planning figures pending current</w:t>
+      </w:r>
+      <w:r>
+        <w:t xml:space="preserve"> </w:t>
+      </w:r>
+      <w:r>
+        <w:t xml:space="preserve">quotations, with the exception of the Sanger sequencing rate, which is quoted.</w:t>
+      </w:r>
+    </w:p>
+    <w:tbl>
+      <w:tblPr>
+        <w:tblStyle w:val="Table"/>
+        <w:tblW w:type="pct" w:w="5000"/>
+        <w:tblLook w:firstRow="1" w:lastRow="0" w:firstColumn="0" w:lastColumn="0" w:noHBand="0" w:noVBand="0" w:val="0020"/>
+        <w:jc w:val="start"/>
+      </w:tblPr>
+      <w:tblGrid>
+        <w:gridCol w:w="1320"/>
+        <w:gridCol w:w="1320"/>
+        <w:gridCol w:w="1320"/>
+        <w:gridCol w:w="1320"/>
+        <w:gridCol w:w="1320"/>
+        <w:gridCol w:w="1320"/>
+      </w:tblGrid>
+      <w:tr>
+        <w:trPr>
+          <w:tblHeader w:val="true"/>
+        </w:trPr>
+        <w:tc>
+          <w:tcPr/>
+          <w:p>
+            <w:pPr>
+              <w:pStyle w:val="Compact"/>
+              <w:jc w:val="left"/>
+            </w:pPr>
+            <w:r>
+              <w:t xml:space="preserve">VOT</w:t>
+            </w:r>
+          </w:p>
+        </w:tc>
+        <w:tc>
+          <w:tcPr/>
+          <w:p>
+            <w:pPr>
+              <w:pStyle w:val="Compact"/>
+              <w:jc w:val="left"/>
+            </w:pPr>
+            <w:r>
+              <w:t xml:space="preserve">Category</w:t>
+            </w:r>
+          </w:p>
+        </w:tc>
+        <w:tc>
+          <w:tcPr/>
+          <w:p>
+            <w:pPr>
+              <w:pStyle w:val="Compact"/>
+              <w:jc w:val="left"/>
+            </w:pPr>
+            <w:r>
+              <w:t xml:space="preserve">Justification and detailed breakdown (Year 1 and Year 2)</w:t>
+            </w:r>
+          </w:p>
+        </w:tc>
+        <w:tc>
+          <w:tcPr/>
+          <w:p>
+            <w:pPr>
+              <w:pStyle w:val="Compact"/>
+              <w:jc w:val="left"/>
+            </w:pPr>
+            <w:r>
+              <w:t xml:space="preserve">Year 1 (RM)</w:t>
+            </w:r>
+          </w:p>
+        </w:tc>
+        <w:tc>
+          <w:tcPr/>
+          <w:p>
+            <w:pPr>
+              <w:pStyle w:val="Compact"/>
+              <w:jc w:val="left"/>
+            </w:pPr>
+            <w:r>
+              <w:t xml:space="preserve">Year 2 (RM)</w:t>
+            </w:r>
+          </w:p>
+        </w:tc>
+        <w:tc>
+          <w:tcPr/>
+          <w:p>
+            <w:pPr>
+              <w:pStyle w:val="Compact"/>
+              <w:jc w:val="left"/>
+            </w:pPr>
+            <w:r>
+              <w:t xml:space="preserve">Total (RM)</w:t>
+            </w:r>
+          </w:p>
+        </w:tc>
+      </w:tr>
+      <w:tr>
+        <w:tc>
+          <w:tcPr/>
+          <w:p>
+            <w:pPr>
+              <w:pStyle w:val="Compact"/>
+              <w:jc w:val="left"/>
+            </w:pPr>
+            <w:r>
+              <w:t xml:space="preserve">11000</w:t>
+            </w:r>
+          </w:p>
+        </w:tc>
+        <w:tc>
+          <w:tcPr/>
+          <w:p>
+            <w:pPr>
+              <w:pStyle w:val="Compact"/>
+              <w:jc w:val="left"/>
+            </w:pPr>
+            <w:r>
+              <w:t xml:space="preserve">Salary and Wages</w:t>
+            </w:r>
+          </w:p>
+        </w:tc>
+        <w:tc>
+          <w:tcPr/>
+          <w:p>
+            <w:pPr>
+              <w:pStyle w:val="Compact"/>
+              <w:jc w:val="left"/>
+            </w:pPr>
+            <w:r>
+              <w:rPr>
+                <w:bCs/>
+                <w:b/>
+              </w:rPr>
+              <w:t xml:space="preserve">Y1 (RM1,500):</w:t>
+            </w:r>
+            <w:r>
+              <w:t xml:space="preserve"> </w:t>
+            </w:r>
+            <w:r>
+              <w:t xml:space="preserve">Undergraduate research assistant allowance at RM7.00 per hour, maximum 4 hours per day (RM28.00 per day), approximately 18 working days per active month, giving RM500.00 per month for 3 active months. Timed to sampling rounds R1 to R3 and to monitoring node assembly.</w:t>
+            </w:r>
+            <w:r>
+              <w:t xml:space="preserve"> </w:t>
+            </w:r>
+            <w:r>
+              <w:rPr>
+                <w:bCs/>
+                <w:b/>
+              </w:rPr>
+              <w:t xml:space="preserve">Y2 (RM1,500):</w:t>
+            </w:r>
+            <w:r>
+              <w:t xml:space="preserve"> </w:t>
+            </w:r>
+            <w:r>
+              <w:t xml:space="preserve">Same rate and engagement, 3 active months, for rounds R4 to R6, plate inoculation and cold-chain packing. Each round requires swabbing 36 fixed points across four buildings and four facade orientations, on-site inoculation of agar plates, recording of covariates and algal cover, and packing for transfer to SRDC-TROPI: approximately two field days plus one preparation day per round. The allocation purchases approximately 107 assistant-days. Rate and total comply with the RM3,000 ceiling for temporary and contract personnel, Guideline Section 7(a).</w:t>
+            </w:r>
+          </w:p>
+        </w:tc>
+        <w:tc>
+          <w:tcPr/>
+          <w:p>
+            <w:pPr>
+              <w:pStyle w:val="Compact"/>
+              <w:jc w:val="left"/>
+            </w:pPr>
+            <w:r>
+              <w:t xml:space="preserve">1,500.00</w:t>
+            </w:r>
+          </w:p>
+        </w:tc>
+        <w:tc>
+          <w:tcPr/>
+          <w:p>
+            <w:pPr>
+              <w:pStyle w:val="Compact"/>
+              <w:jc w:val="left"/>
+            </w:pPr>
+            <w:r>
+              <w:t xml:space="preserve">1,500.00</w:t>
+            </w:r>
+          </w:p>
+        </w:tc>
+        <w:tc>
+          <w:tcPr/>
+          <w:p>
+            <w:pPr>
+              <w:pStyle w:val="Compact"/>
+              <w:jc w:val="left"/>
+            </w:pPr>
+            <w:r>
+              <w:t xml:space="preserve">3,000.00</w:t>
+            </w:r>
+          </w:p>
+        </w:tc>
+      </w:tr>
+      <w:tr>
+        <w:tc>
+          <w:tcPr/>
+          <w:p>
+            <w:pPr>
+              <w:pStyle w:val="Compact"/>
+              <w:jc w:val="left"/>
+            </w:pPr>
+            <w:r>
+              <w:t xml:space="preserve">21000</w:t>
+            </w:r>
+          </w:p>
+        </w:tc>
+        <w:tc>
+          <w:tcPr/>
+          <w:p>
+            <w:pPr>
+              <w:pStyle w:val="Compact"/>
+              <w:jc w:val="left"/>
+            </w:pPr>
+            <w:r>
+              <w:t xml:space="preserve">Travel and Transport</w:t>
+            </w:r>
+          </w:p>
+        </w:tc>
+        <w:tc>
+          <w:tcPr/>
+          <w:p>
+            <w:pPr>
+              <w:pStyle w:val="Compact"/>
+              <w:jc w:val="left"/>
+            </w:pPr>
+            <w:r>
+              <w:rPr>
+                <w:bCs/>
+                <w:b/>
+              </w:rPr>
+              <w:t xml:space="preserve">Y1 (RM850):</w:t>
+            </w:r>
+            <w:r>
+              <w:t xml:space="preserve"> </w:t>
+            </w:r>
+            <w:r>
+              <w:t xml:space="preserve">Cold-chain transport of biological materials between UTS Sibu and SRDC-TROPI, Kota Samarahan, approximately 300 km. Two inbound consignments of prepared sterile swabs and media and three return consignments of inoculated plates, being 5 legs at RM150.00 = RM750.00. Inbound delivery of sensor modules, enclosures and field consumables, 2 deliveries at RM50.00 = RM100.00.</w:t>
+            </w:r>
+            <w:r>
+              <w:t xml:space="preserve"> </w:t>
+            </w:r>
+            <w:r>
+              <w:rPr>
+                <w:bCs/>
+                <w:b/>
+              </w:rPr>
+              <w:t xml:space="preserve">Y2 (RM2,150):</w:t>
+            </w:r>
+            <w:r>
+              <w:t xml:space="preserve"> </w:t>
+            </w:r>
+            <w:r>
+              <w:t xml:space="preserve">One inbound and three return consignments, 4 legs at RM150.00 = RM600.00; one delivery at RM50.00; and attendance at one indexed national conference to present project findings (RM1,500.00) comprising return airfare RM700.00, accommodation RM250.00 per night for 3 nights = RM750.00, and ground transport RM50.00. Media are batched across rounds on the inbound leg, while returns follow each round individually because the cultures are live and require sealed triple packaging under cold-chain conditions, so ordinary post is not usable. Conference registration is claimed separately under VOT 29000 as the guideline directs. Subsistence is claimed only for paper presentation. Local Sibu fieldwork travel is excluded, as all four sampled buildings are on the UTS campus. Within the RM3,000 ceiling for Science, Engineering and Technology, Guideline Section 7(b).</w:t>
+            </w:r>
+          </w:p>
+        </w:tc>
+        <w:tc>
+          <w:tcPr/>
+          <w:p>
+            <w:pPr>
+              <w:pStyle w:val="Compact"/>
+              <w:jc w:val="left"/>
+            </w:pPr>
+            <w:r>
+              <w:t xml:space="preserve">850.00</w:t>
+            </w:r>
+          </w:p>
+        </w:tc>
+        <w:tc>
+          <w:tcPr/>
+          <w:p>
+            <w:pPr>
+              <w:pStyle w:val="Compact"/>
+              <w:jc w:val="left"/>
+            </w:pPr>
+            <w:r>
+              <w:t xml:space="preserve">2,150.00</w:t>
+            </w:r>
+          </w:p>
+        </w:tc>
+        <w:tc>
+          <w:tcPr/>
+          <w:p>
+            <w:pPr>
+              <w:pStyle w:val="Compact"/>
+              <w:jc w:val="left"/>
+            </w:pPr>
+            <w:r>
+              <w:t xml:space="preserve">3,000.00</w:t>
+            </w:r>
+          </w:p>
+        </w:tc>
+      </w:tr>
+      <w:tr>
+        <w:tc>
+          <w:tcPr/>
+          <w:p>
+            <w:pPr>
+              <w:pStyle w:val="Compact"/>
+              <w:jc w:val="left"/>
+            </w:pPr>
+            <w:r>
+              <w:t xml:space="preserve">24000</w:t>
+            </w:r>
+          </w:p>
+        </w:tc>
+        <w:tc>
+          <w:tcPr/>
+          <w:p>
+            <w:pPr>
+              <w:pStyle w:val="Compact"/>
+              <w:jc w:val="left"/>
+            </w:pPr>
+            <w:r>
+              <w:t xml:space="preserve">Rental</w:t>
+            </w:r>
+          </w:p>
+        </w:tc>
+        <w:tc>
+          <w:tcPr/>
+          <w:p>
+            <w:pPr>
+              <w:pStyle w:val="Compact"/>
+              <w:jc w:val="left"/>
+            </w:pPr>
+            <w:r>
+              <w:rPr>
+                <w:bCs/>
+                <w:b/>
+              </w:rPr>
+              <w:t xml:space="preserve">Y1 (RM1,200):</w:t>
+            </w:r>
+            <w:r>
+              <w:t xml:space="preserve"> </w:t>
+            </w:r>
+            <w:r>
+              <w:t xml:space="preserve">Rental of a reference-grade air quality analyser for co-location calibration of the low-cost monitoring nodes under Sibu field conditions, RM600.00 per week for 2 weeks: one pre-deployment calibration campaign and one post-installation verification campaign. Low-cost optical particulate sensors are subject to hygroscopic bias at the high relative humidity prevailing on this campus, and metal oxide gas sensors drift; co-located reference measurement is what allows a correction to be derived and the reported values to be defensible. Rental rather than purchase is appropriate because the instrument is required for two short campaigns and not continuously. Placed in VOT 24000 rather than VOT 35000 in line with Guideline Section 7(c), which covers rental of equipment directly involved in the research.</w:t>
+            </w:r>
+            <w:r>
+              <w:t xml:space="preserve"> </w:t>
+            </w:r>
+            <w:r>
+              <w:rPr>
+                <w:bCs/>
+                <w:b/>
+              </w:rPr>
+              <w:t xml:space="preserve">Y2 (RM0):</w:t>
+            </w:r>
+            <w:r>
+              <w:t xml:space="preserve"> </w:t>
+            </w:r>
+            <w:r>
+              <w:t xml:space="preserve">No further rental required.</w:t>
+            </w:r>
+          </w:p>
+        </w:tc>
+        <w:tc>
+          <w:tcPr/>
+          <w:p>
+            <w:pPr>
+              <w:pStyle w:val="Compact"/>
+              <w:jc w:val="left"/>
+            </w:pPr>
+            <w:r>
+              <w:t xml:space="preserve">1,200.00</w:t>
+            </w:r>
+          </w:p>
+        </w:tc>
+        <w:tc>
+          <w:tcPr/>
+          <w:p>
+            <w:pPr>
+              <w:pStyle w:val="Compact"/>
+              <w:jc w:val="left"/>
+            </w:pPr>
+            <w:r>
+              <w:t xml:space="preserve">0.00</w:t>
+            </w:r>
+          </w:p>
+        </w:tc>
+        <w:tc>
+          <w:tcPr/>
+          <w:p>
+            <w:pPr>
+              <w:pStyle w:val="Compact"/>
+              <w:jc w:val="left"/>
+            </w:pPr>
+            <w:r>
+              <w:t xml:space="preserve">1,200.00</w:t>
+            </w:r>
+          </w:p>
+        </w:tc>
+      </w:tr>
+      <w:tr>
+        <w:tc>
+          <w:tcPr/>
+          <w:p>
+            <w:pPr>
+              <w:pStyle w:val="Compact"/>
+              <w:jc w:val="left"/>
+            </w:pPr>
+            <w:r>
+              <w:t xml:space="preserve">26000</w:t>
+            </w:r>
+          </w:p>
+        </w:tc>
+        <w:tc>
+          <w:tcPr/>
+          <w:p>
+            <w:pPr>
+              <w:pStyle w:val="Compact"/>
+              <w:jc w:val="left"/>
+            </w:pPr>
+            <w:r>
+              <w:t xml:space="preserve">Research Materials and Supplies</w:t>
+            </w:r>
+          </w:p>
+        </w:tc>
+        <w:tc>
+          <w:tcPr/>
+          <w:p>
+            <w:pPr>
+              <w:pStyle w:val="Compact"/>
+              <w:jc w:val="left"/>
+            </w:pPr>
+            <w:r>
+              <w:rPr>
+                <w:bCs/>
+                <w:b/>
+              </w:rPr>
+              <w:t xml:space="preserve">Y1 (RM9,300):</w:t>
+            </w:r>
+            <w:r>
+              <w:t xml:space="preserve"> </w:t>
+            </w:r>
+            <w:r>
+              <w:t xml:space="preserve">Monitoring node development (RM8,040) for four campus nodes plus spares, in a configuration already validated in deployed service by the co-researcher under existing work, which removes design risk: four multi-parameter air-quality modules measuring CO2, PM2.5, PM10, temperature and humidity (RM650.00 each, RM2,600.00); eight discrete temperature and humidity sensors as a redundant per-node reference (RM25.00 each, RM200.00); four metal oxide gas sensor sets for CO, CO2, O3, NH3 and NOx (RM280.00 per set, RM1,120.00); six microcontroller boards with breakout (RM90.00 each, RM540.00); one LoRa gateway and transmitter module set (RM900.00); four IP65 ventilated weather-resistant enclosures with mounting hardware (RM220.00 each, RM880.00); four sets of power supply, solar panel, battery, cabling and connectors (RM300.00 per set, RM1,200.00); and PCB fabrication, prototyping and soldering consumables (RM600.00). Field sampling consumables (RM1,260) comprising ten stainless sterile sampling templates of 10 cm by 10 cm (RM600.00), two cold-chain transport coolers with gel packs (RM360.00), and PPE and field consumables for rounds R1 to R3 (RM300.00).</w:t>
+            </w:r>
+            <w:r>
+              <w:t xml:space="preserve"> </w:t>
+            </w:r>
+            <w:r>
+              <w:rPr>
+                <w:bCs/>
+                <w:b/>
+              </w:rPr>
+              <w:t xml:space="preserve">Y2 (RM2,500):</w:t>
+            </w:r>
+            <w:r>
+              <w:t xml:space="preserve"> </w:t>
+            </w:r>
+            <w:r>
+              <w:t xml:space="preserve">Two further cold-chain coolers (RM360.00); PPE and field consumables for rounds R4 to R6 (RM400.00); ethanol, sample bags, labels and markers (RM540.00); and a culture consumable contingency (RM1,200.00) for SDA and PDA media, sterile swabs and Petri dishes. SRDC-TROPI supplies culture media and swabs from its matched research expenditure, so the contingency covers only the control plates the contamination-control protocol requires, repeat sampling after a failed batch, and any delay in partner supply; it does not duplicate the partner's provision. Sulphur dioxide sensing is excluded, as it bears on no mechanism this project tests. Guideline Section 7(d).</w:t>
+            </w:r>
+          </w:p>
+        </w:tc>
+        <w:tc>
+          <w:tcPr/>
+          <w:p>
+            <w:pPr>
+              <w:pStyle w:val="Compact"/>
+              <w:jc w:val="left"/>
+            </w:pPr>
+            <w:r>
+              <w:t xml:space="preserve">9,300.00</w:t>
+            </w:r>
+          </w:p>
+        </w:tc>
+        <w:tc>
+          <w:tcPr/>
+          <w:p>
+            <w:pPr>
+              <w:pStyle w:val="Compact"/>
+              <w:jc w:val="left"/>
+            </w:pPr>
+            <w:r>
+              <w:t xml:space="preserve">2,500.00</w:t>
+            </w:r>
+          </w:p>
+        </w:tc>
+        <w:tc>
+          <w:tcPr/>
+          <w:p>
+            <w:pPr>
+              <w:pStyle w:val="Compact"/>
+              <w:jc w:val="left"/>
+            </w:pPr>
+            <w:r>
+              <w:t xml:space="preserve">11,800.00</w:t>
+            </w:r>
+          </w:p>
+        </w:tc>
+      </w:tr>
+      <w:tr>
+        <w:tc>
+          <w:tcPr/>
+          <w:p>
+            <w:pPr>
+              <w:pStyle w:val="Compact"/>
+              <w:jc w:val="left"/>
+            </w:pPr>
+            <w:r>
+              <w:t xml:space="preserve">29000</w:t>
+            </w:r>
+          </w:p>
+        </w:tc>
+        <w:tc>
+          <w:tcPr/>
+          <w:p>
+            <w:pPr>
+              <w:pStyle w:val="Compact"/>
+              <w:jc w:val="left"/>
+            </w:pPr>
+            <w:r>
+              <w:t xml:space="preserve">Professional Services</w:t>
+            </w:r>
+          </w:p>
+        </w:tc>
+        <w:tc>
+          <w:tcPr/>
+          <w:p>
+            <w:pPr>
+              <w:pStyle w:val="Compact"/>
+              <w:jc w:val="left"/>
+            </w:pPr>
+            <w:r>
+              <w:rPr>
+                <w:bCs/>
+                <w:b/>
+              </w:rPr>
+              <w:t xml:space="preserve">Y1 (RM1,300):</w:t>
+            </w:r>
+            <w:r>
+              <w:t xml:space="preserve"> </w:t>
+            </w:r>
+            <w:r>
+              <w:t xml:space="preserve">Sanger sequencing of ITS amplicons, 32 reactions at the quoted rate of RM25.00 per reaction (RM800.00), for isolates recovered from rounds R1 to R3, inclusive of sample quality control by gel electrophoresis and one free re-run where a result is unsatisfactory; SORAS application and Sarawak Biodiversity Council permit fees covering the project, its scope, its personnel and the participating institutions (RM500.00).</w:t>
+            </w:r>
+            <w:r>
+              <w:t xml:space="preserve"> </w:t>
+            </w:r>
+            <w:r>
+              <w:rPr>
+                <w:bCs/>
+                <w:b/>
+              </w:rPr>
+              <w:t xml:space="preserve">Y2 (RM1,700):</w:t>
+            </w:r>
+            <w:r>
+              <w:t xml:space="preserve"> </w:t>
+            </w:r>
+            <w:r>
+              <w:t xml:space="preserve">Sanger sequencing, 48 reactions at RM25.00 (RM1,200.00), for isolates from rounds R4 to R6; registration fee for one indexed national conference (RM500.00). The 80 reactions cover a curated set of up to 60 isolates by single-pass read, with bidirectional reads on the subset whose assignment is ambiguous. DNA extraction and PCR amplification are performed by SRDC-TROPI as an in-kind matched contribution, so only the sequencing service is charged to this grant. Research may not be conducted in Sarawak without a valid permit, so the permit fee is a precondition of all fieldwork. Journal article processing charges are excluded and journals without such charges are targeted for both indexed outputs. Within the RM3,000 ceiling for Science, Engineering and Technology, Guideline Section 7(f).</w:t>
+            </w:r>
+          </w:p>
+        </w:tc>
+        <w:tc>
+          <w:tcPr/>
+          <w:p>
+            <w:pPr>
+              <w:pStyle w:val="Compact"/>
+              <w:jc w:val="left"/>
+            </w:pPr>
+            <w:r>
+              <w:t xml:space="preserve">1,300.00</w:t>
+            </w:r>
+          </w:p>
+        </w:tc>
+        <w:tc>
+          <w:tcPr/>
+          <w:p>
+            <w:pPr>
+              <w:pStyle w:val="Compact"/>
+              <w:jc w:val="left"/>
+            </w:pPr>
+            <w:r>
+              <w:t xml:space="preserve">1,700.00</w:t>
+            </w:r>
+          </w:p>
+        </w:tc>
+        <w:tc>
+          <w:tcPr/>
+          <w:p>
+            <w:pPr>
+              <w:pStyle w:val="Compact"/>
+              <w:jc w:val="left"/>
+            </w:pPr>
+            <w:r>
+              <w:t xml:space="preserve">3,000.00</w:t>
+            </w:r>
+          </w:p>
+        </w:tc>
+      </w:tr>
+      <w:tr>
+        <w:tc>
+          <w:tcPr/>
+          <w:p>
+            <w:pPr>
+              <w:pStyle w:val="Compact"/>
+              <w:jc w:val="left"/>
+            </w:pPr>
+            <w:r>
+              <w:t xml:space="preserve">35000</w:t>
+            </w:r>
+          </w:p>
+        </w:tc>
+        <w:tc>
+          <w:tcPr/>
+          <w:p>
+            <w:pPr>
+              <w:pStyle w:val="Compact"/>
+              <w:jc w:val="left"/>
+            </w:pPr>
+            <w:r>
+              <w:t xml:space="preserve">Accessories and Small Appliances</w:t>
+            </w:r>
+          </w:p>
+        </w:tc>
+        <w:tc>
+          <w:tcPr/>
+          <w:p>
+            <w:pPr>
+              <w:pStyle w:val="Compact"/>
+              <w:jc w:val="left"/>
+            </w:pPr>
+            <w:r>
+              <w:rPr>
+                <w:bCs/>
+                <w:b/>
+              </w:rPr>
+              <w:t xml:space="preserve">Y1 (RM3,000):</w:t>
+            </w:r>
+            <w:r>
+              <w:t xml:space="preserve"> </w:t>
+            </w:r>
+            <w:r>
+              <w:t xml:space="preserve">Outdoor-rated display panel presenting live readings and the current campus air-quality classification at a high-traffic campus location (RM2,200.00); weatherproof display housing, mounting bracket and installation hardware (RM800.00). The display is a deliverable of the collaboration agreement between UTS and SRDC and is the pathway by which the monitoring becomes visible to building occupants and supports institutional environmental reporting. Cloud hosting and the data plan are excluded, as the guideline does not support utilities or subscriptions under VOT 26000 and VOT 23000 is restricted to USRRG and UFSRRG; these are provided as a UTS in-kind contribution through institutional IT infrastructure. Procured following UTS Procurement Procedure; assets remain UTS property and are entered in the project asset inventory. Total is 12 per cent of the grant, within the 40 per cent ceiling, Guideline Section 7(g).</w:t>
+            </w:r>
+            <w:r>
+              <w:t xml:space="preserve"> </w:t>
+            </w:r>
+            <w:r>
+              <w:rPr>
+                <w:bCs/>
+                <w:b/>
+              </w:rPr>
+              <w:t xml:space="preserve">Y2 (RM0):</w:t>
+            </w:r>
+            <w:r>
+              <w:t xml:space="preserve"> </w:t>
+            </w:r>
+            <w:r>
+              <w:t xml:space="preserve">No accessories required.</w:t>
+            </w:r>
+          </w:p>
+        </w:tc>
+        <w:tc>
+          <w:tcPr/>
+          <w:p>
+            <w:pPr>
+              <w:pStyle w:val="Compact"/>
+              <w:jc w:val="left"/>
+            </w:pPr>
+            <w:r>
+              <w:t xml:space="preserve">3,000.00</w:t>
+            </w:r>
+          </w:p>
+        </w:tc>
+        <w:tc>
+          <w:tcPr/>
+          <w:p>
+            <w:pPr>
+              <w:pStyle w:val="Compact"/>
+              <w:jc w:val="left"/>
+            </w:pPr>
+            <w:r>
+              <w:t xml:space="preserve">0.00</w:t>
+            </w:r>
+          </w:p>
+        </w:tc>
+        <w:tc>
+          <w:tcPr/>
+          <w:p>
+            <w:pPr>
+              <w:pStyle w:val="Compact"/>
+              <w:jc w:val="left"/>
+            </w:pPr>
+            <w:r>
+              <w:t xml:space="preserve">3,000.00</w:t>
+            </w:r>
+          </w:p>
+        </w:tc>
+      </w:tr>
+      <w:tr>
+        <w:tc>
+          <w:tcPr/>
+          <w:p>
+            <w:pPr>
+              <w:pStyle w:val="Compact"/>
+            </w:pPr>
+          </w:p>
+        </w:tc>
+        <w:tc>
+          <w:tcPr/>
+          <w:p>
+            <w:pPr>
+              <w:pStyle w:val="Compact"/>
+              <w:jc w:val="left"/>
+            </w:pPr>
+            <w:r>
+              <w:rPr>
+                <w:bCs/>
+                <w:b/>
+              </w:rPr>
+              <w:t xml:space="preserve">TOTAL</w:t>
+            </w:r>
+          </w:p>
+        </w:tc>
+        <w:tc>
+          <w:tcPr/>
+          <w:p>
+            <w:pPr>
+              <w:pStyle w:val="Compact"/>
+            </w:pPr>
+          </w:p>
+        </w:tc>
+        <w:tc>
+          <w:tcPr/>
+          <w:p>
+            <w:pPr>
+              <w:pStyle w:val="Compact"/>
+              <w:jc w:val="left"/>
+            </w:pPr>
+            <w:r>
+              <w:rPr>
+                <w:bCs/>
+                <w:b/>
+              </w:rPr>
+              <w:t xml:space="preserve">17,150.00</w:t>
+            </w:r>
+          </w:p>
+        </w:tc>
+        <w:tc>
+          <w:tcPr/>
+          <w:p>
+            <w:pPr>
+              <w:pStyle w:val="Compact"/>
+              <w:jc w:val="left"/>
+            </w:pPr>
+            <w:r>
+              <w:rPr>
+                <w:bCs/>
+                <w:b/>
+              </w:rPr>
+              <w:t xml:space="preserve">7,850.00</w:t>
+            </w:r>
+          </w:p>
+        </w:tc>
+        <w:tc>
+          <w:tcPr/>
+          <w:p>
+            <w:pPr>
+              <w:pStyle w:val="Compact"/>
+              <w:jc w:val="left"/>
+            </w:pPr>
+            <w:r>
+              <w:rPr>
+                <w:bCs/>
+                <w:b/>
+              </w:rPr>
+              <w:t xml:space="preserve">25,000.00</w:t>
+            </w:r>
+          </w:p>
+        </w:tc>
+      </w:tr>
+    </w:tbl>
+    <w:p>
+      <w:pPr>
+        <w:pStyle w:val="BodyText"/>
+      </w:pPr>
+      <w:r>
+        <w:t xml:space="preserve">VOT 23000 and VOT 28000 are not used. Virement may be exercised only once during the project and</w:t>
+      </w:r>
+      <w:r>
+        <w:t xml:space="preserve"> </w:t>
+      </w:r>
+      <w:r>
+        <w:t xml:space="preserve">requires the approval of the Director, Centre for Research and Development.</w:t>
+      </w:r>
+    </w:p>
+    <w:bookmarkStart w:id="47" w:name="per-vot-text-for-the-urcms-fields"/>
+    <w:p>
+      <w:pPr>
+        <w:pStyle w:val="Heading3"/>
+      </w:pPr>
+      <w:r>
+        <w:t xml:space="preserve">Per-vot text for the URCMS fields</w:t>
+      </w:r>
+    </w:p>
+    <w:p>
+      <w:pPr>
+        <w:pStyle w:val="FirstParagraph"/>
+      </w:pPr>
+      <w:r>
         <w:t xml:space="preserve">Total requested: RM25,000.00 over twenty-four months. Year 1 runs from March 2027 to February</w:t>
       </w:r>
       <w:r>
@@ -3839,7 +4675,8 @@
         <w:t xml:space="preserve">pending current quotations.</w:t>
       </w:r>
     </w:p>
-    <w:bookmarkStart w:id="47" w:name="vot-11000-salary-and-wages-rm3000.00"/>
+    <w:bookmarkEnd w:id="47"/>
+    <w:bookmarkStart w:id="48" w:name="vot-11000-salary-and-wages-rm3000.00"/>
     <w:p>
       <w:pPr>
         <w:pStyle w:val="Heading3"/>
@@ -3942,8 +4779,8 @@
         <w:t xml:space="preserve">labour. The appointment also delivers the human capital development outcome stated in Section 12.</w:t>
       </w:r>
     </w:p>
-    <w:bookmarkEnd w:id="47"/>
-    <w:bookmarkStart w:id="48" w:name="X995b5d93ece41605f8ff4d28a50840c72241a07"/>
+    <w:bookmarkEnd w:id="48"/>
+    <w:bookmarkStart w:id="49" w:name="X995b5d93ece41605f8ff4d28a50840c72241a07"/>
     <w:p>
       <w:pPr>
         <w:pStyle w:val="Heading3"/>
@@ -4086,8 +4923,8 @@
         <w:t xml:space="preserve">Technology area.</w:t>
       </w:r>
     </w:p>
-    <w:bookmarkEnd w:id="48"/>
-    <w:bookmarkStart w:id="49" w:name="vot-24000-rental-rm1200.00"/>
+    <w:bookmarkEnd w:id="49"/>
+    <w:bookmarkStart w:id="50" w:name="vot-24000-rental-rm1200.00"/>
     <w:p>
       <w:pPr>
         <w:pStyle w:val="Heading3"/>
@@ -4160,8 +4997,8 @@
         <w:t xml:space="preserve">than VOT 35000 in line with the guideline treatment of rental.</w:t>
       </w:r>
     </w:p>
-    <w:bookmarkEnd w:id="49"/>
-    <w:bookmarkStart w:id="50" w:name="X43b8ecee40a7f438a1f33d9f7b15da9146d357d"/>
+    <w:bookmarkEnd w:id="50"/>
+    <w:bookmarkStart w:id="51" w:name="X43b8ecee40a7f438a1f33d9f7b15da9146d357d"/>
     <w:p>
       <w:pPr>
         <w:pStyle w:val="Heading3"/>
@@ -4378,8 +5215,8 @@
         <w:t xml:space="preserve">included, since it bears on no mechanism this project tests.</w:t>
       </w:r>
     </w:p>
-    <w:bookmarkEnd w:id="50"/>
-    <w:bookmarkStart w:id="51" w:name="X31b2661c92e641d5e3c643f4838926bb030a109"/>
+    <w:bookmarkEnd w:id="51"/>
+    <w:bookmarkStart w:id="52" w:name="X31b2661c92e641d5e3c643f4838926bb030a109"/>
     <w:p>
       <w:pPr>
         <w:pStyle w:val="Heading3"/>
@@ -4534,8 +5371,8 @@
         <w:t xml:space="preserve">targeted for both indexed outputs.</w:t>
       </w:r>
     </w:p>
-    <w:bookmarkEnd w:id="51"/>
-    <w:bookmarkStart w:id="52" w:name="X4014a6979348b1af5c67ee7b5643372ac84c4bf"/>
+    <w:bookmarkEnd w:id="52"/>
+    <w:bookmarkStart w:id="53" w:name="X4014a6979348b1af5c67ee7b5643372ac84c4bf"/>
     <w:p>
       <w:pPr>
         <w:pStyle w:val="Heading3"/>
@@ -4602,8 +5439,8 @@
         <w:t xml:space="preserve">and is entered in the project asset inventory.</w:t>
       </w:r>
     </w:p>
-    <w:bookmarkEnd w:id="52"/>
-    <w:bookmarkStart w:id="53" w:name="compliance-summary"/>
+    <w:bookmarkEnd w:id="53"/>
+    <w:bookmarkStart w:id="54" w:name="compliance-summary"/>
     <w:p>
       <w:pPr>
         <w:pStyle w:val="Heading3"/>
@@ -4682,9 +5519,9 @@
         <w:t xml:space="preserve">Year 1 totals RM17,150.00 and Year 2 totals RM7,850.00, giving RM25,000.00 in all.</w:t>
       </w:r>
     </w:p>
-    <w:bookmarkEnd w:id="53"/>
     <w:bookmarkEnd w:id="54"/>
-    <w:bookmarkStart w:id="55" w:name="appendix-b.-attachments"/>
+    <w:bookmarkEnd w:id="55"/>
+    <w:bookmarkStart w:id="56" w:name="appendix-b.-attachments"/>
     <w:p>
       <w:pPr>
         <w:pStyle w:val="Heading2"/>
@@ -4779,7 +5616,7 @@
         <w:t xml:space="preserve">records the matched research expenditure.</w:t>
       </w:r>
     </w:p>
-    <w:bookmarkEnd w:id="55"/>
+    <w:bookmarkEnd w:id="56"/>
     <w:sectPr/>
   </w:body>
 </w:document>

</xml_diff>

<commit_message>
Shorten budget justifications to match the reference format
Each vot cell now gives the Y1 and Y2 itemisation with amounts in brackets,
followed by one short parenthetical note, in place of the explanatory prose.
Justifications cut from roughly 150-300 words to 59-180, with VOT 26000 the
longest because it carries the node bill of materials.

Reasoning that belongs in the methodology, such as the hygroscopic bias
rationale and the cold-chain packaging requirement, is removed from the budget
and left where it already appears in Section 11.

Co-Authored-By: Claude Opus 5 <noreply@anthropic.com>
Claude-Session: https://claude.ai/code/session_01KBqJ3GE1Jd6oZGRqBX87od
</commit_message>
<xml_diff>
--- a/docs/UTS-Matching-Grant-Proposal-Cycle1-2027.docx
+++ b/docs/UTS-Matching-Grant-Proposal-Cycle1-2027.docx
@@ -3980,13 +3980,13 @@
                 <w:bCs/>
                 <w:b/>
               </w:rPr>
-              <w:t xml:space="preserve">Y1 (RM1,500):</w:t>
+              <w:t xml:space="preserve">Y1 (RM 1,500):</w:t>
             </w:r>
             <w:r>
               <w:t xml:space="preserve"> </w:t>
             </w:r>
             <w:r>
-              <w:t xml:space="preserve">Undergraduate research assistant allowance at RM7.00 per hour, maximum 4 hours per day (RM28.00 per day), approximately 18 working days per active month, giving RM500.00 per month for 3 active months. Timed to sampling rounds R1 to R3 and to monitoring node assembly.</w:t>
+              <w:t xml:space="preserve">Undergraduate research assistant allowance (RM 7.00/hour x 4 hours/day x approx. 18 days = RM 500.00/month x 3 active months) for sampling rounds R1 to R3 and monitoring node assembly.</w:t>
             </w:r>
             <w:r>
               <w:t xml:space="preserve"> </w:t>
@@ -3996,13 +3996,13 @@
                 <w:bCs/>
                 <w:b/>
               </w:rPr>
-              <w:t xml:space="preserve">Y2 (RM1,500):</w:t>
+              <w:t xml:space="preserve">Y2 (RM 1,500):</w:t>
             </w:r>
             <w:r>
               <w:t xml:space="preserve"> </w:t>
             </w:r>
             <w:r>
-              <w:t xml:space="preserve">Same rate and engagement, 3 active months, for rounds R4 to R6, plate inoculation and cold-chain packing. Each round requires swabbing 36 fixed points across four buildings and four facade orientations, on-site inoculation of agar plates, recording of covariates and algal cover, and packing for transfer to SRDC-TROPI: approximately two field days plus one preparation day per round. The allocation purchases approximately 107 assistant-days. Rate and total comply with the RM3,000 ceiling for temporary and contract personnel, Guideline Section 7(a).</w:t>
+              <w:t xml:space="preserve">RA allowance (RM 500.00/month x 3 active months) for rounds R4 to R6, plate inoculation and cold-chain packing. Rate complies with Guideline Section 7(a); total within the RM 3,000 ceiling.</w:t>
             </w:r>
           </w:p>
         </w:tc>
@@ -4080,13 +4080,13 @@
                 <w:bCs/>
                 <w:b/>
               </w:rPr>
-              <w:t xml:space="preserve">Y1 (RM850):</w:t>
+              <w:t xml:space="preserve">Y1 (RM 850):</w:t>
             </w:r>
             <w:r>
               <w:t xml:space="preserve"> </w:t>
             </w:r>
             <w:r>
-              <w:t xml:space="preserve">Cold-chain transport of biological materials between UTS Sibu and SRDC-TROPI, Kota Samarahan, approximately 300 km. Two inbound consignments of prepared sterile swabs and media and three return consignments of inoculated plates, being 5 legs at RM150.00 = RM750.00. Inbound delivery of sensor modules, enclosures and field consumables, 2 deliveries at RM50.00 = RM100.00.</w:t>
+              <w:t xml:space="preserve">Cold-chain transport of swabs, media and inoculated plates between UTS Sibu and SRDC-TROPI, Kota Samarahan (5 legs x RM 150.00 = RM 750.00); inbound delivery of sensor modules and field consumables (2 x RM 50.00 = RM 100.00).</w:t>
             </w:r>
             <w:r>
               <w:t xml:space="preserve"> </w:t>
@@ -4096,13 +4096,13 @@
                 <w:bCs/>
                 <w:b/>
               </w:rPr>
-              <w:t xml:space="preserve">Y2 (RM2,150):</w:t>
+              <w:t xml:space="preserve">Y2 (RM 2,150):</w:t>
             </w:r>
             <w:r>
               <w:t xml:space="preserve"> </w:t>
             </w:r>
             <w:r>
-              <w:t xml:space="preserve">One inbound and three return consignments, 4 legs at RM150.00 = RM600.00; one delivery at RM50.00; and attendance at one indexed national conference to present project findings (RM1,500.00) comprising return airfare RM700.00, accommodation RM250.00 per night for 3 nights = RM750.00, and ground transport RM50.00. Media are batched across rounds on the inbound leg, while returns follow each round individually because the cultures are live and require sealed triple packaging under cold-chain conditions, so ordinary post is not usable. Conference registration is claimed separately under VOT 29000 as the guideline directs. Subsistence is claimed only for paper presentation. Local Sibu fieldwork travel is excluded, as all four sampled buildings are on the UTS campus. Within the RM3,000 ceiling for Science, Engineering and Technology, Guideline Section 7(b).</w:t>
+              <w:t xml:space="preserve">Cold-chain transport (4 legs x RM 150.00 = RM 600.00); delivery (RM 50.00); attendance at one national conference to present project findings (RM 1,500.00 covering return airfare RM 700.00, accommodation RM 250.00/night x 3 nights, ground transport RM 50.00). (Note: Conference registration fee is claimed under VOT 29000. Local Sibu fieldwork travel excluded, as all four sampled buildings are on campus. Within RM 3,000 SET ceiling, Guideline Section 7(b).)</w:t>
             </w:r>
           </w:p>
         </w:tc>
@@ -4180,13 +4180,13 @@
                 <w:bCs/>
                 <w:b/>
               </w:rPr>
-              <w:t xml:space="preserve">Y1 (RM1,200):</w:t>
+              <w:t xml:space="preserve">Y1 (RM 1,200):</w:t>
             </w:r>
             <w:r>
               <w:t xml:space="preserve"> </w:t>
             </w:r>
             <w:r>
-              <w:t xml:space="preserve">Rental of a reference-grade air quality analyser for co-location calibration of the low-cost monitoring nodes under Sibu field conditions, RM600.00 per week for 2 weeks: one pre-deployment calibration campaign and one post-installation verification campaign. Low-cost optical particulate sensors are subject to hygroscopic bias at the high relative humidity prevailing on this campus, and metal oxide gas sensors drift; co-located reference measurement is what allows a correction to be derived and the reported values to be defensible. Rental rather than purchase is appropriate because the instrument is required for two short campaigns and not continuously. Placed in VOT 24000 rather than VOT 35000 in line with Guideline Section 7(c), which covers rental of equipment directly involved in the research.</w:t>
+              <w:t xml:space="preserve">Rental of a reference-grade air quality analyser for co-location calibration of the monitoring nodes (RM 600.00/week x 2 weeks): one pre-deployment campaign and one post-installation verification.</w:t>
             </w:r>
             <w:r>
               <w:t xml:space="preserve"> </w:t>
@@ -4196,13 +4196,13 @@
                 <w:bCs/>
                 <w:b/>
               </w:rPr>
-              <w:t xml:space="preserve">Y2 (RM0):</w:t>
+              <w:t xml:space="preserve">Y2 (RM 0):</w:t>
             </w:r>
             <w:r>
               <w:t xml:space="preserve"> </w:t>
             </w:r>
             <w:r>
-              <w:t xml:space="preserve">No further rental required.</w:t>
+              <w:t xml:space="preserve">No further rental required. (Note: Rental rather than purchase, as the instrument is required for two short campaigns only. Placed in VOT 24000 per Guideline Section 7(c).)</w:t>
             </w:r>
           </w:p>
         </w:tc>
@@ -4280,13 +4280,13 @@
                 <w:bCs/>
                 <w:b/>
               </w:rPr>
-              <w:t xml:space="preserve">Y1 (RM9,300):</w:t>
+              <w:t xml:space="preserve">Y1 (RM 9,300):</w:t>
             </w:r>
             <w:r>
               <w:t xml:space="preserve"> </w:t>
             </w:r>
             <w:r>
-              <w:t xml:space="preserve">Monitoring node development (RM8,040) for four campus nodes plus spares, in a configuration already validated in deployed service by the co-researcher under existing work, which removes design risk: four multi-parameter air-quality modules measuring CO2, PM2.5, PM10, temperature and humidity (RM650.00 each, RM2,600.00); eight discrete temperature and humidity sensors as a redundant per-node reference (RM25.00 each, RM200.00); four metal oxide gas sensor sets for CO, CO2, O3, NH3 and NOx (RM280.00 per set, RM1,120.00); six microcontroller boards with breakout (RM90.00 each, RM540.00); one LoRa gateway and transmitter module set (RM900.00); four IP65 ventilated weather-resistant enclosures with mounting hardware (RM220.00 each, RM880.00); four sets of power supply, solar panel, battery, cabling and connectors (RM300.00 per set, RM1,200.00); and PCB fabrication, prototyping and soldering consumables (RM600.00). Field sampling consumables (RM1,260) comprising ten stainless sterile sampling templates of 10 cm by 10 cm (RM600.00), two cold-chain transport coolers with gel packs (RM360.00), and PPE and field consumables for rounds R1 to R3 (RM300.00).</w:t>
+              <w:t xml:space="preserve">Monitoring node components for four campus nodes plus spares (RM 8,040) comprising multi-parameter air-quality modules for CO2, PM2.5, PM10, temperature and humidity (RM 2,600); discrete temperature and humidity sensors (RM 200); metal oxide gas sensor sets (RM 1,120); microcontroller boards (RM 540); LoRa gateway and transmitter set (RM 900); IP65 enclosures and mounting (RM 880); power supply, solar panel, battery and cabling (RM 1,200); PCB fabrication and prototyping consumables (RM 600). Field sampling consumables (RM 1,260) comprising sterile sampling templates (RM 600), cold-chain coolers and gel packs (RM 360), and PPE for rounds R1 to R3 (RM 300).</w:t>
             </w:r>
             <w:r>
               <w:t xml:space="preserve"> </w:t>
@@ -4296,13 +4296,13 @@
                 <w:bCs/>
                 <w:b/>
               </w:rPr>
-              <w:t xml:space="preserve">Y2 (RM2,500):</w:t>
+              <w:t xml:space="preserve">Y2 (RM 2,500):</w:t>
             </w:r>
             <w:r>
               <w:t xml:space="preserve"> </w:t>
             </w:r>
             <w:r>
-              <w:t xml:space="preserve">Two further cold-chain coolers (RM360.00); PPE and field consumables for rounds R4 to R6 (RM400.00); ethanol, sample bags, labels and markers (RM540.00); and a culture consumable contingency (RM1,200.00) for SDA and PDA media, sterile swabs and Petri dishes. SRDC-TROPI supplies culture media and swabs from its matched research expenditure, so the contingency covers only the control plates the contamination-control protocol requires, repeat sampling after a failed batch, and any delay in partner supply; it does not duplicate the partner's provision. Sulphur dioxide sensing is excluded, as it bears on no mechanism this project tests. Guideline Section 7(d).</w:t>
+              <w:t xml:space="preserve">Additional cold-chain coolers (RM 360); PPE and field consumables for rounds R4 to R6 (RM 400); ethanol, sample bags, labels and markers (RM 540); culture consumable contingency (RM 1,200) for SDA and PDA media, sterile swabs and Petri dishes. (Note: Node configuration is already validated in deployed service, removing design risk. Culture media and swabs are supplied by SRDC-TROPI as in-kind matched expenditure; the contingency covers control plates and repeat sampling only. Sulphur dioxide sensing excluded.)</w:t>
             </w:r>
           </w:p>
         </w:tc>
@@ -4380,13 +4380,13 @@
                 <w:bCs/>
                 <w:b/>
               </w:rPr>
-              <w:t xml:space="preserve">Y1 (RM1,300):</w:t>
+              <w:t xml:space="preserve">Y1 (RM 1,300):</w:t>
             </w:r>
             <w:r>
               <w:t xml:space="preserve"> </w:t>
             </w:r>
             <w:r>
-              <w:t xml:space="preserve">Sanger sequencing of ITS amplicons, 32 reactions at the quoted rate of RM25.00 per reaction (RM800.00), for isolates recovered from rounds R1 to R3, inclusive of sample quality control by gel electrophoresis and one free re-run where a result is unsatisfactory; SORAS application and Sarawak Biodiversity Council permit fees covering the project, its scope, its personnel and the participating institutions (RM500.00).</w:t>
+              <w:t xml:space="preserve">Sanger sequencing of ITS amplicons, 32 reactions at RM 25.00 (RM 800.00) for isolates from rounds R1 to R3; SORAS application and Sarawak Biodiversity Council permit fees (RM 500.00).</w:t>
             </w:r>
             <w:r>
               <w:t xml:space="preserve"> </w:t>
@@ -4396,13 +4396,13 @@
                 <w:bCs/>
                 <w:b/>
               </w:rPr>
-              <w:t xml:space="preserve">Y2 (RM1,700):</w:t>
+              <w:t xml:space="preserve">Y2 (RM 1,700):</w:t>
             </w:r>
             <w:r>
               <w:t xml:space="preserve"> </w:t>
             </w:r>
             <w:r>
-              <w:t xml:space="preserve">Sanger sequencing, 48 reactions at RM25.00 (RM1,200.00), for isolates from rounds R4 to R6; registration fee for one indexed national conference (RM500.00). The 80 reactions cover a curated set of up to 60 isolates by single-pass read, with bidirectional reads on the subset whose assignment is ambiguous. DNA extraction and PCR amplification are performed by SRDC-TROPI as an in-kind matched contribution, so only the sequencing service is charged to this grant. Research may not be conducted in Sarawak without a valid permit, so the permit fee is a precondition of all fieldwork. Journal article processing charges are excluded and journals without such charges are targeted for both indexed outputs. Within the RM3,000 ceiling for Science, Engineering and Technology, Guideline Section 7(f).</w:t>
+              <w:t xml:space="preserve">Sanger sequencing, 48 reactions at RM 25.00 (RM 1,200.00) for isolates from rounds R4 to R6; registration fee for one national conference (RM 500.00). (Note: DNA extraction and PCR are performed by SRDC-TROPI as an in-kind matched contribution, so only the sequencing service is charged to this grant. Journal article processing charges excluded; non-APC journals targeted. Within RM 3,000 SET ceiling, Guideline Section 7(f).)</w:t>
             </w:r>
           </w:p>
         </w:tc>
@@ -4480,13 +4480,13 @@
                 <w:bCs/>
                 <w:b/>
               </w:rPr>
-              <w:t xml:space="preserve">Y1 (RM3,000):</w:t>
+              <w:t xml:space="preserve">Y1 (RM 3,000):</w:t>
             </w:r>
             <w:r>
               <w:t xml:space="preserve"> </w:t>
             </w:r>
             <w:r>
-              <w:t xml:space="preserve">Outdoor-rated display panel presenting live readings and the current campus air-quality classification at a high-traffic campus location (RM2,200.00); weatherproof display housing, mounting bracket and installation hardware (RM800.00). The display is a deliverable of the collaboration agreement between UTS and SRDC and is the pathway by which the monitoring becomes visible to building occupants and supports institutional environmental reporting. Cloud hosting and the data plan are excluded, as the guideline does not support utilities or subscriptions under VOT 26000 and VOT 23000 is restricted to USRRG and UFSRRG; these are provided as a UTS in-kind contribution through institutional IT infrastructure. Procured following UTS Procurement Procedure; assets remain UTS property and are entered in the project asset inventory. Total is 12 per cent of the grant, within the 40 per cent ceiling, Guideline Section 7(g).</w:t>
+              <w:t xml:space="preserve">Outdoor-rated display panel for live campus air-quality readings at a high-traffic location (RM 2,200.00); weatherproof housing, mounting bracket and installation hardware (RM 800.00).</w:t>
             </w:r>
             <w:r>
               <w:t xml:space="preserve"> </w:t>
@@ -4496,13 +4496,13 @@
                 <w:bCs/>
                 <w:b/>
               </w:rPr>
-              <w:t xml:space="preserve">Y2 (RM0):</w:t>
+              <w:t xml:space="preserve">Y2 (RM 0):</w:t>
             </w:r>
             <w:r>
               <w:t xml:space="preserve"> </w:t>
             </w:r>
             <w:r>
-              <w:t xml:space="preserve">No accessories required.</w:t>
+              <w:t xml:space="preserve">No accessories required. (Note: Cloud hosting and data plan excluded as utilities, provided instead as a UTS in-kind contribution. Assets remain UTS property. Total is 12% of grant, within the 40% ceiling, Guideline Section 7(g).)</w:t>
             </w:r>
           </w:p>
         </w:tc>

</xml_diff>

<commit_message>
Group monitoring node costs by subsystem rather than component
Replaces the eight-line component list in VOT 26000 with four functional
subsystems (sensing; control and communications; enclosure, mounting and
power; fabrication consumables), keeping quantity and cost as the guideline
requires for VOT 26000 without committing the procurement to named parts.
Justification cut from 180 to about 110 words.

Co-Authored-By: Claude Opus 5 <noreply@anthropic.com>
Claude-Session: https://claude.ai/code/session_01KBqJ3GE1Jd6oZGRqBX87od
</commit_message>
<xml_diff>
--- a/docs/UTS-Matching-Grant-Proposal-Cycle1-2027.docx
+++ b/docs/UTS-Matching-Grant-Proposal-Cycle1-2027.docx
@@ -4286,7 +4286,7 @@
               <w:t xml:space="preserve"> </w:t>
             </w:r>
             <w:r>
-              <w:t xml:space="preserve">Monitoring node components for four campus nodes plus spares (RM 8,040) comprising multi-parameter air-quality modules for CO2, PM2.5, PM10, temperature and humidity (RM 2,600); discrete temperature and humidity sensors (RM 200); metal oxide gas sensor sets (RM 1,120); microcontroller boards (RM 540); LoRa gateway and transmitter set (RM 900); IP65 enclosures and mounting (RM 880); power supply, solar panel, battery and cabling (RM 1,200); PCB fabrication and prototyping consumables (RM 600). Field sampling consumables (RM 1,260) comprising sterile sampling templates (RM 600), cold-chain coolers and gel packs (RM 360), and PPE for rounds R1 to R3 (RM 300).</w:t>
+              <w:t xml:space="preserve">Portable air-quality monitoring nodes, four units plus spares (RM 8,040), comprising the sensing subsystem for particulates, gases, temperature and humidity (RM 3,920); control and communications, including microcontrollers and gateway (RM 1,440); enclosure, mounting and power, including solar and battery (RM 2,080); and fabrication and prototyping consumables (RM 600). Field sampling consumables (RM 1,260) comprising sterile sampling templates (RM 600), cold-chain coolers and gel packs (RM 360), and PPE for rounds R1 to R3 (RM 300).</w:t>
             </w:r>
             <w:r>
               <w:t xml:space="preserve"> </w:t>
@@ -4302,7 +4302,7 @@
               <w:t xml:space="preserve"> </w:t>
             </w:r>
             <w:r>
-              <w:t xml:space="preserve">Additional cold-chain coolers (RM 360); PPE and field consumables for rounds R4 to R6 (RM 400); ethanol, sample bags, labels and markers (RM 540); culture consumable contingency (RM 1,200) for SDA and PDA media, sterile swabs and Petri dishes. (Note: Node configuration is already validated in deployed service, removing design risk. Culture media and swabs are supplied by SRDC-TROPI as in-kind matched expenditure; the contingency covers control plates and repeat sampling only. Sulphur dioxide sensing excluded.)</w:t>
+              <w:t xml:space="preserve">Additional cold-chain coolers (RM 360); PPE and field consumables for rounds R4 to R6 (RM 400); ethanol, sample bags, labels and markers (RM 540); culture consumable contingency (RM 1,200) for SDA and PDA media, sterile swabs and Petri dishes. (Note: Node configuration follows a build already validated in deployed service, removing design risk; final component selection and procurement follow UTS Procurement Procedure. Culture media and swabs are supplied by SRDC-TROPI as in-kind matched expenditure. Sulphur dioxide sensing excluded.)</w:t>
             </w:r>
           </w:p>
         </w:tc>

</xml_diff>

<commit_message>
Split the culture consumable contingency across both project years
Rounds R1 to R3 fall in Year 1, so a contingency held entirely in Year 2 would
not have been available if partner supply slipped before the first round. The
RM1,200 is now RM600 in each year, tied to the rounds it serves.

VOT 26000 becomes RM9,900 in Year 1 and RM1,900 in Year 2, unchanged at
RM11,800 overall; project totals move to RM17,750 and RM7,250.

Co-Authored-By: Claude Opus 5 <noreply@anthropic.com>
Claude-Session: https://claude.ai/code/session_01KBqJ3GE1Jd6oZGRqBX87od
</commit_message>
<xml_diff>
--- a/docs/UTS-Matching-Grant-Proposal-Cycle1-2027.docx
+++ b/docs/UTS-Matching-Grant-Proposal-Cycle1-2027.docx
@@ -4280,13 +4280,13 @@
                 <w:bCs/>
                 <w:b/>
               </w:rPr>
-              <w:t xml:space="preserve">Y1 (RM 9,300):</w:t>
+              <w:t xml:space="preserve">Y1 (RM 9,900):</w:t>
             </w:r>
             <w:r>
               <w:t xml:space="preserve"> </w:t>
             </w:r>
             <w:r>
-              <w:t xml:space="preserve">Portable air-quality monitoring nodes, four units plus spares (RM 8,040), comprising the sensing subsystem for particulates, gases, temperature and humidity (RM 3,920); control and communications, including microcontrollers and gateway (RM 1,440); enclosure, mounting and power, including solar and battery (RM 2,080); and fabrication and prototyping consumables (RM 600). Field sampling consumables (RM 1,260) comprising sterile sampling templates (RM 600), cold-chain coolers and gel packs (RM 360), and PPE for rounds R1 to R3 (RM 300).</w:t>
+              <w:t xml:space="preserve">Portable air-quality monitoring nodes, four units plus spares (RM 8,040), comprising the sensing subsystem for particulates, gases, temperature and humidity (RM 3,920); control and communications, including microcontrollers and gateway (RM 1,440); enclosure, mounting and power, including solar and battery (RM 2,080); and fabrication and prototyping consumables (RM 600). Field sampling and culture consumables (RM 1,860) comprising sterile sampling templates (RM 600), cold-chain coolers and gel packs (RM 360), PPE for rounds R1 to R3 (RM 300), and culture consumable contingency for rounds R1 to R3 (RM 600) covering SDA and PDA media, sterile swabs, Petri dishes and control plates.</w:t>
             </w:r>
             <w:r>
               <w:t xml:space="preserve"> </w:t>
@@ -4296,13 +4296,13 @@
                 <w:bCs/>
                 <w:b/>
               </w:rPr>
-              <w:t xml:space="preserve">Y2 (RM 2,500):</w:t>
+              <w:t xml:space="preserve">Y2 (RM 1,900):</w:t>
             </w:r>
             <w:r>
               <w:t xml:space="preserve"> </w:t>
             </w:r>
             <w:r>
-              <w:t xml:space="preserve">Additional cold-chain coolers (RM 360); PPE and field consumables for rounds R4 to R6 (RM 400); ethanol, sample bags, labels and markers (RM 540); culture consumable contingency (RM 1,200) for SDA and PDA media, sterile swabs and Petri dishes. (Note: Node configuration follows a build already validated in deployed service, removing design risk; final component selection and procurement follow UTS Procurement Procedure. Culture media and swabs are supplied by SRDC-TROPI as in-kind matched expenditure. Sulphur dioxide sensing excluded.)</w:t>
+              <w:t xml:space="preserve">Additional cold-chain coolers (RM 360); PPE and field consumables for rounds R4 to R6 (RM 400); ethanol, sample bags, labels and markers (RM 540); culture consumable contingency for rounds R4 to R6 (RM 600). (Note: Node configuration follows a build already validated in deployed service, removing design risk; final component selection and procurement follow UTS Procurement Procedure. Culture media and swabs are supplied by SRDC-TROPI as in-kind matched expenditure. Sulphur dioxide sensing excluded.)</w:t>
             </w:r>
           </w:p>
         </w:tc>
@@ -4314,7 +4314,7 @@
               <w:jc w:val="left"/>
             </w:pPr>
             <w:r>
-              <w:t xml:space="preserve">9,300.00</w:t>
+              <w:t xml:space="preserve">9,900.00</w:t>
             </w:r>
           </w:p>
         </w:tc>
@@ -4326,7 +4326,7 @@
               <w:jc w:val="left"/>
             </w:pPr>
             <w:r>
-              <w:t xml:space="preserve">2,500.00</w:t>
+              <w:t xml:space="preserve">1,900.00</w:t>
             </w:r>
           </w:p>
         </w:tc>
@@ -4588,7 +4588,7 @@
                 <w:bCs/>
                 <w:b/>
               </w:rPr>
-              <w:t xml:space="preserve">17,150.00</w:t>
+              <w:t xml:space="preserve">17,750.00</w:t>
             </w:r>
           </w:p>
         </w:tc>
@@ -4604,7 +4604,7 @@
                 <w:bCs/>
                 <w:b/>
               </w:rPr>
-              <w:t xml:space="preserve">7,850.00</w:t>
+              <w:t xml:space="preserve">7,250.00</w:t>
             </w:r>
           </w:p>
         </w:tc>
@@ -5124,51 +5124,63 @@
         <w:pStyle w:val="BodyText"/>
       </w:pPr>
       <w:r>
-        <w:t xml:space="preserve">A culture consumable contingency accounts for RM1,200.00, covering Sabouraud dextrose agar and</w:t>
-      </w:r>
-      <w:r>
-        <w:t xml:space="preserve"> </w:t>
-      </w:r>
-      <w:r>
-        <w:t xml:space="preserve">potato dextrose agar media, sterile swabs and Petri dishes. SRDC-TROPI supplies these items from</w:t>
-      </w:r>
-      <w:r>
-        <w:t xml:space="preserve"> </w:t>
-      </w:r>
-      <w:r>
-        <w:t xml:space="preserve">its matched research expenditure, so this allocation is a contingency only, covering the control</w:t>
-      </w:r>
-      <w:r>
-        <w:t xml:space="preserve"> </w:t>
-      </w:r>
-      <w:r>
-        <w:t xml:space="preserve">plates that the contamination control protocol requires, repeat sampling after a failed batch,</w:t>
-      </w:r>
-      <w:r>
-        <w:t xml:space="preserve"> </w:t>
-      </w:r>
-      <w:r>
-        <w:t xml:space="preserve">and any delay in partner supply. It ensures that the sampling programme is not interrupted and</w:t>
-      </w:r>
-      <w:r>
-        <w:t xml:space="preserve"> </w:t>
-      </w:r>
-      <w:r>
-        <w:t xml:space="preserve">does not duplicate the partner's provision.</w:t>
-      </w:r>
-    </w:p>
-    <w:p>
-      <w:pPr>
-        <w:pStyle w:val="BodyText"/>
-      </w:pPr>
-      <w:r>
-        <w:t xml:space="preserve">Year 1 totals RM9,300.00 for node development and initial consumables, and Year 2 totals</w:t>
-      </w:r>
-      <w:r>
-        <w:t xml:space="preserve"> </w:t>
-      </w:r>
-      <w:r>
-        <w:t xml:space="preserve">RM2,500.00 for consumables, spares and node maintenance parts.</w:t>
+        <w:t xml:space="preserve">A culture consumable contingency accounts for RM1,200.00 in total, split as RM600.00 in each</w:t>
+      </w:r>
+      <w:r>
+        <w:t xml:space="preserve"> </w:t>
+      </w:r>
+      <w:r>
+        <w:t xml:space="preserve">project year so that provision is in place from the first sampling round. It covers Sabouraud</w:t>
+      </w:r>
+      <w:r>
+        <w:t xml:space="preserve"> </w:t>
+      </w:r>
+      <w:r>
+        <w:t xml:space="preserve">dextrose agar and potato dextrose agar media, sterile swabs and Petri dishes. SRDC-TROPI supplies</w:t>
+      </w:r>
+      <w:r>
+        <w:t xml:space="preserve"> </w:t>
+      </w:r>
+      <w:r>
+        <w:t xml:space="preserve">these items from its matched research expenditure, so this allocation is a contingency only,</w:t>
+      </w:r>
+      <w:r>
+        <w:t xml:space="preserve"> </w:t>
+      </w:r>
+      <w:r>
+        <w:t xml:space="preserve">covering the control plates that the contamination control protocol requires, repeat sampling</w:t>
+      </w:r>
+      <w:r>
+        <w:t xml:space="preserve"> </w:t>
+      </w:r>
+      <w:r>
+        <w:t xml:space="preserve">after a failed batch, and any delay in partner supply. It ensures that the sampling programme is</w:t>
+      </w:r>
+      <w:r>
+        <w:t xml:space="preserve"> </w:t>
+      </w:r>
+      <w:r>
+        <w:t xml:space="preserve">not interrupted and does not duplicate the partner's provision.</w:t>
+      </w:r>
+    </w:p>
+    <w:p>
+      <w:pPr>
+        <w:pStyle w:val="BodyText"/>
+      </w:pPr>
+      <w:r>
+        <w:t xml:space="preserve">Year 1 totals RM9,900.00 for node development, field consumables and the first-year culture</w:t>
+      </w:r>
+      <w:r>
+        <w:t xml:space="preserve"> </w:t>
+      </w:r>
+      <w:r>
+        <w:t xml:space="preserve">contingency, and Year 2 totals RM1,900.00 for consumables, spares and the second-year culture</w:t>
+      </w:r>
+      <w:r>
+        <w:t xml:space="preserve"> </w:t>
+      </w:r>
+      <w:r>
+        <w:t xml:space="preserve">contingency.</w:t>
       </w:r>
     </w:p>
     <w:p>
@@ -5516,7 +5528,7 @@
         <w:pStyle w:val="BodyText"/>
       </w:pPr>
       <w:r>
-        <w:t xml:space="preserve">Year 1 totals RM17,150.00 and Year 2 totals RM7,850.00, giving RM25,000.00 in all.</w:t>
+        <w:t xml:space="preserve">Year 1 totals RM17,750.00 and Year 2 totals RM7,250.00, giving RM25,000.00 in all.</w:t>
       </w:r>
     </w:p>
     <w:bookmarkEnd w:id="54"/>

</xml_diff>

<commit_message>
Compress VOT 26000 justification to per-unit form
States the nodes as 4 complete units at a unit price rather than by subsystem,
and collapses the consumables to one line per year. Justification cut from 159
to about 70 words. Figures unchanged: Y1 RM9,900, Y2 RM1,900, total RM11,800.

The fuller itemisation is retained in docs/urcms-budget-breakdown.md for the
URCMS text field, where the guideline asks for detail of cost and quantity.

Co-Authored-By: Claude Opus 5 <noreply@anthropic.com>
Claude-Session: https://claude.ai/code/session_01KBqJ3GE1Jd6oZGRqBX87od
</commit_message>
<xml_diff>
--- a/docs/UTS-Matching-Grant-Proposal-Cycle1-2027.docx
+++ b/docs/UTS-Matching-Grant-Proposal-Cycle1-2027.docx
@@ -4286,7 +4286,7 @@
               <w:t xml:space="preserve"> </w:t>
             </w:r>
             <w:r>
-              <w:t xml:space="preserve">Portable air-quality monitoring nodes, four units plus spares (RM 8,040), comprising the sensing subsystem for particulates, gases, temperature and humidity (RM 3,920); control and communications, including microcontrollers and gateway (RM 1,440); enclosure, mounting and power, including solar and battery (RM 2,080); and fabrication and prototyping consumables (RM 600). Field sampling and culture consumables (RM 1,860) comprising sterile sampling templates (RM 600), cold-chain coolers and gel packs (RM 360), PPE for rounds R1 to R3 (RM 300), and culture consumable contingency for rounds R1 to R3 (RM 600) covering SDA and PDA media, sterile swabs, Petri dishes and control plates.</w:t>
+              <w:t xml:space="preserve">Portable air-quality monitoring nodes, 4 units complete at RM 1,860 per unit (RM 7,440); spare sensor modules and fabrication consumables (RM 600); field sampling consumables including sterile templates, cold-chain coolers and PPE (RM 1,260); culture consumable contingency for rounds R1 to R3 (RM 600).</w:t>
             </w:r>
             <w:r>
               <w:t xml:space="preserve"> </w:t>
@@ -4302,7 +4302,7 @@
               <w:t xml:space="preserve"> </w:t>
             </w:r>
             <w:r>
-              <w:t xml:space="preserve">Additional cold-chain coolers (RM 360); PPE and field consumables for rounds R4 to R6 (RM 400); ethanol, sample bags, labels and markers (RM 540); culture consumable contingency for rounds R4 to R6 (RM 600). (Note: Node configuration follows a build already validated in deployed service, removing design risk; final component selection and procurement follow UTS Procurement Procedure. Culture media and swabs are supplied by SRDC-TROPI as in-kind matched expenditure. Sulphur dioxide sensing excluded.)</w:t>
+              <w:t xml:space="preserve">Field sampling consumables for rounds R4 to R6, including coolers, PPE, ethanol, sample bags and labels (RM 1,300); culture consumable contingency for rounds R4 to R6 (RM 600). (Note: Node configuration follows a build already validated in deployed service; procurement follows UTS Procurement Procedure. Culture media and swabs are supplied by SRDC-TROPI as in-kind matched expenditure. Sulphur dioxide sensing excluded.)</w:t>
             </w:r>
           </w:p>
         </w:tc>

</xml_diff>